<commit_message>
Update deployment links and add prototype video
</commit_message>
<xml_diff>
--- a/report/SahakarSetu_Technical_Architecture_Report.docx
+++ b/report/SahakarSetu_Technical_Architecture_Report.docx
@@ -8157,6 +8157,38 @@
         <w:t xml:space="preserve"> Ministry of Labour and Employment standards for job role classification and vocational skill mapping. *(https://ncs.gov.in)*</w:t>
       </w:r>
     </w:p>
+    <w:p>
+      <w:pPr>
+        <w:pStyle w:val="Heading2"/>
+      </w:pPr>
+      <w:r>
+        <w:t>Prototype &amp; Live Links</w:t>
+      </w:r>
+    </w:p>
+    <w:p>
+      <w:r>
+        <w:t xml:space="preserve">Prototype Working Video: </w:t>
+      </w:r>
+      <w:r>
+        <w:t>https://youtu.be/SGfuTJ5SxBE</w:t>
+      </w:r>
+    </w:p>
+    <w:p>
+      <w:r>
+        <w:t xml:space="preserve">Live Deployed Prototype: </w:t>
+      </w:r>
+      <w:r>
+        <w:t>https://sahakar-setu-sage.vercel.app/</w:t>
+      </w:r>
+    </w:p>
+    <w:p>
+      <w:r>
+        <w:t xml:space="preserve">Backend API Endpoint: </w:t>
+      </w:r>
+      <w:r>
+        <w:t>https://sahakarsetu-mcdr.onrender.com/health/</w:t>
+      </w:r>
+    </w:p>
     <w:sectPr>
       <w:headerReference w:type="default" r:id="rId9"/>
       <w:footerReference w:type="default" r:id="rId10"/>

</xml_diff>

<commit_message>
Refactor prototype links into a dedicated professional section in reports
</commit_message>
<xml_diff>
--- a/report/SahakarSetu_Technical_Architecture_Report.docx
+++ b/report/SahakarSetu_Technical_Architecture_Report.docx
@@ -69,75 +69,48 @@
     <w:p>
       <w:pPr>
         <w:spacing w:after="320"/>
+      </w:pPr>
+      <w:r>
         <w:rPr>
           <w:color w:val="CBD5E1"/>
         </w:rPr>
-      </w:pPr>
+        <w:t>――――――――――――――――――――――――――――――――――――――――――――――――――――</w:t>
+      </w:r>
     </w:p>
     <w:p>
       <w:pPr>
-        <w:spacing w:after="320"/>
-        <w:rPr>
-          <w:color w:val="CBD5E1"/>
-        </w:rPr>
-      </w:pPr>
+        <w:pStyle w:val="Heading1"/>
+      </w:pPr>
+      <w:r>
+        <w:t>Project Deployment &amp; Prototype Links</w:t>
+      </w:r>
     </w:p>
     <w:p>
       <w:pPr>
-        <w:spacing w:after="320"/>
         <w:rPr>
-          <w:color w:val="CBD5E1"/>
+          <w:rStyle w:val="Hyperlink"/>
         </w:rPr>
       </w:pPr>
       <w:r>
-        <w:rPr>
-          <w:color w:val="CBD5E1"/>
-        </w:rPr>
-        <w:t>Backend API Endpoint:</w:t>
+        <w:t xml:space="preserve">Prototype Working Video: </w:t>
       </w:r>
       <w:hyperlink r:id="rId8" w:history="1">
         <w:r>
           <w:rPr>
             <w:rStyle w:val="Hyperlink"/>
           </w:rPr>
-          <w:t>https://sahakarsetu-mcdr.onrender.com/health/</w:t>
+          <w:t>https://youtu.be/SGfuTJ5SxBE</w:t>
         </w:r>
       </w:hyperlink>
-      <w:r>
-        <w:rPr>
-          <w:color w:val="CBD5E1"/>
-        </w:rPr>
-        <w:t xml:space="preserve"> </w:t>
-      </w:r>
     </w:p>
     <w:p>
       <w:pPr>
-        <w:spacing w:after="320"/>
         <w:rPr>
-          <w:color w:val="CBD5E1"/>
+          <w:rStyle w:val="Hyperlink"/>
         </w:rPr>
       </w:pPr>
-    </w:p>
-    <w:p>
-      <w:pPr>
-        <w:spacing w:after="320"/>
-        <w:rPr>
-          <w:color w:val="CBD5E1"/>
-        </w:rPr>
-      </w:pPr>
-    </w:p>
-    <w:p>
-      <w:pPr>
-        <w:spacing w:after="320"/>
-        <w:rPr>
-          <w:color w:val="CBD5E1"/>
-        </w:rPr>
-      </w:pPr>
-      <w:r>
-        <w:rPr>
-          <w:color w:val="CBD5E1"/>
-        </w:rPr>
-        <w:t>Live Deployed Prototype:</w:t>
+      <w:r>
+        <w:t xml:space="preserve">Live Deployed Prototype: </w:t>
       </w:r>
       <w:hyperlink r:id="rId9" w:history="1">
         <w:r>
@@ -147,44 +120,27 @@
           <w:t>https://sahakar-setu-sage.vercel.app/</w:t>
         </w:r>
       </w:hyperlink>
-      <w:r>
-        <w:rPr>
-          <w:color w:val="CBD5E1"/>
-        </w:rPr>
-        <w:t xml:space="preserve"> Important Project Links:</w:t>
-      </w:r>
     </w:p>
     <w:p>
       <w:pPr>
-        <w:spacing w:after="320"/>
-      </w:pPr>
-      <w:r>
         <w:rPr>
-          <w:color w:val="CBD5E1"/>
+          <w:rStyle w:val="Hyperlink"/>
         </w:rPr>
-        <w:t>Prototype Working Video:</w:t>
+      </w:pPr>
+      <w:r>
+        <w:t xml:space="preserve">Backend API Endpoint: </w:t>
       </w:r>
       <w:hyperlink r:id="rId10" w:history="1">
         <w:r>
           <w:rPr>
             <w:rStyle w:val="Hyperlink"/>
           </w:rPr>
-          <w:t>https://youtu.be/SGfuTJ5SxBE</w:t>
+          <w:t>https://sahakarsetu-mcdr.onrender.com/health/</w:t>
         </w:r>
       </w:hyperlink>
-      <w:r>
-        <w:rPr>
-          <w:color w:val="CBD5E1"/>
-        </w:rPr>
-        <w:t xml:space="preserve"> </w:t>
-      </w:r>
-      <w:r>
-        <w:rPr>
-          <w:color w:val="CBD5E1"/>
-        </w:rPr>
-        <w:t>――――――――――――――――――――――――――――――――――――――――――――――――――――</w:t>
-      </w:r>
     </w:p>
+    <w:p/>
+    <w:p/>
     <w:p>
       <w:pPr>
         <w:pStyle w:val="Heading1"/>
@@ -194,7 +150,13 @@
         <w:rPr>
           <w:color w:val="1E3A5F"/>
         </w:rPr>
-        <w:t>1. Executive Summary &amp; System Vision</w:t>
+        <w:t>1</w:t>
+      </w:r>
+      <w:r>
+        <w:rPr>
+          <w:color w:val="1E3A5F"/>
+        </w:rPr>
+        <w:t>. Executive Summary &amp; System Vision</w:t>
       </w:r>
     </w:p>
     <w:p>
@@ -10652,6 +10614,32 @@
         <w:t>ation and vocational skill mapping. *(https://ncs.gov.in)*</w:t>
       </w:r>
     </w:p>
+    <w:p>
+      <w:pPr>
+        <w:pStyle w:val="Heading2"/>
+      </w:pPr>
+      <w:r>
+        <w:t>Prototype &amp; Live Links</w:t>
+      </w:r>
+    </w:p>
+    <w:p>
+      <w:r>
+        <w:t>Prototype Working Video: https://youtu.be/SGfuTJ5SxBE</w:t>
+      </w:r>
+    </w:p>
+    <w:p>
+      <w:r>
+        <w:t>Live Deployed Prototype: https://sahakar-setu-sage.vercel.app/</w:t>
+      </w:r>
+    </w:p>
+    <w:p>
+      <w:r>
+        <w:t>Backend API Endpoint: https://sahakarsetu-mcdr.onrender.c</w:t>
+      </w:r>
+      <w:r>
+        <w:t>om/health/</w:t>
+      </w:r>
+    </w:p>
     <w:sectPr>
       <w:headerReference w:type="default" r:id="rId12"/>
       <w:footerReference w:type="default" r:id="rId13"/>
@@ -10701,14 +10689,7 @@
         <w:color w:val="94A3B8"/>
         <w:sz w:val="17"/>
       </w:rPr>
-      <w:t xml:space="preserve">Ministry of Cooperation | National Council for Cooperative Training </w:t>
-    </w:r>
-    <w:r>
-      <w:rPr>
-        <w:color w:val="94A3B8"/>
-        <w:sz w:val="17"/>
-      </w:rPr>
-      <w:t>(NCCT)</w:t>
+      <w:t>Ministry of Cooperation | National Council for Cooperative Training (NCCT)</w:t>
     </w:r>
   </w:p>
 </w:ftr>
@@ -23038,7 +23019,7 @@
     <w:basedOn w:val="DefaultParagraphFont"/>
     <w:uiPriority w:val="99"/>
     <w:unhideWhenUsed/>
-    <w:rsid w:val="002A5CE1"/>
+    <w:rsid w:val="00B11C89"/>
     <w:rPr>
       <w:color w:val="0000FF" w:themeColor="hyperlink"/>
       <w:u w:val="single"/>
@@ -23372,7 +23353,7 @@
 </file>
 
 <file path=customXml/itemProps1.xml><?xml version="1.0" encoding="utf-8"?>
-<ds:datastoreItem xmlns:ds="http://schemas.openxmlformats.org/officeDocument/2006/customXml" ds:itemID="{16A85DD7-A632-4A24-9276-03139510B0EF}">
+<ds:datastoreItem xmlns:ds="http://schemas.openxmlformats.org/officeDocument/2006/customXml" ds:itemID="{17ACD9BE-C1B3-4E64-A18B-665F2C5B3D9A}">
   <ds:schemaRefs>
     <ds:schemaRef ds:uri="http://schemas.openxmlformats.org/officeDocument/2006/bibliography"/>
   </ds:schemaRefs>

</xml_diff>

<commit_message>
Apply extensive editorial revisions for SIH submission
</commit_message>
<xml_diff>
--- a/report/SahakarSetu_Technical_Architecture_Report.docx
+++ b/report/SahakarSetu_Technical_Architecture_Report.docx
@@ -48,14 +48,7 @@
           <w:color w:val="475569"/>
           <w:sz w:val="24"/>
         </w:rPr>
-        <w:t xml:space="preserve">Comprehensive Technical Architecture &amp; </w:t>
-      </w:r>
-      <w:r>
-        <w:rPr>
-          <w:color w:val="475569"/>
-          <w:sz w:val="24"/>
-        </w:rPr>
-        <w:t>Solution Engineering Report</w:t>
+        <w:t>Comprehensive Technical Architecture &amp; Solution Engineering Report</w:t>
       </w:r>
       <w:r>
         <w:rPr>
@@ -150,13 +143,7 @@
         <w:rPr>
           <w:color w:val="1E3A5F"/>
         </w:rPr>
-        <w:t>1</w:t>
-      </w:r>
-      <w:r>
-        <w:rPr>
-          <w:color w:val="1E3A5F"/>
-        </w:rPr>
-        <w:t>. Executive Summary &amp; System Vision</w:t>
+        <w:t>1. Executive Summary &amp; System Vision</w:t>
       </w:r>
     </w:p>
     <w:p>
@@ -170,16 +157,7 @@
         <w:t>SahakarSetu</w:t>
       </w:r>
       <w:r>
-        <w:t xml:space="preserve"> is an enterprise-grade digital public infrastructure de</w:t>
-      </w:r>
-      <w:r>
-        <w:t xml:space="preserve">signed to modernize and unify the cooperative education, administration, and employment ecosystem across India. Commissioned under the mandate of the Ministry of Cooperation and the National Council for Cooperative Training (NCCT), the platform integrates </w:t>
-      </w:r>
-      <w:r>
-        <w:t>institutional enterprise resource planning (ERP), learning management systems (LMS), computer-vision attendance, offline-first edge computing, verifiable cryptographic skill credentialing, and AI-driven employment linkage into a continuous, data-driven lif</w:t>
-      </w:r>
-      <w:r>
-        <w:t>ecycle.</w:t>
+        <w:t xml:space="preserve"> is an enterprise-grade digital public infrastructure designed to modernize and unify the cooperative education, administration, and employment ecosystem across India. Commissioned under the mandate of the Ministry of Cooperation and the National Council for Cooperative Training (NCCT), the platform integrates institutional enterprise resource planning (ERP), learning management systems (LMS), computer-vision attendance, offline-first edge computing, verifiable cryptographic skill credentialing, and AI-driven employment linkage into a continuous, data-driven lifecycle.</w:t>
       </w:r>
     </w:p>
     <w:p>
@@ -187,13 +165,7 @@
         <w:spacing w:before="60" w:after="100"/>
       </w:pPr>
       <w:r>
-        <w:t xml:space="preserve">NCCT operates through its apex institution—Vaikunth Mehta National Institute of Cooperative Management (VAMNICOM), Pune—alongside 5 Regional Institutes of Cooperative Management (RICMs) and 14 Institutes of Cooperative Management (ICMs). In total, </w:t>
-      </w:r>
-      <w:r>
-        <w:t xml:space="preserve">these 20 institutions conduct more than 3,700 programmes annually, training over 2.27 lakh participants comprising Primary Agricultural Credit Societies (PACS) secretaries, dairy cooperative staff, women Self-Help Groups (SHGs), cooperative bank officers, </w:t>
-      </w:r>
-      <w:r>
-        <w:t>and rural youth.</w:t>
+        <w:t>NCCT operates through its apex institution—Vaikunth Mehta National Institute of Cooperative Management (VAMNICOM), Pune—alongside 5 Regional Institutes of Cooperative Management (RICMs) and 14 Institutes of Cooperative Management (ICMs). In total, these 20 institutions conduct more than 3,700 programmes annually, training over 2.27 lakh participants comprising Primary Agricultural Credit Societies (PACS) secretaries, dairy cooperative staff, women Self-Help Groups (SHGs), cooperative bank officers, and rural youth.</w:t>
       </w:r>
     </w:p>
     <w:p>
@@ -201,10 +173,7 @@
         <w:spacing w:before="60" w:after="100"/>
       </w:pPr>
       <w:r>
-        <w:t>Historically, this vast educational apparatus has operated through manual or siloed systems, leading to paper attendance registers, duplicate trainee records, zero centralized learning analytics, lack of verified skill portability, and min</w:t>
-      </w:r>
-      <w:r>
-        <w:t>imal direct linkage to formal employment or entrepreneurship.</w:t>
+        <w:t>Historically, this vast educational apparatus has operated through manual or siloed systems, leading to paper attendance registers, duplicate trainee records, zero centralized learning analytics, lack of verified skill portability, and minimal direct linkage to formal employment or entrepreneurship.</w:t>
       </w:r>
     </w:p>
     <w:tbl>
@@ -242,6 +211,7 @@
                 <w:color w:val="0F172A"/>
                 <w:sz w:val="17"/>
               </w:rPr>
+              <w:lastRenderedPageBreak/>
               <w:t xml:space="preserve">       +-----------------------------------------------------------------------+</w:t>
             </w:r>
             <w:r>
@@ -260,7 +230,7 @@
                 <w:sz w:val="17"/>
               </w:rPr>
               <w:br/>
-              <w:t xml:space="preserve">       |                        </w:t>
+              <w:t xml:space="preserve">       |                                                                       |</w:t>
             </w:r>
             <w:r>
               <w:rPr>
@@ -268,7 +238,8 @@
                 <w:color w:val="0F172A"/>
                 <w:sz w:val="17"/>
               </w:rPr>
-              <w:t xml:space="preserve">                                               |</w:t>
+              <w:br/>
+              <w:t xml:space="preserve">       |   [ Register ] ---&gt; [ Allocate ] ---&gt; [ Verify ] ---&gt; [ Learn ]       |</w:t>
             </w:r>
             <w:r>
               <w:rPr>
@@ -277,7 +248,7 @@
                 <w:sz w:val="17"/>
               </w:rPr>
               <w:br/>
-              <w:t xml:space="preserve">       |   [ Register ] ---&gt; [ Allocate ] ---&gt; [ Verify ] ---&gt; [ Learn ]       |</w:t>
+              <w:t xml:space="preserve">       |    Nomination        Seat, Hostel,     Face / QR       Multilingual   |</w:t>
             </w:r>
             <w:r>
               <w:rPr>
@@ -286,7 +257,7 @@
                 <w:sz w:val="17"/>
               </w:rPr>
               <w:br/>
-              <w:t xml:space="preserve">       |    Nomination        Seat, Hostel,     Face / QR       Multilingual   |</w:t>
+              <w:t xml:space="preserve">       |    &amp; Sahakar ID       Timetable       Biometric        Edge &amp; Cloud   |</w:t>
             </w:r>
             <w:r>
               <w:rPr>
@@ -295,7 +266,7 @@
                 <w:sz w:val="17"/>
               </w:rPr>
               <w:br/>
-              <w:t xml:space="preserve">       |    &amp; Sahakar ID       Timetable     </w:t>
+              <w:t xml:space="preserve">       |         |                                                   |         |</w:t>
             </w:r>
             <w:r>
               <w:rPr>
@@ -303,7 +274,8 @@
                 <w:color w:val="0F172A"/>
                 <w:sz w:val="17"/>
               </w:rPr>
-              <w:t xml:space="preserve">  Biometric        Edge &amp; Cloud   |</w:t>
+              <w:br/>
+              <w:t xml:space="preserve">       |         v                                                   v         |</w:t>
             </w:r>
             <w:r>
               <w:rPr>
@@ -312,7 +284,7 @@
                 <w:sz w:val="17"/>
               </w:rPr>
               <w:br/>
-              <w:t xml:space="preserve">       |         |                                                   |         |</w:t>
+              <w:t xml:space="preserve">       |   [ Feedback ] &lt;--- [ Match ]   &lt;--- [ Certify ] &lt;--- [ Assess ]      |</w:t>
             </w:r>
             <w:r>
               <w:rPr>
@@ -321,7 +293,7 @@
                 <w:sz w:val="17"/>
               </w:rPr>
               <w:br/>
-              <w:t xml:space="preserve">       |         v                                                   v         |</w:t>
+              <w:t xml:space="preserve">       |    Continuous        AI Placement     Verifiable       Automated      |</w:t>
             </w:r>
             <w:r>
               <w:rPr>
@@ -330,7 +302,7 @@
                 <w:sz w:val="17"/>
               </w:rPr>
               <w:br/>
-              <w:t xml:space="preserve">       |   [ Feedback ] &lt;--- [ Match ]   &lt;--- [ Certify ] </w:t>
+              <w:t xml:space="preserve">       |    Outcome Loop      &amp; Job Graph      Skill Passport   Evaluation     |</w:t>
             </w:r>
             <w:r>
               <w:rPr>
@@ -338,42 +310,8 @@
                 <w:color w:val="0F172A"/>
                 <w:sz w:val="17"/>
               </w:rPr>
-              <w:t>&lt;--- [ Assess ]      |</w:t>
-            </w:r>
-            <w:r>
-              <w:rPr>
-                <w:rFonts w:ascii="Consolas" w:hAnsi="Consolas"/>
-                <w:color w:val="0F172A"/>
-                <w:sz w:val="17"/>
-              </w:rPr>
               <w:br/>
-              <w:t xml:space="preserve">       |    Continuous        AI Placement     Verifiable       Automated      |</w:t>
-            </w:r>
-            <w:r>
-              <w:rPr>
-                <w:rFonts w:ascii="Consolas" w:hAnsi="Consolas"/>
-                <w:color w:val="0F172A"/>
-                <w:sz w:val="17"/>
-              </w:rPr>
-              <w:br/>
-              <w:t xml:space="preserve">       |    Outcome Loop      &amp; Job Graph      Skill Passport   Evaluation     |</w:t>
-            </w:r>
-            <w:r>
-              <w:rPr>
-                <w:rFonts w:ascii="Consolas" w:hAnsi="Consolas"/>
-                <w:color w:val="0F172A"/>
-                <w:sz w:val="17"/>
-              </w:rPr>
-              <w:br/>
-              <w:t xml:space="preserve">       +---------------------------------------------------------------</w:t>
-            </w:r>
-            <w:r>
-              <w:rPr>
-                <w:rFonts w:ascii="Consolas" w:hAnsi="Consolas"/>
-                <w:color w:val="0F172A"/>
-                <w:sz w:val="17"/>
-              </w:rPr>
-              <w:t>--------+</w:t>
+              <w:t xml:space="preserve">       +-----------------------------------------------------------------------+</w:t>
             </w:r>
           </w:p>
         </w:tc>
@@ -389,7 +327,6 @@
         <w:spacing w:before="60" w:after="100"/>
       </w:pPr>
       <w:r>
-        <w:lastRenderedPageBreak/>
         <w:t xml:space="preserve">SahakarSetu bridges the critical rural infrastructure gap through a hybrid </w:t>
       </w:r>
       <w:r>
@@ -408,13 +345,7 @@
         <w:t>Sahakar Edge Box</w:t>
       </w:r>
       <w:r>
-        <w:t>—a low-cost, ruggedized, low-power edge computer deployed at each training institute, PACS c</w:t>
-      </w:r>
-      <w:r>
-        <w:t>enter, and rural cooperative hub. The Edge Box runs an embedded micro-cloud with localized LMS media caching, biometric face/QR attendance validation, automated quiz grading, and a store-and-forward SQLite journal. Trainees in remote, low-bandwidth areas c</w:t>
-      </w:r>
-      <w:r>
-        <w:t>onnect locally via Wi-Fi without active internet. When connectivity is restored, the Edge Box cryptographically synchronizes with the central Sahakar Cloud, enabling zero-downtime operations and national-level training monitoring.</w:t>
+        <w:t>—a low-cost, ruggedized, low-power edge computer deployed at each training institute, PACS center, and rural cooperative hub. The Edge Box runs an embedded micro-cloud with localized LMS media caching, biometric face/QR attendance validation, automated quiz grading, and a store-and-forward SQLite journal. Trainees in remote, low-bandwidth areas connect locally via Wi-Fi without active internet. When connectivity is restored, the Edge Box cryptographically synchronizes with the central Sahakar Cloud, enabling zero-downtime operations and national-level training monitoring.</w:t>
       </w:r>
     </w:p>
     <w:p>
@@ -426,13 +357,7 @@
         <w:rPr>
           <w:color w:val="1E3A5F"/>
         </w:rPr>
-        <w:t>2. Problem Statement &amp; Do</w:t>
-      </w:r>
-      <w:r>
-        <w:rPr>
-          <w:color w:val="1E3A5F"/>
-        </w:rPr>
-        <w:t>main Context</w:t>
+        <w:t>2. Problem Statement &amp; Domain Context</w:t>
       </w:r>
     </w:p>
     <w:p>
@@ -453,10 +378,7 @@
         <w:spacing w:before="60" w:after="100"/>
       </w:pPr>
       <w:r>
-        <w:t>The Ministry of Cooperation has spearheaded nationwide digitalization, including computerization of 63,000+ functional PACS, establishment of Model Bye-laws, creation of the National Cooperative Database (cataloging over 8.44 la</w:t>
-      </w:r>
-      <w:r>
-        <w:t>kh cooperatives and 30+ crore members), and introduction of the National Cooperation Policy 2025.</w:t>
+        <w:t>The Ministry of Cooperation has spearheaded nationwide digitalization, including computerization of 63,000+ functional PACS, establishment of Model Bye-laws, creation of the National Cooperative Database (cataloging over 8.44 lakh cooperatives and 30+ crore members), and introduction of the National Cooperation Policy 2025.</w:t>
       </w:r>
     </w:p>
     <w:p>
@@ -478,13 +400,7 @@
         <w:rPr>
           <w:b/>
         </w:rPr>
-        <w:t>Administrativ</w:t>
-      </w:r>
-      <w:r>
-        <w:rPr>
-          <w:b/>
-        </w:rPr>
-        <w:t>e Fragmentation:</w:t>
+        <w:t>Administrative Fragmentation:</w:t>
       </w:r>
       <w:r>
         <w:t xml:space="preserve"> Trainee registration, institution approvals, hostel room allocations, timetable generation, and logistics tracking are maintained in disconnected spreadsheets or physical logbooks.</w:t>
@@ -521,10 +437,7 @@
         <w:t>Attendance Integrity:</w:t>
       </w:r>
       <w:r>
-        <w:t xml:space="preserve"> Paper attendance and single-point biometrics are vulnerable to pr</w:t>
-      </w:r>
-      <w:r>
-        <w:t>oxy check-ins, lack audit trails, and fail during network outages.</w:t>
+        <w:t xml:space="preserve"> Paper attendance and single-point biometrics are vulnerable to proxy check-ins, lack audit trails, and fail during network outages.</w:t>
       </w:r>
     </w:p>
     <w:p>
@@ -555,13 +468,7 @@
         <w:rPr>
           <w:b/>
         </w:rPr>
-        <w:t>Empl</w:t>
-      </w:r>
-      <w:r>
-        <w:rPr>
-          <w:b/>
-        </w:rPr>
-        <w:t>oyment Disconnect:</w:t>
+        <w:t>Employment Disconnect:</w:t>
       </w:r>
       <w:r>
         <w:t xml:space="preserve"> While cooperative societies urgently require certified talent in PACS accounting, Tally ERP, inventory management, and cold chain logistics, trained rural youth have no direct visibility into vacancies.</w:t>
@@ -577,6 +484,7 @@
           <w:color w:val="0D9488"/>
           <w:sz w:val="23"/>
         </w:rPr>
+        <w:lastRenderedPageBreak/>
         <w:t>2.2 Problem Statement &amp; Scope</w:t>
       </w:r>
     </w:p>
@@ -585,10 +493,7 @@
         <w:spacing w:before="60" w:after="100"/>
       </w:pPr>
       <w:r>
-        <w:t>To d</w:t>
-      </w:r>
-      <w:r>
-        <w:t>esign, develop, and implement an integrated, scalable, web-based digital ecosystem for cooperative training institutions that combines:</w:t>
+        <w:t>To design, develop, and implement an integrated, scalable, web-based digital ecosystem for cooperative training institutions that combines:</w:t>
       </w:r>
     </w:p>
     <w:p>
@@ -606,10 +511,7 @@
         <w:spacing w:before="30" w:after="30"/>
       </w:pPr>
       <w:r>
-        <w:t>Offline-first Learning M</w:t>
-      </w:r>
-      <w:r>
-        <w:t>anagement System (LMS) with interactive multilingual content.</w:t>
+        <w:t>Offline-first Learning Management System (LMS) with interactive multilingual content.</w:t>
       </w:r>
     </w:p>
     <w:p>
@@ -636,10 +538,7 @@
         <w:spacing w:before="30" w:after="30"/>
       </w:pPr>
       <w:r>
-        <w:t>Cryptographically verifiable D</w:t>
-      </w:r>
-      <w:r>
-        <w:t>igital Skill Passports.</w:t>
+        <w:t>Cryptographically verifiable Digital Skill Passports.</w:t>
       </w:r>
     </w:p>
     <w:p>
@@ -669,7 +568,6 @@
         <w:rPr>
           <w:color w:val="1E3A5F"/>
         </w:rPr>
-        <w:lastRenderedPageBreak/>
         <w:t>3. Requirement-to-Solution Mapping</w:t>
       </w:r>
     </w:p>
@@ -678,10 +576,7 @@
         <w:spacing w:before="60" w:after="100"/>
       </w:pPr>
       <w:r>
-        <w:t>The table below demonstrates direct, full-sco</w:t>
-      </w:r>
-      <w:r>
-        <w:t>pe alignment with the technical requirements of Problem Statement 26087:</w:t>
+        <w:t>The table below demonstrates direct, full-scope alignment with the technical requirements of Problem Statement 26087:</w:t>
       </w:r>
     </w:p>
     <w:tbl>
@@ -872,13 +767,7 @@
               <w:rPr>
                 <w:sz w:val="17"/>
               </w:rPr>
-              <w:t xml:space="preserve">Web-based nomination portal supporting self-registration, </w:t>
-            </w:r>
-            <w:r>
-              <w:rPr>
-                <w:sz w:val="17"/>
-              </w:rPr>
-              <w:t>society sponsorship, and institute bulk approvals.</w:t>
+              <w:t>Web-based nomination portal supporting self-registration, society sponsorship, and institute bulk approvals.</w:t>
             </w:r>
           </w:p>
         </w:tc>
@@ -1001,13 +890,7 @@
               <w:rPr>
                 <w:sz w:val="17"/>
               </w:rPr>
-              <w:t>Postgr</w:t>
-            </w:r>
-            <w:r>
-              <w:rPr>
-                <w:sz w:val="17"/>
-              </w:rPr>
-              <w:t>eSQL central ledger, cryptographic format `SAH-YYYY-INST-XXXXXX`.</w:t>
+              <w:t>PostgreSQL central ledger, cryptographic format `SAH-YYYY-INST-XXXXXX`.</w:t>
             </w:r>
           </w:p>
         </w:tc>
@@ -1107,14 +990,7 @@
                 <w:b/>
                 <w:sz w:val="17"/>
               </w:rPr>
-              <w:t xml:space="preserve">Moodle LMS Core integration + Government BHASHINI AI </w:t>
-            </w:r>
-            <w:r>
-              <w:rPr>
-                <w:b/>
-                <w:sz w:val="17"/>
-              </w:rPr>
-              <w:t>speech/translation API.</w:t>
+              <w:t>Moodle LMS Core integration + Government BHASHINI AI speech/translation API.</w:t>
             </w:r>
           </w:p>
         </w:tc>
@@ -1266,14 +1142,7 @@
                 <w:b/>
                 <w:sz w:val="17"/>
               </w:rPr>
-              <w:t>Ti</w:t>
-            </w:r>
-            <w:r>
-              <w:rPr>
-                <w:b/>
-                <w:sz w:val="17"/>
-              </w:rPr>
-              <w:t>metable, Hostel &amp; Logistics Management</w:t>
+              <w:t>Timetable, Hostel &amp; Logistics Management</w:t>
             </w:r>
           </w:p>
         </w:tc>
@@ -1372,14 +1241,7 @@
                 <w:b/>
                 <w:sz w:val="17"/>
               </w:rPr>
-              <w:t xml:space="preserve">LMS Integration, </w:t>
-            </w:r>
-            <w:r>
-              <w:rPr>
-                <w:b/>
-                <w:sz w:val="17"/>
-              </w:rPr>
-              <w:t>Assessment &amp; Certification</w:t>
+              <w:t>LMS Integration, Assessment &amp; Certification</w:t>
             </w:r>
           </w:p>
         </w:tc>
@@ -1402,7 +1264,14 @@
               <w:rPr>
                 <w:sz w:val="17"/>
               </w:rPr>
-              <w:t>Automated module quizzes, proctored summative exams, rubric-based grading, and instant certificate issuing.</w:t>
+              <w:t xml:space="preserve">Automated module quizzes, proctored summative exams, rubric-based grading, and </w:t>
+            </w:r>
+            <w:r>
+              <w:rPr>
+                <w:sz w:val="17"/>
+              </w:rPr>
+              <w:lastRenderedPageBreak/>
+              <w:t>instant certificate issuing.</w:t>
             </w:r>
           </w:p>
         </w:tc>
@@ -1425,6 +1294,7 @@
               <w:rPr>
                 <w:sz w:val="17"/>
               </w:rPr>
+              <w:lastRenderedPageBreak/>
               <w:t>LMS evaluation pipeline enforcing customizable cutoff score benchmarks.</w:t>
             </w:r>
           </w:p>
@@ -1454,6 +1324,7 @@
                 <w:b/>
                 <w:sz w:val="17"/>
               </w:rPr>
+              <w:lastRenderedPageBreak/>
               <w:t>7</w:t>
             </w:r>
           </w:p>
@@ -1600,13 +1471,7 @@
               <w:rPr>
                 <w:sz w:val="17"/>
               </w:rPr>
-              <w:t xml:space="preserve">AI knowledge assistant providing guidance on </w:t>
-            </w:r>
-            <w:r>
-              <w:rPr>
-                <w:sz w:val="17"/>
-              </w:rPr>
-              <w:t>cooperative schemes, bye-laws, and career paths.</w:t>
+              <w:t>AI knowledge assistant providing guidance on cooperative schemes, bye-laws, and career paths.</w:t>
             </w:r>
           </w:p>
         </w:tc>
@@ -1705,20 +1570,7 @@
               <w:rPr>
                 <w:sz w:val="17"/>
               </w:rPr>
-              <w:t xml:space="preserve">Dedicated recruiter portal for posting vacancies, filtering certified candidates, and </w:t>
-            </w:r>
-            <w:r>
-              <w:rPr>
-                <w:sz w:val="17"/>
-              </w:rPr>
-              <w:lastRenderedPageBreak/>
-              <w:t>reviewi</w:t>
-            </w:r>
-            <w:r>
-              <w:rPr>
-                <w:sz w:val="17"/>
-              </w:rPr>
-              <w:t>ng Skill Passports.</w:t>
+              <w:t>Dedicated recruiter portal for posting vacancies, filtering certified candidates, and reviewing Skill Passports.</w:t>
             </w:r>
           </w:p>
         </w:tc>
@@ -1741,7 +1593,6 @@
               <w:rPr>
                 <w:sz w:val="17"/>
               </w:rPr>
-              <w:lastRenderedPageBreak/>
               <w:t>Cooperative recruitment hub with automated candidate pipeline management.</w:t>
             </w:r>
           </w:p>
@@ -1771,7 +1622,6 @@
                 <w:b/>
                 <w:sz w:val="17"/>
               </w:rPr>
-              <w:lastRenderedPageBreak/>
               <w:t>10</w:t>
             </w:r>
           </w:p>
@@ -1843,13 +1693,7 @@
               <w:rPr>
                 <w:sz w:val="17"/>
               </w:rPr>
-              <w:t xml:space="preserve">React PWA + Raspberry Pi </w:t>
-            </w:r>
-            <w:r>
-              <w:rPr>
-                <w:sz w:val="17"/>
-              </w:rPr>
-              <w:t>5 local Wi-Fi micro-cloud with store-and-forward sync.</w:t>
+              <w:t>React PWA + Raspberry Pi 5 local Wi-Fi micro-cloud with store-and-forward sync.</w:t>
             </w:r>
           </w:p>
         </w:tc>
@@ -1948,13 +1792,7 @@
               <w:rPr>
                 <w:sz w:val="17"/>
               </w:rPr>
-              <w:t xml:space="preserve">Recharts analytics engine fed by central </w:t>
-            </w:r>
-            <w:r>
-              <w:rPr>
-                <w:sz w:val="17"/>
-              </w:rPr>
-              <w:t>PostgreSQL event warehouse.</w:t>
+              <w:t>Recharts analytics engine fed by central PostgreSQL event warehouse.</w:t>
             </w:r>
           </w:p>
         </w:tc>
@@ -2055,10 +1893,7 @@
         <w:spacing w:before="60" w:after="100"/>
       </w:pPr>
       <w:r>
-        <w:t>SahakarSetu is built on a resilient, multi-tiered micro-cloud architecture designed</w:t>
-      </w:r>
-      <w:r>
-        <w:t xml:space="preserve"> for high throughput, offline durability, and zero single-point-of-failure operation:</w:t>
+        <w:t>SahakarSetu is built on a resilient, multi-tiered micro-cloud architecture designed for high throughput, offline durability, and zero single-point-of-failure operation:</w:t>
       </w:r>
     </w:p>
     <w:tbl>
@@ -2105,7 +1940,7 @@
                 <w:sz w:val="17"/>
               </w:rPr>
               <w:br/>
-              <w:t xml:space="preserve">|                           CENTRAL CLOUD PLATFORM                                  </w:t>
+              <w:t>|                           CENTRAL CLOUD PLATFORM                                  |</w:t>
             </w:r>
             <w:r>
               <w:rPr>
@@ -2113,7 +1948,8 @@
                 <w:color w:val="0F172A"/>
                 <w:sz w:val="17"/>
               </w:rPr>
-              <w:t>|</w:t>
+              <w:br/>
+              <w:t>|                                                                                   |</w:t>
             </w:r>
             <w:r>
               <w:rPr>
@@ -2122,7 +1958,7 @@
                 <w:sz w:val="17"/>
               </w:rPr>
               <w:br/>
-              <w:t>|                                                                                   |</w:t>
+              <w:t>|  [ Load Balancer &amp; TLS 1.3 Termination ]                                          |</w:t>
             </w:r>
             <w:r>
               <w:rPr>
@@ -2131,7 +1967,7 @@
                 <w:sz w:val="17"/>
               </w:rPr>
               <w:br/>
-              <w:t>|  [ Load Balancer &amp; TLS 1.3 Termination ]                                          |</w:t>
+              <w:t>|         |                                                                         |</w:t>
             </w:r>
             <w:r>
               <w:rPr>
@@ -2140,7 +1976,7 @@
                 <w:sz w:val="17"/>
               </w:rPr>
               <w:br/>
-              <w:t xml:space="preserve">|         |                                                                       </w:t>
+              <w:t>|         +---&gt; [ Django REST ERP Core ] &lt;---&gt; [ PostgreSQL Database Ledger ]       |</w:t>
             </w:r>
             <w:r>
               <w:rPr>
@@ -2148,7 +1984,8 @@
                 <w:color w:val="0F172A"/>
                 <w:sz w:val="17"/>
               </w:rPr>
-              <w:t xml:space="preserve">  |</w:t>
+              <w:br/>
+              <w:t>|         |     - Nominations &amp; Profiles        - Relational Schema                 |</w:t>
             </w:r>
             <w:r>
               <w:rPr>
@@ -2157,7 +1994,7 @@
                 <w:sz w:val="17"/>
               </w:rPr>
               <w:br/>
-              <w:t>|         +---&gt; [ Django REST ERP Core ] &lt;---&gt; [ PostgreSQL Database Ledger ]       |</w:t>
+              <w:t>|         |     - Timetable &amp; Hostel ERP        - pgvector Embeddings               |</w:t>
             </w:r>
             <w:r>
               <w:rPr>
@@ -2166,7 +2003,7 @@
                 <w:sz w:val="17"/>
               </w:rPr>
               <w:br/>
-              <w:t>|         |     - Nominations &amp; Profiles        - Relational Schema                 |</w:t>
+              <w:t>|         |     - Recruiter &amp; Jobs Portal       - Audit Logs (DPDP Act)             |</w:t>
             </w:r>
             <w:r>
               <w:rPr>
@@ -2175,7 +2012,7 @@
                 <w:sz w:val="17"/>
               </w:rPr>
               <w:br/>
-              <w:t xml:space="preserve">|         |     - Timetable &amp; Hostel ERP        - pgvector Embeddings           </w:t>
+              <w:t>|         |                                                                         |</w:t>
             </w:r>
             <w:r>
               <w:rPr>
@@ -2183,7 +2020,8 @@
                 <w:color w:val="0F172A"/>
                 <w:sz w:val="17"/>
               </w:rPr>
-              <w:t xml:space="preserve">    |</w:t>
+              <w:br/>
+              <w:t>|         +---&gt; [ LMS &amp; Assessment Engine ] &lt;---&gt; [ S3 / Object Store Media ]       |</w:t>
             </w:r>
             <w:r>
               <w:rPr>
@@ -2192,7 +2030,7 @@
                 <w:sz w:val="17"/>
               </w:rPr>
               <w:br/>
-              <w:t>|         |     - Recruiter &amp; Jobs Portal       - Audit Logs (DPDP Act)             |</w:t>
+              <w:t>|         |     - Moodle Core Services          - SCORM Packages                    |</w:t>
             </w:r>
             <w:r>
               <w:rPr>
@@ -2201,7 +2039,7 @@
                 <w:sz w:val="17"/>
               </w:rPr>
               <w:br/>
-              <w:t>|         |                                                                         |</w:t>
+              <w:t>|         |     - Quiz Evaluation Pipeline      - HD Video Lectures                 |</w:t>
             </w:r>
             <w:r>
               <w:rPr>
@@ -2210,7 +2048,7 @@
                 <w:sz w:val="17"/>
               </w:rPr>
               <w:br/>
-              <w:t xml:space="preserve">|         +---&gt; [ LMS &amp; Assessment Engine ] &lt;---&gt; [ S3 / Object Store Media ] </w:t>
+              <w:t>|         |     - Skill Passport Signer         - PDF Handouts &amp; Manuals            |</w:t>
             </w:r>
             <w:r>
               <w:rPr>
@@ -2218,7 +2056,8 @@
                 <w:color w:val="0F172A"/>
                 <w:sz w:val="17"/>
               </w:rPr>
-              <w:t xml:space="preserve">      |</w:t>
+              <w:br/>
+              <w:t>|         |                                                                         |</w:t>
             </w:r>
             <w:r>
               <w:rPr>
@@ -2227,7 +2066,7 @@
                 <w:sz w:val="17"/>
               </w:rPr>
               <w:br/>
-              <w:t>|         |     - Moodle Core Services          - SCORM Packages                    |</w:t>
+              <w:t>|         +---&gt; [ AI &amp; Analytics Services ] &lt;---&gt; [ External Gov Services ]         |</w:t>
             </w:r>
             <w:r>
               <w:rPr>
@@ -2236,7 +2075,7 @@
                 <w:sz w:val="17"/>
               </w:rPr>
               <w:br/>
-              <w:t>|         |     - Quiz Evaluation Pipeline      - HD Video Lectures                 |</w:t>
+              <w:t>|               - XGBoost Skill Matcher           - BHASHINI AI (Translation)       |</w:t>
             </w:r>
             <w:r>
               <w:rPr>
@@ -2245,7 +2084,7 @@
                 <w:sz w:val="17"/>
               </w:rPr>
               <w:br/>
-              <w:t xml:space="preserve">|         |     - Skill Passport Signer         - PDF Handouts &amp; Manuals    </w:t>
+              <w:t>|               - RAG Career Chatbot              - National Cooperative DB (NCD)   |</w:t>
             </w:r>
             <w:r>
               <w:rPr>
@@ -2253,7 +2092,8 @@
                 <w:color w:val="0F172A"/>
                 <w:sz w:val="17"/>
               </w:rPr>
-              <w:t xml:space="preserve">        |</w:t>
+              <w:br/>
+              <w:t>|               - National KPI Aggregator         - DigiLocker API (Ready)          |</w:t>
             </w:r>
             <w:r>
               <w:rPr>
@@ -2262,7 +2102,7 @@
                 <w:sz w:val="17"/>
               </w:rPr>
               <w:br/>
-              <w:t>|         |                                                                         |</w:t>
+              <w:t>+-----------------------------------------------------------------------------------+</w:t>
             </w:r>
             <w:r>
               <w:rPr>
@@ -2271,7 +2111,7 @@
                 <w:sz w:val="17"/>
               </w:rPr>
               <w:br/>
-              <w:t>|         +---&gt; [ AI &amp; Analytics Services ] &lt;---&gt; [ External Gov Services ]         |</w:t>
+              <w:t xml:space="preserve">                                         ^</w:t>
             </w:r>
             <w:r>
               <w:rPr>
@@ -2280,7 +2120,7 @@
                 <w:sz w:val="17"/>
               </w:rPr>
               <w:br/>
-              <w:t>|               - XGBoost Skill Matcher           - BHASHINI AI (Translati</w:t>
+              <w:t xml:space="preserve">                                         | Secure TLS REST Sync (JSON API)</w:t>
             </w:r>
             <w:r>
               <w:rPr>
@@ -2288,7 +2128,8 @@
                 <w:color w:val="0F172A"/>
                 <w:sz w:val="17"/>
               </w:rPr>
-              <w:t>on)       |</w:t>
+              <w:br/>
+              <w:t xml:space="preserve">                                         v</w:t>
             </w:r>
             <w:r>
               <w:rPr>
@@ -2297,7 +2138,7 @@
                 <w:sz w:val="17"/>
               </w:rPr>
               <w:br/>
-              <w:t>|               - RAG Career Chatbot              - National Cooperative DB (NCD)   |</w:t>
+              <w:t>+-----------------------------------------------------------------------------------+</w:t>
             </w:r>
             <w:r>
               <w:rPr>
@@ -2306,7 +2147,7 @@
                 <w:sz w:val="17"/>
               </w:rPr>
               <w:br/>
-              <w:t>|               - National KPI Aggregator         - DigiLocker API (Ready)          |</w:t>
+              <w:t>|                     SAHAKAR EDGE BOX (CAMPUS / PACS NODE)                         |</w:t>
             </w:r>
             <w:r>
               <w:rPr>
@@ -2315,7 +2156,7 @@
                 <w:sz w:val="17"/>
               </w:rPr>
               <w:br/>
-              <w:t>+-----------------------------------------------------------------------</w:t>
+              <w:t>|                                                                                   |</w:t>
             </w:r>
             <w:r>
               <w:rPr>
@@ -2323,7 +2164,8 @@
                 <w:color w:val="0F172A"/>
                 <w:sz w:val="17"/>
               </w:rPr>
-              <w:t>------------+</w:t>
+              <w:br/>
+              <w:t>|  [ Hardware: Raspberry Pi 5 | 8GB RAM | 256GB NVMe SSD | Dual-Band Wi-Fi 5 AP ]   |</w:t>
             </w:r>
             <w:r>
               <w:rPr>
@@ -2332,7 +2174,7 @@
                 <w:sz w:val="17"/>
               </w:rPr>
               <w:br/>
-              <w:t xml:space="preserve">                                         ^</w:t>
+              <w:t>|                                                                                   |</w:t>
             </w:r>
             <w:r>
               <w:rPr>
@@ -2341,7 +2183,7 @@
                 <w:sz w:val="17"/>
               </w:rPr>
               <w:br/>
-              <w:t xml:space="preserve">                                         | Secure TLS REST Sync (JSON API)</w:t>
+              <w:t>|  [ Local Nginx Web Server ] ---&gt; Serves React PWA offline to trainee smartphones  |</w:t>
             </w:r>
             <w:r>
               <w:rPr>
@@ -2350,7 +2192,7 @@
                 <w:sz w:val="17"/>
               </w:rPr>
               <w:br/>
-              <w:t xml:space="preserve">                                         v</w:t>
+              <w:t>|  [ Local API Gateway ]     ---&gt; Express / Fast-API microservices                  |</w:t>
             </w:r>
             <w:r>
               <w:rPr>
@@ -2359,7 +2201,7 @@
                 <w:sz w:val="17"/>
               </w:rPr>
               <w:br/>
-              <w:t>+--------------------------------------------------------------------------------</w:t>
+              <w:t>|  [ Local Media Storage ]   ---&gt; Caches 50+ GB of regional educational video/docs  |</w:t>
             </w:r>
             <w:r>
               <w:rPr>
@@ -2367,7 +2209,8 @@
                 <w:color w:val="0F172A"/>
                 <w:sz w:val="17"/>
               </w:rPr>
-              <w:t>---+</w:t>
+              <w:br/>
+              <w:t>|  [ Local Event Journal ]   ---&gt; SQLite ACID transaction queue (sync worker)       |</w:t>
             </w:r>
             <w:r>
               <w:rPr>
@@ -2376,7 +2219,7 @@
                 <w:sz w:val="17"/>
               </w:rPr>
               <w:br/>
-              <w:t>|                     SAHAKAR EDGE BOX (CAMPUS / PACS NODE)                         |</w:t>
+              <w:t>|  [ Attendance Engine ]     ---&gt; On-device ArcFace feature extractor + QR receiver |</w:t>
             </w:r>
             <w:r>
               <w:rPr>
@@ -2385,7 +2228,7 @@
                 <w:sz w:val="17"/>
               </w:rPr>
               <w:br/>
-              <w:t>|                                                                                   |</w:t>
+              <w:t>+-----------------------------------------------------------------------------------+</w:t>
             </w:r>
             <w:r>
               <w:rPr>
@@ -2394,7 +2237,7 @@
                 <w:sz w:val="17"/>
               </w:rPr>
               <w:br/>
-              <w:t>|  [ Hardware: Raspberry Pi 5 | 8GB RAM | 256GB NVMe SSD | Dual-Band Wi-Fi 5 AP</w:t>
+              <w:t xml:space="preserve">        |                                                           |</w:t>
             </w:r>
             <w:r>
               <w:rPr>
@@ -2402,7 +2245,8 @@
                 <w:color w:val="0F172A"/>
                 <w:sz w:val="17"/>
               </w:rPr>
-              <w:t xml:space="preserve"> ]   |</w:t>
+              <w:br/>
+              <w:t xml:space="preserve">        v Local Wi-Fi (No Internet Required)                         v</w:t>
             </w:r>
             <w:r>
               <w:rPr>
@@ -2411,7 +2255,7 @@
                 <w:sz w:val="17"/>
               </w:rPr>
               <w:br/>
-              <w:t>|                                                                                   |</w:t>
+              <w:t>+------------------------------------+             +--------------------------------+</w:t>
             </w:r>
             <w:r>
               <w:rPr>
@@ -2420,7 +2264,7 @@
                 <w:sz w:val="17"/>
               </w:rPr>
               <w:br/>
-              <w:t>|  [ Local Nginx Web Server ] ---&gt; Serves React PWA offline to trainee smartphones  |</w:t>
+              <w:t>|          TRAINEE SMARTPHONE        |             |       TRAINER / ADMIN PC       |</w:t>
             </w:r>
             <w:r>
               <w:rPr>
@@ -2429,7 +2273,7 @@
                 <w:sz w:val="17"/>
               </w:rPr>
               <w:br/>
-              <w:t xml:space="preserve">|  [ Local API Gateway ]     ---&gt; Express / Fast-API microservices           </w:t>
+              <w:t>|  React 19 PWA / Native Client      |             |  Web-based ERP &amp; Studio UI     |</w:t>
             </w:r>
             <w:r>
               <w:rPr>
@@ -2437,7 +2281,8 @@
                 <w:color w:val="0F172A"/>
                 <w:sz w:val="17"/>
               </w:rPr>
-              <w:t xml:space="preserve">       |</w:t>
+              <w:br/>
+              <w:t>|  - Offline LMS Video Playback      |             |  - Biometric Attendance Review |</w:t>
             </w:r>
             <w:r>
               <w:rPr>
@@ -2446,7 +2291,7 @@
                 <w:sz w:val="17"/>
               </w:rPr>
               <w:br/>
-              <w:t>|  [ Local Media Storage ]   ---&gt; Caches 50+ GB of regional educational video/docs  |</w:t>
+              <w:t>|  - Interactive Modular Quizzes     |             |  - Classroom Timetable Editor  |</w:t>
             </w:r>
             <w:r>
               <w:rPr>
@@ -2455,7 +2300,7 @@
                 <w:sz w:val="17"/>
               </w:rPr>
               <w:br/>
-              <w:t>|  [ Local Event Journal ]   ---&gt; SQLite ACID transaction queue (sync worker)       |</w:t>
+              <w:t>|  - Dynamic Rotating QR Attendance  |             |  - Batch Grade Publishing      |</w:t>
             </w:r>
             <w:r>
               <w:rPr>
@@ -2464,129 +2309,7 @@
                 <w:sz w:val="17"/>
               </w:rPr>
               <w:br/>
-              <w:t xml:space="preserve">|  [ Attendance Engine ]     ---&gt; On-device ArcFace feature extractor + QR </w:t>
-            </w:r>
-            <w:r>
-              <w:rPr>
-                <w:rFonts w:ascii="Consolas" w:hAnsi="Consolas"/>
-                <w:color w:val="0F172A"/>
-                <w:sz w:val="17"/>
-              </w:rPr>
-              <w:t>receiver |</w:t>
-            </w:r>
-            <w:r>
-              <w:rPr>
-                <w:rFonts w:ascii="Consolas" w:hAnsi="Consolas"/>
-                <w:color w:val="0F172A"/>
-                <w:sz w:val="17"/>
-              </w:rPr>
-              <w:br/>
-              <w:t>+-----------------------------------------------------------------------------------+</w:t>
-            </w:r>
-            <w:r>
-              <w:rPr>
-                <w:rFonts w:ascii="Consolas" w:hAnsi="Consolas"/>
-                <w:color w:val="0F172A"/>
-                <w:sz w:val="17"/>
-              </w:rPr>
-              <w:br/>
-              <w:t xml:space="preserve">        |                                                           |</w:t>
-            </w:r>
-            <w:r>
-              <w:rPr>
-                <w:rFonts w:ascii="Consolas" w:hAnsi="Consolas"/>
-                <w:color w:val="0F172A"/>
-                <w:sz w:val="17"/>
-              </w:rPr>
-              <w:br/>
-              <w:t xml:space="preserve">        v Local Wi-Fi (No Internet Required)                         v</w:t>
-            </w:r>
-            <w:r>
-              <w:rPr>
-                <w:rFonts w:ascii="Consolas" w:hAnsi="Consolas"/>
-                <w:color w:val="0F172A"/>
-                <w:sz w:val="17"/>
-              </w:rPr>
-              <w:br/>
-              <w:t>+-----------------</w:t>
-            </w:r>
-            <w:r>
-              <w:rPr>
-                <w:rFonts w:ascii="Consolas" w:hAnsi="Consolas"/>
-                <w:color w:val="0F172A"/>
-                <w:sz w:val="17"/>
-              </w:rPr>
-              <w:t>-------------------+             +--------------------------------+</w:t>
-            </w:r>
-            <w:r>
-              <w:rPr>
-                <w:rFonts w:ascii="Consolas" w:hAnsi="Consolas"/>
-                <w:color w:val="0F172A"/>
-                <w:sz w:val="17"/>
-              </w:rPr>
-              <w:br/>
-              <w:t>|          TRAINEE SMARTPHONE        |             |       TRAINER / ADMIN PC       |</w:t>
-            </w:r>
-            <w:r>
-              <w:rPr>
-                <w:rFonts w:ascii="Consolas" w:hAnsi="Consolas"/>
-                <w:color w:val="0F172A"/>
-                <w:sz w:val="17"/>
-              </w:rPr>
-              <w:br/>
-              <w:t>|  React 19 PWA / Native Client      |             |  Web-based ERP &amp; Studio UI     |</w:t>
-            </w:r>
-            <w:r>
-              <w:rPr>
-                <w:rFonts w:ascii="Consolas" w:hAnsi="Consolas"/>
-                <w:color w:val="0F172A"/>
-                <w:sz w:val="17"/>
-              </w:rPr>
-              <w:br/>
-              <w:t>|  - Offline LMS</w:t>
-            </w:r>
-            <w:r>
-              <w:rPr>
-                <w:rFonts w:ascii="Consolas" w:hAnsi="Consolas"/>
-                <w:color w:val="0F172A"/>
-                <w:sz w:val="17"/>
-              </w:rPr>
-              <w:t xml:space="preserve"> Video Playback      |             |  - Biometric Attendance Review |</w:t>
-            </w:r>
-            <w:r>
-              <w:rPr>
-                <w:rFonts w:ascii="Consolas" w:hAnsi="Consolas"/>
-                <w:color w:val="0F172A"/>
-                <w:sz w:val="17"/>
-              </w:rPr>
-              <w:br/>
-              <w:t>|  - Interactive Modular Quizzes     |             |  - Classroom Timetable Editor  |</w:t>
-            </w:r>
-            <w:r>
-              <w:rPr>
-                <w:rFonts w:ascii="Consolas" w:hAnsi="Consolas"/>
-                <w:color w:val="0F172A"/>
-                <w:sz w:val="17"/>
-              </w:rPr>
-              <w:br/>
-              <w:t>|  - Dynamic Rotating QR Attendance  |             |  - Batch Grade Publishing      |</w:t>
-            </w:r>
-            <w:r>
-              <w:rPr>
-                <w:rFonts w:ascii="Consolas" w:hAnsi="Consolas"/>
-                <w:color w:val="0F172A"/>
-                <w:sz w:val="17"/>
-              </w:rPr>
-              <w:br/>
-              <w:t>|  - Digital S</w:t>
-            </w:r>
-            <w:r>
-              <w:rPr>
-                <w:rFonts w:ascii="Consolas" w:hAnsi="Consolas"/>
-                <w:color w:val="0F172A"/>
-                <w:sz w:val="17"/>
-              </w:rPr>
-              <w:t>kill Passport Storage  |             |  - Manual Edge Sync Controls   |</w:t>
+              <w:t>|  - Digital Skill Passport Storage  |             |  - Manual Edge Sync Controls   |</w:t>
             </w:r>
             <w:r>
               <w:rPr>
@@ -2633,10 +2356,7 @@
         <w:t>Edge Presentation Tier:</w:t>
       </w:r>
       <w:r>
-        <w:t xml:space="preserve"> React 19 Progressive Web Application (PW</w:t>
-      </w:r>
-      <w:r>
-        <w:t>A) compiled to static assets, featuring Service Workers for client-side offline storage (`idb`/IndexedDB), responsive Tailwind CSS UI, and touch-optimized components.</w:t>
+        <w:t xml:space="preserve"> React 19 Progressive Web Application (PWA) compiled to static assets, featuring Service Workers for client-side offline storage (`idb`/IndexedDB), responsive Tailwind CSS UI, and touch-optimized components.</w:t>
       </w:r>
     </w:p>
     <w:p>
@@ -2653,10 +2373,7 @@
         <w:t>Edge Compute Tier:</w:t>
       </w:r>
       <w:r>
-        <w:t xml:space="preserve"> Raspberry Pi 5 node running Debian/Ubuntu Linux, providing a local </w:t>
-      </w:r>
-      <w:r>
-        <w:t>captive Wi-Fi portal (SSID: `SahakarSetu-EdgeBox`), local Nginx web server, and asynchronous background store-and-forward workers.</w:t>
+        <w:t xml:space="preserve"> Raspberry Pi 5 node running Debian/Ubuntu Linux, providing a local captive Wi-Fi portal (SSID: `SahakarSetu-EdgeBox`), local Nginx web server, and asynchronous background store-and-forward workers.</w:t>
       </w:r>
     </w:p>
     <w:p>
@@ -2673,10 +2390,7 @@
         <w:t>Cloud Application Tier:</w:t>
       </w:r>
       <w:r>
-        <w:t xml:space="preserve"> Python 3.11 / Django 5 REST Framework modular monolith running in containerized environments (Guni</w:t>
-      </w:r>
-      <w:r>
-        <w:t>corn + ASGI), exposing 40+ standardized REST endpoints.</w:t>
+        <w:t xml:space="preserve"> Python 3.11 / Django 5 REST Framework modular monolith running in containerized environments (Gunicorn + ASGI), exposing 40+ standardized REST endpoints.</w:t>
       </w:r>
     </w:p>
     <w:p>
@@ -2707,13 +2421,7 @@
         <w:rPr>
           <w:b/>
         </w:rPr>
-        <w:t>A</w:t>
-      </w:r>
-      <w:r>
-        <w:rPr>
-          <w:b/>
-        </w:rPr>
-        <w:t>I Inference Pipeline:</w:t>
+        <w:t>AI Inference Pipeline:</w:t>
       </w:r>
     </w:p>
     <w:p>
@@ -2729,10 +2437,7 @@
         <w:spacing w:before="60" w:after="100"/>
       </w:pPr>
       <w:r>
-        <w:t>- Vision &amp; Biometrics: InsightFace / ArcFace lightweight neural network (MobileNetV2 backbone) producing 512-dimensio</w:t>
-      </w:r>
-      <w:r>
-        <w:t>nal Euclidean face vectors with MiniFASNet liveness verification.</w:t>
+        <w:t>- Vision &amp; Biometrics: InsightFace / ArcFace lightweight neural network (MobileNetV2 backbone) producing 512-dimensional Euclidean face vectors with MiniFASNet liveness verification.</w:t>
       </w:r>
     </w:p>
     <w:p>
@@ -2765,14 +2470,7 @@
           <w:color w:val="0D9488"/>
           <w:sz w:val="23"/>
         </w:rPr>
-        <w:t>5.1 Purpose &amp; Operating Pr</w:t>
-      </w:r>
-      <w:r>
-        <w:rPr>
-          <w:color w:val="0D9488"/>
-          <w:sz w:val="23"/>
-        </w:rPr>
-        <w:t>inciple</w:t>
+        <w:t>5.1 Purpose &amp; Operating Principle</w:t>
       </w:r>
     </w:p>
     <w:p>
@@ -2789,10 +2487,7 @@
         <w:t>Sahakar Edge Box</w:t>
       </w:r>
       <w:r>
-        <w:t xml:space="preserve"> functions as an intelligent decentralized gateway. Instead of denying access when the intern</w:t>
-      </w:r>
-      <w:r>
-        <w:t>et drops, training operations continue seamlessly in local autonomous mode.</w:t>
+        <w:t xml:space="preserve"> functions as an intelligent decentralized gateway. Instead of denying access when the internet drops, training operations continue seamlessly in local autonomous mode.</w:t>
       </w:r>
     </w:p>
     <w:tbl>
@@ -2848,7 +2543,7 @@
                 <w:sz w:val="17"/>
               </w:rPr>
               <w:br/>
-              <w:t xml:space="preserve">|       </w:t>
+              <w:t>|                                                                                   |</w:t>
             </w:r>
             <w:r>
               <w:rPr>
@@ -2856,7 +2551,8 @@
                 <w:color w:val="0F172A"/>
                 <w:sz w:val="17"/>
               </w:rPr>
-              <w:t xml:space="preserve">                                                                            |</w:t>
+              <w:br/>
+              <w:t>|  [ Trainee Action ] ---&gt; [ Edge Local API ] ---&gt; [ SQLite Journal (Status: Pending) ]</w:t>
             </w:r>
             <w:r>
               <w:rPr>
@@ -2865,7 +2561,7 @@
                 <w:sz w:val="17"/>
               </w:rPr>
               <w:br/>
-              <w:t>|  [ Trainee Action ] ---&gt; [ Edge Local API ] ---&gt; [ SQLite Journal (Status: Pending) ]</w:t>
+              <w:t xml:space="preserve">|  Attendance / Quiz        Generates unique       Stored with tamper-proof SHA-256 </w:t>
             </w:r>
             <w:r>
               <w:rPr>
@@ -2874,7 +2570,7 @@
                 <w:sz w:val="17"/>
               </w:rPr>
               <w:br/>
-              <w:t xml:space="preserve">|  Attendance / Quiz        Generates unique       Stored with tamper-proof SHA-256 </w:t>
+              <w:t xml:space="preserve">|                           UUID &amp; timestamp       hash in local disk queue         </w:t>
             </w:r>
             <w:r>
               <w:rPr>
@@ -2883,7 +2579,7 @@
                 <w:sz w:val="17"/>
               </w:rPr>
               <w:br/>
-              <w:t xml:space="preserve">|    </w:t>
+              <w:t xml:space="preserve">|                                                              |                    </w:t>
             </w:r>
             <w:r>
               <w:rPr>
@@ -2891,7 +2587,8 @@
                 <w:color w:val="0F172A"/>
                 <w:sz w:val="17"/>
               </w:rPr>
-              <w:t xml:space="preserve">                       UUID &amp; timestamp       hash in local disk queue         </w:t>
+              <w:br/>
+              <w:t xml:space="preserve">|                                                     Internet Connection Returns?  </w:t>
             </w:r>
             <w:r>
               <w:rPr>
@@ -2909,7 +2606,7 @@
                 <w:sz w:val="17"/>
               </w:rPr>
               <w:br/>
-              <w:t xml:space="preserve">|                                                     Internet Connection Returns?  </w:t>
+              <w:t xml:space="preserve">|                     +----------------------------------------+                    </w:t>
             </w:r>
             <w:r>
               <w:rPr>
@@ -2918,7 +2615,7 @@
                 <w:sz w:val="17"/>
               </w:rPr>
               <w:br/>
-              <w:t xml:space="preserve">|     </w:t>
+              <w:t xml:space="preserve">|                     | NO                                     | YES                </w:t>
             </w:r>
             <w:r>
               <w:rPr>
@@ -2926,7 +2623,8 @@
                 <w:color w:val="0F172A"/>
                 <w:sz w:val="17"/>
               </w:rPr>
-              <w:t xml:space="preserve">                                                         |                    </w:t>
+              <w:br/>
+              <w:t xml:space="preserve">|                     v                                        v                    </w:t>
             </w:r>
             <w:r>
               <w:rPr>
@@ -2935,7 +2633,7 @@
                 <w:sz w:val="17"/>
               </w:rPr>
               <w:br/>
-              <w:t xml:space="preserve">|                     +----------------------------------------+                    </w:t>
+              <w:t xml:space="preserve">|             [ Remain Queued ]                     [ Dispatch Sync Worker ]        </w:t>
             </w:r>
             <w:r>
               <w:rPr>
@@ -2944,7 +2642,7 @@
                 <w:sz w:val="17"/>
               </w:rPr>
               <w:br/>
-              <w:t xml:space="preserve">|                     | NO                                     | YES                </w:t>
+              <w:t xml:space="preserve">|             Local operations                      POST batch to /api/sync-events/ </w:t>
             </w:r>
             <w:r>
               <w:rPr>
@@ -2953,7 +2651,7 @@
                 <w:sz w:val="17"/>
               </w:rPr>
               <w:br/>
-              <w:t xml:space="preserve">|      </w:t>
+              <w:t xml:space="preserve">|             continue normally                     with exponential retry backoff  </w:t>
             </w:r>
             <w:r>
               <w:rPr>
@@ -2961,7 +2659,8 @@
                 <w:color w:val="0F172A"/>
                 <w:sz w:val="17"/>
               </w:rPr>
-              <w:t xml:space="preserve">               v                                        v                    </w:t>
+              <w:br/>
+              <w:t xml:space="preserve">|                                                              |                    </w:t>
             </w:r>
             <w:r>
               <w:rPr>
@@ -2970,7 +2669,7 @@
                 <w:sz w:val="17"/>
               </w:rPr>
               <w:br/>
-              <w:t xml:space="preserve">|             [ Remain Queued ]                     [ Dispatch Sync Worker ]        </w:t>
+              <w:t xml:space="preserve">|                                                              v                    </w:t>
             </w:r>
             <w:r>
               <w:rPr>
@@ -2979,7 +2678,7 @@
                 <w:sz w:val="17"/>
               </w:rPr>
               <w:br/>
-              <w:t xml:space="preserve">|             Local operations                      POST batch to /api/sync-events/ </w:t>
+              <w:t xml:space="preserve">|                                                   [ Cloud Ingestion &amp; Dedup ]     </w:t>
             </w:r>
             <w:r>
               <w:rPr>
@@ -2988,7 +2687,7 @@
                 <w:sz w:val="17"/>
               </w:rPr>
               <w:br/>
-              <w:t xml:space="preserve">|       </w:t>
+              <w:t xml:space="preserve">|                                                   Idempotent validation; status   </w:t>
             </w:r>
             <w:r>
               <w:rPr>
@@ -2996,7 +2695,8 @@
                 <w:color w:val="0F172A"/>
                 <w:sz w:val="17"/>
               </w:rPr>
-              <w:t xml:space="preserve">      continue normally                     with exponential retry backoff  </w:t>
+              <w:br/>
+              <w:t xml:space="preserve">|                                                   updated to 'synced' nationally  </w:t>
             </w:r>
             <w:r>
               <w:rPr>
@@ -3005,68 +2705,7 @@
                 <w:sz w:val="17"/>
               </w:rPr>
               <w:br/>
-              <w:t xml:space="preserve">|                                                              |                    </w:t>
-            </w:r>
-            <w:r>
-              <w:rPr>
-                <w:rFonts w:ascii="Consolas" w:hAnsi="Consolas"/>
-                <w:color w:val="0F172A"/>
-                <w:sz w:val="17"/>
-              </w:rPr>
-              <w:br/>
-              <w:t xml:space="preserve">|                                                              v                    </w:t>
-            </w:r>
-            <w:r>
-              <w:rPr>
-                <w:rFonts w:ascii="Consolas" w:hAnsi="Consolas"/>
-                <w:color w:val="0F172A"/>
-                <w:sz w:val="17"/>
-              </w:rPr>
-              <w:br/>
-              <w:t xml:space="preserve">|        </w:t>
-            </w:r>
-            <w:r>
-              <w:rPr>
-                <w:rFonts w:ascii="Consolas" w:hAnsi="Consolas"/>
-                <w:color w:val="0F172A"/>
-                <w:sz w:val="17"/>
-              </w:rPr>
-              <w:t xml:space="preserve">                                           [ Cloud Ingestion &amp; Dedup ]     </w:t>
-            </w:r>
-            <w:r>
-              <w:rPr>
-                <w:rFonts w:ascii="Consolas" w:hAnsi="Consolas"/>
-                <w:color w:val="0F172A"/>
-                <w:sz w:val="17"/>
-              </w:rPr>
-              <w:br/>
-              <w:t xml:space="preserve">|                                                   Idempotent validation; status   </w:t>
-            </w:r>
-            <w:r>
-              <w:rPr>
-                <w:rFonts w:ascii="Consolas" w:hAnsi="Consolas"/>
-                <w:color w:val="0F172A"/>
-                <w:sz w:val="17"/>
-              </w:rPr>
-              <w:br/>
-              <w:t xml:space="preserve">|                                                   updated to 'synced' nationally  </w:t>
-            </w:r>
-            <w:r>
-              <w:rPr>
-                <w:rFonts w:ascii="Consolas" w:hAnsi="Consolas"/>
-                <w:color w:val="0F172A"/>
-                <w:sz w:val="17"/>
-              </w:rPr>
-              <w:br/>
-              <w:t>+---------</w:t>
-            </w:r>
-            <w:r>
-              <w:rPr>
-                <w:rFonts w:ascii="Consolas" w:hAnsi="Consolas"/>
-                <w:color w:val="0F172A"/>
-                <w:sz w:val="17"/>
-              </w:rPr>
-              <w:t>--------------------------------------------------------------------------+</w:t>
+              <w:t>+-----------------------------------------------------------------------------------+</w:t>
             </w:r>
           </w:p>
         </w:tc>
@@ -3095,10 +2734,7 @@
         <w:spacing w:before="60" w:after="100"/>
       </w:pPr>
       <w:r>
-        <w:t xml:space="preserve">The Edge Box is engineered with commercial off-the-shelf (COTS) industrial components to guarantee low cost, modular </w:t>
-      </w:r>
-      <w:r>
-        <w:t>repairability, and ease of mass assembly:</w:t>
+        <w:t>The Edge Box is engineered with commercial off-the-shelf (COTS) industrial components to guarantee low cost, modular repairability, and ease of mass assembly:</w:t>
       </w:r>
     </w:p>
     <w:tbl>
@@ -3437,13 +3073,7 @@
               <w:rPr>
                 <w:sz w:val="17"/>
               </w:rPr>
-              <w:t xml:space="preserve">Aluminum </w:t>
-            </w:r>
-            <w:r>
-              <w:rPr>
-                <w:sz w:val="17"/>
-              </w:rPr>
-              <w:t>Heatsink + PWM Fan + ABS Case</w:t>
+              <w:t>Aluminum Heatsink + PWM Fan + ABS Case</w:t>
             </w:r>
           </w:p>
         </w:tc>
@@ -3687,13 +3317,7 @@
               <w:rPr>
                 <w:sz w:val="17"/>
               </w:rPr>
-              <w:t xml:space="preserve">Dual-Band </w:t>
-            </w:r>
-            <w:r>
-              <w:rPr>
-                <w:sz w:val="17"/>
-              </w:rPr>
-              <w:t>Wi-Fi 5 (802.11ac) + Gigabit Ethernet</w:t>
+              <w:t>Dual-Band Wi-Fi 5 (802.11ac) + Gigabit Ethernet</w:t>
             </w:r>
           </w:p>
         </w:tc>
@@ -4293,10 +3917,7 @@
         <w:t>Ordered Event Processing:</w:t>
       </w:r>
       <w:r>
-        <w:t xml:space="preserve"> Events are written to an append-only SQLite trans</w:t>
-      </w:r>
-      <w:r>
-        <w:t>action table with statuses: `pending`, `syncing`, `synced`, `conflict`.</w:t>
+        <w:t xml:space="preserve"> Events are written to an append-only SQLite transaction table with statuses: `pending`, `syncing`, `synced`, `conflict`.</w:t>
       </w:r>
     </w:p>
     <w:p>
@@ -4313,10 +3934,7 @@
         <w:t>Dynamic Reconnection Worker:</w:t>
       </w:r>
       <w:r>
-        <w:t xml:space="preserve"> A background daemon constantly monitors network health by pinging `https://sahakarsetu.gov.in/health/`. Upon ping acknowledgement, the worker dispatches</w:t>
-      </w:r>
-      <w:r>
-        <w:t xml:space="preserve"> batches of 50 events using HTTP POST to `/api/sync-events/`.</w:t>
+        <w:t xml:space="preserve"> A background daemon constantly monitors network health by pinging `https://sahakarsetu-mcdr.onrender.com/health/`. Upon ping acknowledgement, the worker dispatches batches of 50 events using HTTP POST to `/api/sync-events/`.</w:t>
       </w:r>
     </w:p>
     <w:p>
@@ -4345,13 +3963,7 @@
         <w:rPr>
           <w:color w:val="1E3A5F"/>
         </w:rPr>
-        <w:t>6. Unified Trainee Pr</w:t>
-      </w:r>
-      <w:r>
-        <w:rPr>
-          <w:color w:val="1E3A5F"/>
-        </w:rPr>
-        <w:t>ofile &amp; Digital Identity (Sahakar ID)</w:t>
+        <w:t>6. Unified Trainee Profile &amp; Digital Identity (Sahakar ID)</w:t>
       </w:r>
     </w:p>
     <w:p>
@@ -4381,10 +3993,7 @@
         <w:t>Sahakar ID</w:t>
       </w:r>
       <w:r>
-        <w:t>. This replaces ad-hoc local register serials with a standardized, verifiab</w:t>
-      </w:r>
-      <w:r>
-        <w:t>le identifier across all 20 institutes.</w:t>
+        <w:t>. This replaces ad-hoc local register serials with a standardized, verifiable identifier across all 20 institutes.</w:t>
       </w:r>
     </w:p>
     <w:p>
@@ -4421,10 +4030,7 @@
         <w:spacing w:before="60" w:after="100"/>
       </w:pPr>
       <w:r>
-        <w:t xml:space="preserve">The Sahakar </w:t>
-      </w:r>
-      <w:r>
-        <w:t>ID acts as the primary key linking:</w:t>
+        <w:t>The Sahakar ID acts as the primary key linking:</w:t>
       </w:r>
     </w:p>
     <w:p>
@@ -4460,10 +4066,7 @@
         <w:spacing w:before="30" w:after="30"/>
       </w:pPr>
       <w:r>
-        <w:t>C</w:t>
-      </w:r>
-      <w:r>
-        <w:t>ompleted module quizzes and final exam scores.</w:t>
+        <w:t>Completed module quizzes and final exam scores.</w:t>
       </w:r>
     </w:p>
     <w:p>
@@ -4501,10 +4104,7 @@
         <w:spacing w:before="60" w:after="100"/>
       </w:pPr>
       <w:r>
-        <w:t>To elimin</w:t>
-      </w:r>
-      <w:r>
-        <w:t>ate attendance fraud, proxy check-ins, and manual paperwork, SahakarSetu implements a dual-mode verification pipeline tailored for institutional campuses and rural outreach centers:</w:t>
+        <w:t>To eliminate attendance fraud, proxy check-ins, and manual paperwork, SahakarSetu implements a dual-mode verification pipeline tailored for institutional campuses and rural outreach centers:</w:t>
       </w:r>
     </w:p>
     <w:tbl>
@@ -4542,7 +4142,7 @@
                 <w:color w:val="0F172A"/>
                 <w:sz w:val="17"/>
               </w:rPr>
-              <w:t>+-------------------------------------------------------------------------</w:t>
+              <w:t>+-----------------------------------------------------------------------------------+</w:t>
             </w:r>
             <w:r>
               <w:rPr>
@@ -4550,7 +4150,8 @@
                 <w:color w:val="0F172A"/>
                 <w:sz w:val="17"/>
               </w:rPr>
-              <w:t>----------+</w:t>
+              <w:br/>
+              <w:t>|                           ATTENDANCE VERIFICATION MODES                           |</w:t>
             </w:r>
             <w:r>
               <w:rPr>
@@ -4559,7 +4160,7 @@
                 <w:sz w:val="17"/>
               </w:rPr>
               <w:br/>
-              <w:t>|                           ATTENDANCE VERIFICATION MODES                           |</w:t>
+              <w:t>|                                                                                   |</w:t>
             </w:r>
             <w:r>
               <w:rPr>
@@ -4568,7 +4169,7 @@
                 <w:sz w:val="17"/>
               </w:rPr>
               <w:br/>
-              <w:t>|                                                                                   |</w:t>
+              <w:t>|  PRIMARY: Computer Vision Face Attendance                                         |</w:t>
             </w:r>
             <w:r>
               <w:rPr>
@@ -4577,7 +4178,7 @@
                 <w:sz w:val="17"/>
               </w:rPr>
               <w:br/>
-              <w:t xml:space="preserve">|  PRIMARY: Computer Vision Face Attendance                             </w:t>
+              <w:t>|  [ Camera Capture ] ---&gt; [ MiniFASNet Liveness ] ---&gt; [ ArcFace 512-D Vector ]   |</w:t>
             </w:r>
             <w:r>
               <w:rPr>
@@ -4585,7 +4186,8 @@
                 <w:color w:val="0F172A"/>
                 <w:sz w:val="17"/>
               </w:rPr>
-              <w:t xml:space="preserve">            |</w:t>
+              <w:br/>
+              <w:t>|                          Checks blink, texture,        Cosine distance match with |</w:t>
             </w:r>
             <w:r>
               <w:rPr>
@@ -4594,7 +4196,7 @@
                 <w:sz w:val="17"/>
               </w:rPr>
               <w:br/>
-              <w:t>|  [ Camera Capture ] ---&gt; [ MiniFASNet Liveness ] ---&gt; [ ArcFace 512-D Vector ]   |</w:t>
+              <w:t>|                          depth (prevents spoofing)     enrolled template (&lt; 0.40) |</w:t>
             </w:r>
             <w:r>
               <w:rPr>
@@ -4603,7 +4205,7 @@
                 <w:sz w:val="17"/>
               </w:rPr>
               <w:br/>
-              <w:t>|                          Checks blink, texture,        Cosine distance match with |</w:t>
+              <w:t xml:space="preserve">|                                                                    |              </w:t>
             </w:r>
             <w:r>
               <w:rPr>
@@ -4612,7 +4214,7 @@
                 <w:sz w:val="17"/>
               </w:rPr>
               <w:br/>
-              <w:t>|                          depth (prevents spoofing)     enrolled templ</w:t>
+              <w:t xml:space="preserve">|                                                                    v              </w:t>
             </w:r>
             <w:r>
               <w:rPr>
@@ -4620,7 +4222,8 @@
                 <w:color w:val="0F172A"/>
                 <w:sz w:val="17"/>
               </w:rPr>
-              <w:t>ate (&lt; 0.40) |</w:t>
+              <w:br/>
+              <w:t xml:space="preserve">|  SECONDARY: Dynamic Cryptographic QR Code (Fallback)       [ Mark Attendance ]    </w:t>
             </w:r>
             <w:r>
               <w:rPr>
@@ -4629,7 +4232,7 @@
                 <w:sz w:val="17"/>
               </w:rPr>
               <w:br/>
-              <w:t xml:space="preserve">|                                                                    |              </w:t>
+              <w:t xml:space="preserve">|  [ Trainer Displays QR ] ---&gt; [ Trainee PWA Scans ]  ---&gt;  Recorded in local Edge </w:t>
             </w:r>
             <w:r>
               <w:rPr>
@@ -4638,7 +4241,7 @@
                 <w:sz w:val="17"/>
               </w:rPr>
               <w:br/>
-              <w:t xml:space="preserve">|                                                                    v              </w:t>
+              <w:t xml:space="preserve">|  Rotating 30-sec TOTP         Validates GPS boundary       journal with timestamp </w:t>
             </w:r>
             <w:r>
               <w:rPr>
@@ -4647,50 +4250,7 @@
                 <w:sz w:val="17"/>
               </w:rPr>
               <w:br/>
-              <w:t>|  SECONDARY: Dynamic Cryptographic QR Code (Fallback)       [ Mark Att</w:t>
-            </w:r>
-            <w:r>
-              <w:rPr>
-                <w:rFonts w:ascii="Consolas" w:hAnsi="Consolas"/>
-                <w:color w:val="0F172A"/>
-                <w:sz w:val="17"/>
-              </w:rPr>
-              <w:t xml:space="preserve">endance ]    </w:t>
-            </w:r>
-            <w:r>
-              <w:rPr>
-                <w:rFonts w:ascii="Consolas" w:hAnsi="Consolas"/>
-                <w:color w:val="0F172A"/>
-                <w:sz w:val="17"/>
-              </w:rPr>
-              <w:br/>
-              <w:t xml:space="preserve">|  [ Trainer Displays QR ] ---&gt; [ Trainee PWA Scans ]  ---&gt;  Recorded in local Edge </w:t>
-            </w:r>
-            <w:r>
-              <w:rPr>
-                <w:rFonts w:ascii="Consolas" w:hAnsi="Consolas"/>
-                <w:color w:val="0F172A"/>
-                <w:sz w:val="17"/>
-              </w:rPr>
-              <w:br/>
-              <w:t xml:space="preserve">|  Rotating 30-sec TOTP         Validates GPS boundary       journal with timestamp </w:t>
-            </w:r>
-            <w:r>
-              <w:rPr>
-                <w:rFonts w:ascii="Consolas" w:hAnsi="Consolas"/>
-                <w:color w:val="0F172A"/>
-                <w:sz w:val="17"/>
-              </w:rPr>
-              <w:br/>
-              <w:t>|  HMAC-SHA256 signature        &amp; trainee Sahakar ID         and geo-tag</w:t>
-            </w:r>
-            <w:r>
-              <w:rPr>
-                <w:rFonts w:ascii="Consolas" w:hAnsi="Consolas"/>
-                <w:color w:val="0F172A"/>
-                <w:sz w:val="17"/>
-              </w:rPr>
-              <w:t xml:space="preserve">            </w:t>
+              <w:t xml:space="preserve">|  HMAC-SHA256 signature        &amp; trainee Sahakar ID         and geo-tag            </w:t>
             </w:r>
             <w:r>
               <w:rPr>
@@ -4744,10 +4304,7 @@
         <w:t>MiniFASNet</w:t>
       </w:r>
       <w:r>
-        <w:t xml:space="preserve">, an </w:t>
-      </w:r>
-      <w:r>
-        <w:t>ultra-lightweight convolutional network that detects printed paper attacks, tablet replays, and silicone masks by computing micro-surface reflectance and eye-blink frequency.</w:t>
+        <w:t>, an ultra-lightweight convolutional network that detects printed paper attacks, tablet replays, and silicone masks by computing micro-surface reflectance and eye-blink frequency.</w:t>
       </w:r>
     </w:p>
     <w:p>
@@ -4768,13 +4325,7 @@
         <w:rPr>
           <w:b/>
         </w:rPr>
-        <w:t>ArcFace (</w:t>
-      </w:r>
-      <w:r>
-        <w:rPr>
-          <w:b/>
-        </w:rPr>
-        <w:t>Additive Angular Margin Loss)</w:t>
+        <w:t>ArcFace (Additive Angular Margin Loss)</w:t>
       </w:r>
       <w:r>
         <w:t xml:space="preserve"> neural network, converting the face image into a compact 512-dimensional floating-point embedding:</w:t>
@@ -4785,10 +4336,7 @@
         <w:spacing w:before="60" w:after="100"/>
       </w:pPr>
       <w:r>
-        <w:t>L_{\text{ArcFace}} = -\log \frac{e^{s(\cos(\theta_{y_i} + m))}}{e^{s(\cos(\theta_{y_i} + m))} + \sum_{j \neq y_i} e^{s \cos \th</w:t>
-      </w:r>
-      <w:r>
-        <w:t>eta_j}}</w:t>
+        <w:t>L_{\text{ArcFace}} = -\log \frac{e^{s(\cos(\theta_{y_i} + m))}}{e^{s(\cos(\theta_{y_i} + m))} + \sum_{j \neq y_i} e^{s \cos \theta_j}}</w:t>
       </w:r>
     </w:p>
     <w:p>
@@ -4816,75 +4364,58 @@
           <w:color w:val="0D9488"/>
           <w:sz w:val="23"/>
         </w:rPr>
-        <w:t>7.2 Mode B: Rotating Cryptographi</w:t>
-      </w:r>
+        <w:t>7.2 Mode B: Rotating Cryptographic QR Code</w:t>
+      </w:r>
+    </w:p>
+    <w:p>
+      <w:pPr>
+        <w:spacing w:before="60" w:after="100"/>
+      </w:pPr>
+      <w:r>
+        <w:t>For high-density classrooms (60+ trainees entering simultaneously in a 5-minute window), the instructor's terminal renders a rotating QR code updated every 30 seconds.</w:t>
+      </w:r>
+    </w:p>
+    <w:p>
+      <w:pPr>
+        <w:pStyle w:val="ListBullet"/>
+        <w:spacing w:before="30" w:after="30"/>
+      </w:pPr>
+      <w:r>
+        <w:t>The QR payload embeds: `InstituteID | CourseID | SessionID | UTC_Timestamp | HMAC-SHA256_Signature`.</w:t>
+      </w:r>
+    </w:p>
+    <w:p>
+      <w:pPr>
+        <w:pStyle w:val="ListBullet"/>
+        <w:spacing w:before="30" w:after="30"/>
+      </w:pPr>
+      <w:r>
+        <w:t>The trainee's PWA scans the QR code; the device cross-verifies that the phone's GPS coordinates fall within the geofenced classroom radius (≤ 50 meters). Attendance is stamped instantly.</w:t>
+      </w:r>
+    </w:p>
+    <w:p>
+      <w:pPr>
+        <w:pStyle w:val="Heading1"/>
+        <w:spacing w:before="360" w:after="120"/>
+      </w:pPr>
+      <w:r>
+        <w:rPr>
+          <w:color w:val="1E3A5F"/>
+        </w:rPr>
+        <w:t>8. E-Learning &amp; LMS Core Architecture</w:t>
+      </w:r>
+    </w:p>
+    <w:p>
+      <w:pPr>
+        <w:pStyle w:val="Heading2"/>
+        <w:spacing w:before="240" w:after="80"/>
+      </w:pPr>
       <w:r>
         <w:rPr>
           <w:color w:val="0D9488"/>
           <w:sz w:val="23"/>
         </w:rPr>
-        <w:t>c QR Code</w:t>
-      </w:r>
-    </w:p>
-    <w:p>
-      <w:pPr>
-        <w:spacing w:before="60" w:after="100"/>
-      </w:pPr>
-      <w:r>
-        <w:t>For high-density classrooms (60+ trainees entering simultaneously in a 5-minute window), the instructor's terminal renders a rotating QR code updated every 30 seconds.</w:t>
-      </w:r>
-    </w:p>
-    <w:p>
-      <w:pPr>
-        <w:pStyle w:val="ListBullet"/>
-        <w:spacing w:before="30" w:after="30"/>
-      </w:pPr>
-      <w:r>
-        <w:t>The QR payload embeds: `InstituteID | CourseID | SessionID | UTC_Timestamp | H</w:t>
-      </w:r>
-      <w:r>
-        <w:t>MAC-SHA256_Signature`.</w:t>
-      </w:r>
-    </w:p>
-    <w:p>
-      <w:pPr>
-        <w:pStyle w:val="ListBullet"/>
-        <w:spacing w:before="30" w:after="30"/>
-      </w:pPr>
-      <w:r>
-        <w:t>The trainee's PWA scans the QR code; the device cross-verifies that the phone's GPS coordinates fall within the geofenced classroom radius (≤ 50 meters). Attendance is stamped instantly.</w:t>
-      </w:r>
-    </w:p>
-    <w:p>
-      <w:pPr>
-        <w:pStyle w:val="Heading1"/>
-        <w:spacing w:before="360" w:after="120"/>
-      </w:pPr>
-      <w:r>
-        <w:rPr>
-          <w:color w:val="1E3A5F"/>
-        </w:rPr>
-        <w:t>8. E-Learning &amp; LMS Core Architecture</w:t>
-      </w:r>
-    </w:p>
-    <w:p>
-      <w:pPr>
-        <w:pStyle w:val="Heading2"/>
-        <w:spacing w:before="240" w:after="80"/>
-      </w:pPr>
-      <w:r>
-        <w:rPr>
-          <w:color w:val="0D9488"/>
-          <w:sz w:val="23"/>
-        </w:rPr>
-        <w:t>8.1 Hybr</w:t>
-      </w:r>
-      <w:r>
-        <w:rPr>
-          <w:color w:val="0D9488"/>
-          <w:sz w:val="23"/>
-        </w:rPr>
-        <w:t>id Learning Infrastructure</w:t>
+        <w:t>8.1 Hybrid Learning Infrastructure</w:t>
       </w:r>
     </w:p>
     <w:p>
@@ -4916,10 +4447,7 @@
         <w:t>Interactive Scorm/H5P Modules:</w:t>
       </w:r>
       <w:r>
-        <w:t xml:space="preserve"> Interactive accounting exercises, simulated cooperative balance shee</w:t>
-      </w:r>
-      <w:r>
-        <w:t>ts, and inventory ledger balancing.</w:t>
+        <w:t xml:space="preserve"> Interactive accounting exercises, simulated cooperative balance sheets, and inventory ledger balancing.</w:t>
       </w:r>
     </w:p>
     <w:p>
@@ -4949,10 +4477,7 @@
         <w:t>Edge Cache Pre-Seeding:</w:t>
       </w:r>
       <w:r>
-        <w:t xml:space="preserve"> When an Edge Box is assigned a training batch, its background worker aut</w:t>
-      </w:r>
-      <w:r>
-        <w:t>omatically pulls and caches all relevant course lectures, lecture handouts, and assessment banks. Trainees stream video locally at 100+ Mbps over the Edge Box Wi-Fi without consuming mobile data or requiring external internet.</w:t>
+        <w:t xml:space="preserve"> When an Edge Box is assigned a training batch, its background worker automatically pulls and caches all relevant course lectures, lecture handouts, and assessment banks. Trainees stream video locally at 100+ Mbps over the Edge Box Wi-Fi without consuming mobile data or requiring external internet.</w:t>
       </w:r>
     </w:p>
     <w:p>
@@ -4964,13 +4489,7 @@
         <w:rPr>
           <w:color w:val="1E3A5F"/>
         </w:rPr>
-        <w:t>9. Bhashini Voice-First Multi</w:t>
-      </w:r>
-      <w:r>
-        <w:rPr>
-          <w:color w:val="1E3A5F"/>
-        </w:rPr>
-        <w:t>lingual AI Engine</w:t>
+        <w:t>9. Bhashini Voice-First Multilingual AI Engine</w:t>
       </w:r>
     </w:p>
     <w:p>
@@ -4987,10 +4506,7 @@
         <w:t>BHASHINI</w:t>
       </w:r>
       <w:r>
-        <w:t xml:space="preserve"> (National Language Translation Mission) platform</w:t>
-      </w:r>
-      <w:r>
-        <w:t>:</w:t>
+        <w:t xml:space="preserve"> (National Language Translation Mission) platform:</w:t>
       </w:r>
     </w:p>
     <w:tbl>
@@ -5046,7 +4562,7 @@
                 <w:sz w:val="17"/>
               </w:rPr>
               <w:br/>
-              <w:t xml:space="preserve">|                                                                                 </w:t>
+              <w:t>|                                                                                   |</w:t>
             </w:r>
             <w:r>
               <w:rPr>
@@ -5054,7 +4570,8 @@
                 <w:color w:val="0F172A"/>
                 <w:sz w:val="17"/>
               </w:rPr>
-              <w:t xml:space="preserve">  |</w:t>
+              <w:br/>
+              <w:t>|  [ Spoken Rural Dialect ]                                                         |</w:t>
             </w:r>
             <w:r>
               <w:rPr>
@@ -5063,7 +4580,7 @@
                 <w:sz w:val="17"/>
               </w:rPr>
               <w:br/>
-              <w:t>|  [ Spoken Rural Dialect ]                                                         |</w:t>
+              <w:t>|  (Hindi, Marathi, Gujarati, Tamil, Telugu, Kannada, Bengali, Odia)                |</w:t>
             </w:r>
             <w:r>
               <w:rPr>
@@ -5072,7 +4589,7 @@
                 <w:sz w:val="17"/>
               </w:rPr>
               <w:br/>
-              <w:t>|  (Hindi, Marathi, Gujarati, Tamil, Telugu, Kannada, Bengali, Odia)                |</w:t>
+              <w:t>|             |                                                                     |</w:t>
             </w:r>
             <w:r>
               <w:rPr>
@@ -5081,7 +4598,7 @@
                 <w:sz w:val="17"/>
               </w:rPr>
               <w:br/>
-              <w:t xml:space="preserve">|             |                                                                 </w:t>
+              <w:t>|             v                                                                     |</w:t>
             </w:r>
             <w:r>
               <w:rPr>
@@ -5089,7 +4606,8 @@
                 <w:color w:val="0F172A"/>
                 <w:sz w:val="17"/>
               </w:rPr>
-              <w:t xml:space="preserve">    |</w:t>
+              <w:br/>
+              <w:t>|  [ ASR Engine (Automated Speech Recognition) ] ---&gt; Transcribes audio to text     |</w:t>
             </w:r>
             <w:r>
               <w:rPr>
@@ -5098,7 +4616,7 @@
                 <w:sz w:val="17"/>
               </w:rPr>
               <w:br/>
-              <w:t>|             v                                                                     |</w:t>
+              <w:t>|             |                                                                     |</w:t>
             </w:r>
             <w:r>
               <w:rPr>
@@ -5107,7 +4625,7 @@
                 <w:sz w:val="17"/>
               </w:rPr>
               <w:br/>
-              <w:t>|  [ ASR Engine (Automated Speech Recognition) ] ---&gt; Transcribes audio to text     |</w:t>
+              <w:t>|             v                                                                     |</w:t>
             </w:r>
             <w:r>
               <w:rPr>
@@ -5116,7 +4634,7 @@
                 <w:sz w:val="17"/>
               </w:rPr>
               <w:br/>
-              <w:t xml:space="preserve">|             |                                                               </w:t>
+              <w:t>|  [ NMT Translation Core (Machine Translation) ] ---&gt; Converts dialect to English   |</w:t>
             </w:r>
             <w:r>
               <w:rPr>
@@ -5124,7 +4642,8 @@
                 <w:color w:val="0F172A"/>
                 <w:sz w:val="17"/>
               </w:rPr>
-              <w:t xml:space="preserve">      |</w:t>
+              <w:br/>
+              <w:t>|             |                                       query for LMS / ERP API       |</w:t>
             </w:r>
             <w:r>
               <w:rPr>
@@ -5142,7 +4661,7 @@
                 <w:sz w:val="17"/>
               </w:rPr>
               <w:br/>
-              <w:t>|  [ NMT Translation Core (Machine Translation) ] ---&gt; Converts dialect to English   |</w:t>
+              <w:t>|  [ Application Logic Execution ]              ---&gt; Returns factual response / LMS |</w:t>
             </w:r>
             <w:r>
               <w:rPr>
@@ -5151,7 +4670,7 @@
                 <w:sz w:val="17"/>
               </w:rPr>
               <w:br/>
-              <w:t>|             |                                       query for LMS / ERP A</w:t>
+              <w:t>|             |                                       lesson in standard text       |</w:t>
             </w:r>
             <w:r>
               <w:rPr>
@@ -5159,7 +4678,8 @@
                 <w:color w:val="0F172A"/>
                 <w:sz w:val="17"/>
               </w:rPr>
-              <w:t>PI       |</w:t>
+              <w:br/>
+              <w:t>|             v                                                                     |</w:t>
             </w:r>
             <w:r>
               <w:rPr>
@@ -5168,7 +4688,7 @@
                 <w:sz w:val="17"/>
               </w:rPr>
               <w:br/>
-              <w:t>|             v                                                                     |</w:t>
+              <w:t>|  [ Indic TTS Engine (Text-to-Speech) ]        ---&gt; Generates natural audio output |</w:t>
             </w:r>
             <w:r>
               <w:rPr>
@@ -5177,59 +4697,7 @@
                 <w:sz w:val="17"/>
               </w:rPr>
               <w:br/>
-              <w:t>|  [ Application Logic Execution ]              ---&gt; Returns factual response / LMS |</w:t>
-            </w:r>
-            <w:r>
-              <w:rPr>
-                <w:rFonts w:ascii="Consolas" w:hAnsi="Consolas"/>
-                <w:color w:val="0F172A"/>
-                <w:sz w:val="17"/>
-              </w:rPr>
-              <w:br/>
-              <w:t xml:space="preserve">|             |                                       lesson in standard </w:t>
-            </w:r>
-            <w:r>
-              <w:rPr>
-                <w:rFonts w:ascii="Consolas" w:hAnsi="Consolas"/>
-                <w:color w:val="0F172A"/>
-                <w:sz w:val="17"/>
-              </w:rPr>
-              <w:t>text       |</w:t>
-            </w:r>
-            <w:r>
-              <w:rPr>
-                <w:rFonts w:ascii="Consolas" w:hAnsi="Consolas"/>
-                <w:color w:val="0F172A"/>
-                <w:sz w:val="17"/>
-              </w:rPr>
-              <w:br/>
-              <w:t>|             v                                                                     |</w:t>
-            </w:r>
-            <w:r>
-              <w:rPr>
-                <w:rFonts w:ascii="Consolas" w:hAnsi="Consolas"/>
-                <w:color w:val="0F172A"/>
-                <w:sz w:val="17"/>
-              </w:rPr>
-              <w:br/>
-              <w:t>|  [ Indic TTS Engine (Text-to-Speech) ]        ---&gt; Generates natural audio output |</w:t>
-            </w:r>
-            <w:r>
-              <w:rPr>
-                <w:rFonts w:ascii="Consolas" w:hAnsi="Consolas"/>
-                <w:color w:val="0F172A"/>
-                <w:sz w:val="17"/>
-              </w:rPr>
-              <w:br/>
-              <w:t>|                                                     in trainee's nati</w:t>
-            </w:r>
-            <w:r>
-              <w:rPr>
-                <w:rFonts w:ascii="Consolas" w:hAnsi="Consolas"/>
-                <w:color w:val="0F172A"/>
-                <w:sz w:val="17"/>
-              </w:rPr>
-              <w:t>ve dialect   |</w:t>
+              <w:t>|                                                     in trainee's native dialect   |</w:t>
             </w:r>
             <w:r>
               <w:rPr>
@@ -5261,46 +4729,7 @@
         <w:t>Voice-First Navigation:</w:t>
       </w:r>
       <w:r>
-        <w:t xml:space="preserve"> Semi-literate trainees can touch the microphone button and ask questions such as: *"</w:t>
-      </w:r>
-      <w:r>
-        <w:t>माझं</w:t>
-      </w:r>
-      <w:r>
-        <w:t xml:space="preserve"> </w:t>
-      </w:r>
-      <w:r>
-        <w:t>हजेरी</w:t>
-      </w:r>
-      <w:r>
-        <w:t xml:space="preserve"> </w:t>
-      </w:r>
-      <w:r>
-        <w:t>आणि</w:t>
-      </w:r>
-      <w:r>
-        <w:t xml:space="preserve"> </w:t>
-      </w:r>
-      <w:r>
-        <w:t>प्रमाणपत्र</w:t>
-      </w:r>
-      <w:r>
-        <w:t xml:space="preserve"> </w:t>
-      </w:r>
-      <w:r>
-        <w:t>कधी</w:t>
-      </w:r>
-      <w:r>
-        <w:t xml:space="preserve"> </w:t>
-      </w:r>
-      <w:r>
-        <w:t>मिळेल</w:t>
-      </w:r>
-      <w:r>
-        <w:t>?"* (When will my attendance and certificate be generated?); the system processes the request in Marathi and provides both visual and vo</w:t>
-      </w:r>
-      <w:r>
-        <w:t>ice responses.</w:t>
+        <w:t xml:space="preserve"> Semi-literate trainees can touch the microphone button and ask questions such as: *"माझं हजेरी आणि प्रमाणपत्र कधी मिळेल?"* (When will my attendance and certificate be generated?); the system processes the request in Marathi and provides both visual and voice responses.</w:t>
       </w:r>
     </w:p>
     <w:p>
@@ -5327,13 +4756,7 @@
         <w:rPr>
           <w:color w:val="1E3A5F"/>
         </w:rPr>
-        <w:t xml:space="preserve">10. Digital Skill Passport &amp; </w:t>
-      </w:r>
-      <w:r>
-        <w:rPr>
-          <w:color w:val="1E3A5F"/>
-        </w:rPr>
-        <w:t>Cryptographic Credentialing</w:t>
+        <w:t>10. Digital Skill Passport &amp; Cryptographic Credentialing</w:t>
       </w:r>
     </w:p>
     <w:p>
@@ -5360,13 +4783,7 @@
         <w:rPr>
           <w:b/>
         </w:rPr>
-        <w:t>Digital Skill Pass</w:t>
-      </w:r>
-      <w:r>
-        <w:rPr>
-          <w:b/>
-        </w:rPr>
-        <w:t>port</w:t>
+        <w:t>Digital Skill Passport</w:t>
       </w:r>
       <w:r>
         <w:t>.</w:t>
@@ -5425,7 +4842,7 @@
                 <w:sz w:val="17"/>
               </w:rPr>
               <w:br/>
-              <w:t xml:space="preserve">|                                                                             </w:t>
+              <w:t>|                                                                                   |</w:t>
             </w:r>
             <w:r>
               <w:rPr>
@@ -5433,7 +4850,8 @@
                 <w:color w:val="0F172A"/>
                 <w:sz w:val="17"/>
               </w:rPr>
-              <w:t xml:space="preserve">      |</w:t>
+              <w:br/>
+              <w:t>|   +---------------------------------------------------------------------------+   |</w:t>
             </w:r>
             <w:r>
               <w:rPr>
@@ -5442,7 +4860,7 @@
                 <w:sz w:val="17"/>
               </w:rPr>
               <w:br/>
-              <w:t>|   +---------------------------------------------------------------------------+   |</w:t>
+              <w:t>|   |  Header: National Council for Cooperative Training (Ministry of Coop)     |   |</w:t>
             </w:r>
             <w:r>
               <w:rPr>
@@ -5451,7 +4869,7 @@
                 <w:sz w:val="17"/>
               </w:rPr>
               <w:br/>
-              <w:t>|   |  Header: National Council for Cooperative Training (Ministry of Coop)     |   |</w:t>
+              <w:t>|   |  Trainee: Arjun Kumar Verma        | Sahakar ID: SAH-2026-VAM01-001847    |   |</w:t>
             </w:r>
             <w:r>
               <w:rPr>
@@ -5460,7 +4878,7 @@
                 <w:sz w:val="17"/>
               </w:rPr>
               <w:br/>
-              <w:t>|   |  Trainee: Arjun Kumar Verma        | Sahakar ID: SAH-2026-VAM01-001847</w:t>
+              <w:t>|   |  Programme: Management Development for PACS Operations (Grade A+)          |   |</w:t>
             </w:r>
             <w:r>
               <w:rPr>
@@ -5468,7 +4886,8 @@
                 <w:color w:val="0F172A"/>
                 <w:sz w:val="17"/>
               </w:rPr>
-              <w:t xml:space="preserve">    |   |</w:t>
+              <w:br/>
+              <w:t>|   +---------------------------------------------------------------------------+   |</w:t>
             </w:r>
             <w:r>
               <w:rPr>
@@ -5477,7 +4896,7 @@
                 <w:sz w:val="17"/>
               </w:rPr>
               <w:br/>
-              <w:t>|   |  Programme: Management Development for PACS Operations (Grade A+)          |   |</w:t>
+              <w:t>|   |  VERIFIED ROLE-READINESS BENCHMARKS                                       |   |</w:t>
             </w:r>
             <w:r>
               <w:rPr>
@@ -5486,7 +4905,7 @@
                 <w:sz w:val="17"/>
               </w:rPr>
               <w:br/>
-              <w:t>|   +---------------------------------------------------------------------------+   |</w:t>
+              <w:t>|   |  [x] PACS Day-End Balance Sheet &amp; Ledger Entry (Score: 94%)               |   |</w:t>
             </w:r>
             <w:r>
               <w:rPr>
@@ -5495,7 +4914,7 @@
                 <w:sz w:val="17"/>
               </w:rPr>
               <w:br/>
-              <w:t xml:space="preserve">|   |  VERIFIED ROLE-READINESS BENCHMARKS                                </w:t>
+              <w:t>|   |  [x] Tally ERP &amp; Core Banking Software Operations (Score: 88%)            |   |</w:t>
             </w:r>
             <w:r>
               <w:rPr>
@@ -5503,7 +4922,8 @@
                 <w:color w:val="0F172A"/>
                 <w:sz w:val="17"/>
               </w:rPr>
-              <w:t xml:space="preserve">       |   |</w:t>
+              <w:br/>
+              <w:t>|   |  [x] Statutory Cooperative Audit &amp; NPA Classification (Score: 82%)        |   |</w:t>
             </w:r>
             <w:r>
               <w:rPr>
@@ -5512,7 +4932,7 @@
                 <w:sz w:val="17"/>
               </w:rPr>
               <w:br/>
-              <w:t>|   |  [x] PACS Day-End Balance Sheet &amp; Ledger Entry (Score: 94%)               |   |</w:t>
+              <w:t>|   |  [x] Cold Storage &amp; Agri-Inventory Management (Score: 78%)                |   |</w:t>
             </w:r>
             <w:r>
               <w:rPr>
@@ -5521,7 +4941,7 @@
                 <w:sz w:val="17"/>
               </w:rPr>
               <w:br/>
-              <w:t>|   |  [x] Tally ERP &amp; Core Banking Software Operations (Score: 88%)            |   |</w:t>
+              <w:t>|   +---------------------------------------------------------------------------+   |</w:t>
             </w:r>
             <w:r>
               <w:rPr>
@@ -5530,7 +4950,7 @@
                 <w:sz w:val="17"/>
               </w:rPr>
               <w:br/>
-              <w:t>|   |  [x] Statutory Cooperative Audit &amp; NPA Classification (Score: 82%</w:t>
+              <w:t>|   |  Cryptographic Signature: HMAC-SHA256(Record + PrivateKey)                |   |</w:t>
             </w:r>
             <w:r>
               <w:rPr>
@@ -5538,7 +4958,8 @@
                 <w:color w:val="0F172A"/>
                 <w:sz w:val="17"/>
               </w:rPr>
-              <w:t>)        |   |</w:t>
+              <w:br/>
+              <w:t>|   |  Public Verification QR: https://sahakarsetu.gov.in/verify/CERT-1847      |   |</w:t>
             </w:r>
             <w:r>
               <w:rPr>
@@ -5547,7 +4968,7 @@
                 <w:sz w:val="17"/>
               </w:rPr>
               <w:br/>
-              <w:t>|   |  [x] Cold Storage &amp; Agri-Inventory Management (Score: 78%)                |   |</w:t>
+              <w:t>|   +---------------------------------------------------------------------------+   |</w:t>
             </w:r>
             <w:r>
               <w:rPr>
@@ -5556,59 +4977,7 @@
                 <w:sz w:val="17"/>
               </w:rPr>
               <w:br/>
-              <w:t>|   +---------------------------------------------------------------------------+   |</w:t>
-            </w:r>
-            <w:r>
-              <w:rPr>
-                <w:rFonts w:ascii="Consolas" w:hAnsi="Consolas"/>
-                <w:color w:val="0F172A"/>
-                <w:sz w:val="17"/>
-              </w:rPr>
-              <w:br/>
-              <w:t xml:space="preserve">|   |  Cryptographic Signature: HMAC-SHA256(Record + PrivateKey)     </w:t>
-            </w:r>
-            <w:r>
-              <w:rPr>
-                <w:rFonts w:ascii="Consolas" w:hAnsi="Consolas"/>
-                <w:color w:val="0F172A"/>
-                <w:sz w:val="17"/>
-              </w:rPr>
-              <w:t xml:space="preserve">           |   |</w:t>
-            </w:r>
-            <w:r>
-              <w:rPr>
-                <w:rFonts w:ascii="Consolas" w:hAnsi="Consolas"/>
-                <w:color w:val="0F172A"/>
-                <w:sz w:val="17"/>
-              </w:rPr>
-              <w:br/>
-              <w:t>|   |  Public Verification QR: https://sahakarsetu.gov.in/verify/CERT-1847      |   |</w:t>
-            </w:r>
-            <w:r>
-              <w:rPr>
-                <w:rFonts w:ascii="Consolas" w:hAnsi="Consolas"/>
-                <w:color w:val="0F172A"/>
-                <w:sz w:val="17"/>
-              </w:rPr>
-              <w:br/>
-              <w:t>|   +---------------------------------------------------------------------------+   |</w:t>
-            </w:r>
-            <w:r>
-              <w:rPr>
-                <w:rFonts w:ascii="Consolas" w:hAnsi="Consolas"/>
-                <w:color w:val="0F172A"/>
-                <w:sz w:val="17"/>
-              </w:rPr>
-              <w:br/>
-              <w:t>+------------------------------------------------------------------</w:t>
-            </w:r>
-            <w:r>
-              <w:rPr>
-                <w:rFonts w:ascii="Consolas" w:hAnsi="Consolas"/>
-                <w:color w:val="0F172A"/>
-                <w:sz w:val="17"/>
-              </w:rPr>
-              <w:t>-----------------+</w:t>
+              <w:t>+-----------------------------------------------------------------------------------+</w:t>
             </w:r>
           </w:p>
         </w:tc>
@@ -5646,10 +5015,7 @@
         <w:t>Signature Generation:</w:t>
       </w:r>
       <w:r>
-        <w:t xml:space="preserve"> The certificate payload (Trainee ID, Institute ID, Programme ID, Issued Date, Grade, Competency Hashes) is signed using an HMAC-SHA256 signature with the central NCCT pr</w:t>
-      </w:r>
-      <w:r>
-        <w:t>ivate key.</w:t>
+        <w:t xml:space="preserve"> The certificate payload (Trainee ID, Institute ID, Programme ID, Issued Date, Grade, Competency Hashes) is signed using an HMAC-SHA256 signature with the central NCCT private key.</w:t>
       </w:r>
     </w:p>
     <w:p>
@@ -5683,10 +5049,7 @@
         <w:t>Zero-Trust Independent Verification:</w:t>
       </w:r>
       <w:r>
-        <w:t xml:space="preserve"> Any cooperative bank, dairy federation recruiter, or auditor can scan the QR co</w:t>
-      </w:r>
-      <w:r>
-        <w:t>de using any standard smartphone camera. The system fetches the immutable ledger record from `/verify/&lt;id&gt;`, instantly confirming validity, preventing forgery, and displaying full competency ratings.</w:t>
+        <w:t xml:space="preserve"> Any cooperative bank, dairy federation recruiter, or auditor can scan the QR code using any standard smartphone camera. The system fetches the immutable ledger record from `/verify/&lt;id&gt;`, instantly confirming validity, preventing forgery, and displaying full competency ratings.</w:t>
       </w:r>
     </w:p>
     <w:p>
@@ -5711,14 +5074,7 @@
           <w:color w:val="0D9488"/>
           <w:sz w:val="23"/>
         </w:rPr>
-        <w:t>11.</w:t>
-      </w:r>
-      <w:r>
-        <w:rPr>
-          <w:color w:val="0D9488"/>
-          <w:sz w:val="23"/>
-        </w:rPr>
-        <w:t>1 Taxonomy &amp; Skill Graph Design</w:t>
+        <w:t>11.1 Taxonomy &amp; Skill Graph Design</w:t>
       </w:r>
     </w:p>
     <w:p>
@@ -5753,10 +5109,7 @@
         <w:t>O\*NET 31.0</w:t>
       </w:r>
       <w:r>
-        <w:t>, adapted specifically for</w:t>
-      </w:r>
-      <w:r>
-        <w:t xml:space="preserve"> the Indian cooperative sector:</w:t>
+        <w:t>, adapted specifically for the Indian cooperative sector:</w:t>
       </w:r>
     </w:p>
     <w:tbl>
@@ -5830,6 +5183,7 @@
                 <w:sz w:val="17"/>
               </w:rPr>
               <w:br/>
+              <w:t xml:space="preserve">         v                                                       v</w:t>
             </w:r>
             <w:r>
               <w:rPr>
@@ -5837,7 +5191,8 @@
                 <w:color w:val="0F172A"/>
                 <w:sz w:val="17"/>
               </w:rPr>
-              <w:t xml:space="preserve">         v                                                       v</w:t>
+              <w:br/>
+              <w:t xml:space="preserve">  [ PACS Computerization ]                               [ Dairy Cooperatives ]</w:t>
             </w:r>
             <w:r>
               <w:rPr>
@@ -5846,7 +5201,7 @@
                 <w:sz w:val="17"/>
               </w:rPr>
               <w:br/>
-              <w:t xml:space="preserve">  [ PACS Computerization ]                               [ Dairy Cooperatives ]</w:t>
+              <w:t xml:space="preserve">         |                                                       |</w:t>
             </w:r>
             <w:r>
               <w:rPr>
@@ -5855,7 +5210,7 @@
                 <w:sz w:val="17"/>
               </w:rPr>
               <w:br/>
-              <w:t xml:space="preserve">         |                                                       |</w:t>
+              <w:t xml:space="preserve">         v                                                       v</w:t>
             </w:r>
             <w:r>
               <w:rPr>
@@ -5864,7 +5219,7 @@
                 <w:sz w:val="17"/>
               </w:rPr>
               <w:br/>
-              <w:t xml:space="preserve">         v                                </w:t>
+              <w:t xml:space="preserve">  [ Role: PACS Secretary ]                               [ Role: Dairy Supervisor ]</w:t>
             </w:r>
             <w:r>
               <w:rPr>
@@ -5872,7 +5227,8 @@
                 <w:color w:val="0F172A"/>
                 <w:sz w:val="17"/>
               </w:rPr>
-              <w:t xml:space="preserve">                       v</w:t>
+              <w:br/>
+              <w:t xml:space="preserve">         |                                                       |</w:t>
             </w:r>
             <w:r>
               <w:rPr>
@@ -5881,7 +5237,7 @@
                 <w:sz w:val="17"/>
               </w:rPr>
               <w:br/>
-              <w:t xml:space="preserve">  [ Role: PACS Secretary ]                               [ Role: Dairy Supervisor ]</w:t>
+              <w:t xml:space="preserve">         +--&gt; PACS Double-Entry Bookkeeping                      +--&gt; Cold Chain Storage</w:t>
             </w:r>
             <w:r>
               <w:rPr>
@@ -5890,7 +5246,7 @@
                 <w:sz w:val="17"/>
               </w:rPr>
               <w:br/>
-              <w:t xml:space="preserve">         |                                                       |</w:t>
+              <w:t xml:space="preserve">         +--&gt; Tally ERP Day Book Balancing                       +--&gt; Milk Fat / SNF Testing</w:t>
             </w:r>
             <w:r>
               <w:rPr>
@@ -5899,7 +5255,7 @@
                 <w:sz w:val="17"/>
               </w:rPr>
               <w:br/>
-              <w:t xml:space="preserve">         +--&gt; PACS Double-Entry Bookkeeping                      +--&gt; Cold Chain</w:t>
+              <w:t xml:space="preserve">         +--&gt; Model Bye-laws Governance                          +--&gt; Cooperative Inventory</w:t>
             </w:r>
             <w:r>
               <w:rPr>
@@ -5907,42 +5263,8 @@
                 <w:color w:val="0F172A"/>
                 <w:sz w:val="17"/>
               </w:rPr>
-              <w:t xml:space="preserve"> Storage</w:t>
-            </w:r>
-            <w:r>
-              <w:rPr>
-                <w:rFonts w:ascii="Consolas" w:hAnsi="Consolas"/>
-                <w:color w:val="0F172A"/>
-                <w:sz w:val="17"/>
-              </w:rPr>
               <w:br/>
-              <w:t xml:space="preserve">         +--&gt; Tally ERP Day Book Balancing                       +--&gt; Milk Fat / SNF Testing</w:t>
-            </w:r>
-            <w:r>
-              <w:rPr>
-                <w:rFonts w:ascii="Consolas" w:hAnsi="Consolas"/>
-                <w:color w:val="0F172A"/>
-                <w:sz w:val="17"/>
-              </w:rPr>
-              <w:br/>
-              <w:t xml:space="preserve">         +--&gt; Model Bye-laws Governance                          +--&gt; Cooperative Inventory</w:t>
-            </w:r>
-            <w:r>
-              <w:rPr>
-                <w:rFonts w:ascii="Consolas" w:hAnsi="Consolas"/>
-                <w:color w:val="0F172A"/>
-                <w:sz w:val="17"/>
-              </w:rPr>
-              <w:br/>
-              <w:t xml:space="preserve">         +--&gt; Agri-Credit Loan Sanctioning                    </w:t>
-            </w:r>
-            <w:r>
-              <w:rPr>
-                <w:rFonts w:ascii="Consolas" w:hAnsi="Consolas"/>
-                <w:color w:val="0F172A"/>
-                <w:sz w:val="17"/>
-              </w:rPr>
-              <w:t xml:space="preserve">   +--&gt; BMC Center Logistics</w:t>
+              <w:t xml:space="preserve">         +--&gt; Agri-Credit Loan Sanctioning                       +--&gt; BMC Center Logistics</w:t>
             </w:r>
           </w:p>
         </w:tc>
@@ -5998,14 +5320,7 @@
           <w:rFonts w:ascii="Cambria Math" w:hAnsi="Cambria Math"/>
           <w:i/>
         </w:rPr>
-        <w:t>\Delta_{\text{</w:t>
-      </w:r>
-      <w:r>
-        <w:rPr>
-          <w:rFonts w:ascii="Cambria Math" w:hAnsi="Cambria Math"/>
-          <w:i/>
-        </w:rPr>
-        <w:t>skills}}</w:t>
+        <w:t>\Delta_{\text{skills}}</w:t>
       </w:r>
       <w:r>
         <w:t>: Jaccard similarity between certified competencies and required job skills.</w:t>
@@ -6059,14 +5374,7 @@
           <w:rFonts w:ascii="Cambria Math" w:hAnsi="Cambria Math"/>
           <w:i/>
         </w:rPr>
-        <w:t>D_{\te</w:t>
-      </w:r>
-      <w:r>
-        <w:rPr>
-          <w:rFonts w:ascii="Cambria Math" w:hAnsi="Cambria Math"/>
-          <w:i/>
-        </w:rPr>
-        <w:t>xt{geo}}</w:t>
+        <w:t>D_{\text{geo}}</w:t>
       </w:r>
       <w:r>
         <w:t>: Haversine geographical distance between candidate district and cooperative posting location.</w:t>
@@ -6111,10 +5419,7 @@
         <w:t>XGBoost</w:t>
       </w:r>
       <w:r>
-        <w:t xml:space="preserve"> with th</w:t>
-      </w:r>
-      <w:r>
-        <w:t>e `rank:ndcg` (Normalized Discounted Cumulative Gain) objective function over 22,000+ benchmarked candidate-job pairs:</w:t>
+        <w:t xml:space="preserve"> with the `rank:ndcg` (Normalized Discounted Cumulative Gain) objective function over 22,000+ benchmarked candidate-job pairs:</w:t>
       </w:r>
     </w:p>
     <w:p>
@@ -6122,7 +5427,7 @@
         <w:spacing w:before="60" w:after="100"/>
       </w:pPr>
       <w:r>
-        <w:t>\text{NDCG}@k = \frac{\text{DCG}@k}{\text{IDCG}@k}, \quad \text{where } \text{DCG}@k = \sum_{i=1}^k \frac{2^{rel_i} - 1}{\log_2(i + 1)}</w:t>
+        <w:t>The matching engine ranks candidates using certified skill similarity, assessment performance, attendance consistency, location and language compatibility.</w:t>
       </w:r>
     </w:p>
     <w:p>
@@ -6134,19 +5439,10 @@
         <w:rPr>
           <w:b/>
         </w:rPr>
-        <w:t>O</w:t>
-      </w:r>
-      <w:r>
-        <w:rPr>
-          <w:b/>
-        </w:rPr>
-        <w:t>utcome Feedback Loop:</w:t>
-      </w:r>
-      <w:r>
-        <w:t xml:space="preserve"> As cooperative employers shortlist, interview, hire, or reject candidates, outcomes are fed back into the system. This data directly informs NCCT administrators which skills are in deficit, driving automated recommendations for next q</w:t>
-      </w:r>
-      <w:r>
-        <w:t>uarter's training programmes.</w:t>
+        <w:t>Outcome Feedback Loop:</w:t>
+      </w:r>
+      <w:r>
+        <w:t xml:space="preserve"> As cooperative employers shortlist, interview, hire, or reject candidates, outcomes are fed back into the system. This data directly informs NCCT administrators which skills are in deficit, driving automated recommendations for next quarter's training programmes.</w:t>
       </w:r>
     </w:p>
     <w:p>
@@ -6189,16 +5485,27 @@
         <w:rPr>
           <w:b/>
         </w:rPr>
-        <w:t xml:space="preserve">Curated Document </w:t>
+        <w:t>Curated Document Corpus:</w:t>
+      </w:r>
+      <w:r>
+        <w:t xml:space="preserve"> Ingests official documentation including the National Cooperation Policy 2025, Model Bye-laws for PACS, RBI guidelines for Rural Cooperative Banks, NCCT curriculum handbooks, and government subsidy schemes (NABARD, NCDC).</w:t>
+      </w:r>
+    </w:p>
+    <w:p>
+      <w:pPr>
+        <w:spacing w:before="60" w:after="100"/>
+      </w:pPr>
+      <w:r>
+        <w:t xml:space="preserve">2. </w:t>
       </w:r>
       <w:r>
         <w:rPr>
           <w:b/>
         </w:rPr>
-        <w:t>Corpus:</w:t>
-      </w:r>
-      <w:r>
-        <w:t xml:space="preserve"> Ingests official documentation including the National Cooperation Policy 2025, Model Bye-laws for PACS, RBI guidelines for Rural Cooperative Banks, NCCT curriculum handbooks, and government subsidy schemes (NABARD, NCDC).</w:t>
+        <w:t>Vector Embeddings &amp; Storage:</w:t>
+      </w:r>
+      <w:r>
+        <w:t xml:space="preserve"> Text chunks (512 tokens with 10% overlap) are embedded using `text-embedding-3-small` / open multilingual embeddings and indexed into PostgreSQL using `pgvector` with HNSW (Hierarchical Navigable Small World) indexing.</w:t>
       </w:r>
     </w:p>
     <w:p>
@@ -6206,42 +5513,13 @@
         <w:spacing w:before="60" w:after="100"/>
       </w:pPr>
       <w:r>
-        <w:t xml:space="preserve">2. </w:t>
+        <w:t xml:space="preserve">3. </w:t>
       </w:r>
       <w:r>
         <w:rPr>
           <w:b/>
         </w:rPr>
-        <w:t>Vector Embeddings &amp; Sto</w:t>
-      </w:r>
-      <w:r>
-        <w:rPr>
-          <w:b/>
-        </w:rPr>
-        <w:t>rage:</w:t>
-      </w:r>
-      <w:r>
-        <w:t xml:space="preserve"> Text chunks (512 tokens with 10% overlap) are embedded using `text-embedding-3-small` / open multilingual embeddings and indexed into PostgreSQL using `pgvector` with HNSW (Hierarchical Navigable Small World) indexing.</w:t>
-      </w:r>
-    </w:p>
-    <w:p>
-      <w:pPr>
-        <w:spacing w:before="60" w:after="100"/>
-      </w:pPr>
-      <w:r>
-        <w:t xml:space="preserve">3. </w:t>
-      </w:r>
-      <w:r>
-        <w:rPr>
-          <w:b/>
-        </w:rPr>
-        <w:t xml:space="preserve">Grounded Generation with </w:t>
-      </w:r>
-      <w:r>
-        <w:rPr>
-          <w:b/>
-        </w:rPr>
-        <w:t>Guardrails:</w:t>
+        <w:t>Grounded Generation with Guardrails:</w:t>
       </w:r>
       <w:r>
         <w:t xml:space="preserve"> When a user queries: *"PACS secretary eligibility criteria kya hai?"*, the RAG pipeline retrieves the top-5 relevant sections and synthesizes an authoritative, hallucination-free response with explicit citations to official Ministry documents.</w:t>
@@ -6279,10 +5557,7 @@
         <w:t>Nomination &amp; Batch Management:</w:t>
       </w:r>
       <w:r>
-        <w:t xml:space="preserve"> Sponsoring cooperative societies submit employee nominations; institute directors approve seats;</w:t>
-      </w:r>
-      <w:r>
-        <w:t xml:space="preserve"> automated waitlists fill vacancies upon cancellations.</w:t>
+        <w:t xml:space="preserve"> Sponsoring cooperative societies submit employee nominations; institute directors approve seats; automated waitlists fill vacancies upon cancellations.</w:t>
       </w:r>
     </w:p>
     <w:p>
@@ -6312,10 +5587,7 @@
         <w:t>Hostel &amp; Residential Accommodation:</w:t>
       </w:r>
       <w:r>
-        <w:t xml:space="preserve"> Real-time bed </w:t>
-      </w:r>
-      <w:r>
-        <w:t>occupancy tracker across male/female blocks, automating check-in, check-out, and dietary preference logging for outstation trainees.</w:t>
+        <w:t xml:space="preserve"> Real-time bed occupancy tracker across male/female blocks, automating check-in, check-out, and dietary preference logging for outstation trainees.</w:t>
       </w:r>
     </w:p>
     <w:p>
@@ -6330,10 +5602,7 @@
         <w:t>Training Kit &amp; Book Logistics:</w:t>
       </w:r>
       <w:r>
-        <w:t xml:space="preserve"> Dispatches of educational tablets, books, and laboratory kits tracked via consignment IDs wi</w:t>
-      </w:r>
-      <w:r>
-        <w:t>th real-time transit status updates.</w:t>
+        <w:t xml:space="preserve"> Dispatches of educational tablets, books, and laboratory kits tracked via consignment IDs with real-time transit status updates.</w:t>
       </w:r>
     </w:p>
     <w:p>
@@ -6391,7 +5660,7 @@
                 <w:color w:val="0F172A"/>
                 <w:sz w:val="17"/>
               </w:rPr>
-              <w:t>+--------------------+       +--------------------+       +--</w:t>
+              <w:t>+--------------------+       +--------------------+       +--------------------+</w:t>
             </w:r>
             <w:r>
               <w:rPr>
@@ -6399,7 +5668,8 @@
                 <w:color w:val="0F172A"/>
                 <w:sz w:val="17"/>
               </w:rPr>
-              <w:t>------------------+</w:t>
+              <w:br/>
+              <w:t>|    INSTITUTES      |       |     PROGRAMMES     |       |    TIMETABLES      |</w:t>
             </w:r>
             <w:r>
               <w:rPr>
@@ -6408,7 +5678,7 @@
                 <w:sz w:val="17"/>
               </w:rPr>
               <w:br/>
-              <w:t>|    INSTITUTES      |       |     PROGRAMMES     |       |    TIMETABLES      |</w:t>
+              <w:t>|--------------------|       |--------------------|       |--------------------|</w:t>
             </w:r>
             <w:r>
               <w:rPr>
@@ -6417,7 +5687,7 @@
                 <w:sz w:val="17"/>
               </w:rPr>
               <w:br/>
-              <w:t>|--------------------|       |--------------------|       |--------------------|</w:t>
+              <w:t>| id (PK)            |&lt;--+   | id (PK)            |&lt;--+   | id (PK)            |</w:t>
             </w:r>
             <w:r>
               <w:rPr>
@@ -6426,7 +5696,7 @@
                 <w:sz w:val="17"/>
               </w:rPr>
               <w:br/>
-              <w:t xml:space="preserve">| id (PK)            |&lt;--+   | id (PK)            |&lt;--+   | id (PK)       </w:t>
+              <w:t>| name               |   +---| institute_id (FK)  |   +---| programme_id (FK)  |</w:t>
             </w:r>
             <w:r>
               <w:rPr>
@@ -6434,7 +5704,8 @@
                 <w:color w:val="0F172A"/>
                 <w:sz w:val="17"/>
               </w:rPr>
-              <w:t xml:space="preserve">     |</w:t>
+              <w:br/>
+              <w:t>| code               |   |   | title              |   |   | trainer_id (FK)    |</w:t>
             </w:r>
             <w:r>
               <w:rPr>
@@ -6443,7 +5714,7 @@
                 <w:sz w:val="17"/>
               </w:rPr>
               <w:br/>
-              <w:t>| name               |   +---| institute_id (FK)  |   +---| programme_id (FK)  |</w:t>
+              <w:t>| state, district    |   |   | start_date         |   |   | room_number        |</w:t>
             </w:r>
             <w:r>
               <w:rPr>
@@ -6452,7 +5723,7 @@
                 <w:sz w:val="17"/>
               </w:rPr>
               <w:br/>
-              <w:t>| code               |   |   | title              |   |   | trainer_id (FK)    |</w:t>
+              <w:t>| edge_device_id     |   |   | capacity           |   |   | time_slot          |</w:t>
             </w:r>
             <w:r>
               <w:rPr>
@@ -6461,7 +5732,7 @@
                 <w:sz w:val="17"/>
               </w:rPr>
               <w:br/>
-              <w:t>| state, district    |   |   | start_date         |   |   | room_number        |</w:t>
+              <w:t>+--------------------+   |   | cutoff_score       |   |   +--------------------+</w:t>
             </w:r>
             <w:r>
               <w:rPr>
@@ -6470,7 +5741,7 @@
                 <w:sz w:val="17"/>
               </w:rPr>
               <w:br/>
-              <w:t>| edge</w:t>
+              <w:t xml:space="preserve">                         |   +--------------------+   |</w:t>
             </w:r>
             <w:r>
               <w:rPr>
@@ -6478,7 +5749,8 @@
                 <w:color w:val="0F172A"/>
                 <w:sz w:val="17"/>
               </w:rPr>
-              <w:t>_device_id     |   |   | capacity           |   |   | time_slot          |</w:t>
+              <w:br/>
+              <w:t>+--------------------+   |                            |   +--------------------+</w:t>
             </w:r>
             <w:r>
               <w:rPr>
@@ -6487,7 +5759,7 @@
                 <w:sz w:val="17"/>
               </w:rPr>
               <w:br/>
-              <w:t>+--------------------+   |   | cutoff_score       |   |   +--------------------+</w:t>
+              <w:t>|     TRAINERS       |   |                            |   |   HOSTEL_ROOMS     |</w:t>
             </w:r>
             <w:r>
               <w:rPr>
@@ -6496,7 +5768,7 @@
                 <w:sz w:val="17"/>
               </w:rPr>
               <w:br/>
-              <w:t xml:space="preserve">                         |   +--------------------+   |</w:t>
+              <w:t>|--------------------|   |                            |   |--------------------|</w:t>
             </w:r>
             <w:r>
               <w:rPr>
@@ -6505,7 +5777,7 @@
                 <w:sz w:val="17"/>
               </w:rPr>
               <w:br/>
-              <w:t xml:space="preserve">+--------------------+   |                  </w:t>
+              <w:t>| id (PK)            |   |                            |   | id (PK)            |</w:t>
             </w:r>
             <w:r>
               <w:rPr>
@@ -6513,7 +5785,8 @@
                 <w:color w:val="0F172A"/>
                 <w:sz w:val="17"/>
               </w:rPr>
-              <w:t xml:space="preserve">          |   +--------------------+</w:t>
+              <w:br/>
+              <w:t>| institute_id (FK)  |---+                            +---| block_id (FK)      |</w:t>
             </w:r>
             <w:r>
               <w:rPr>
@@ -6522,7 +5795,7 @@
                 <w:sz w:val="17"/>
               </w:rPr>
               <w:br/>
-              <w:t>|     TRAINERS       |   |                            |   |   HOSTEL_ROOMS     |</w:t>
+              <w:t>| name, designation  |                                |   | room_number        |</w:t>
             </w:r>
             <w:r>
               <w:rPr>
@@ -6531,7 +5804,7 @@
                 <w:sz w:val="17"/>
               </w:rPr>
               <w:br/>
-              <w:t>|--------------------|   |                            |   |--------------------|</w:t>
+              <w:t>| specialization     |                                |   | capacity, occupied |</w:t>
             </w:r>
             <w:r>
               <w:rPr>
@@ -6540,7 +5813,7 @@
                 <w:sz w:val="17"/>
               </w:rPr>
               <w:br/>
-              <w:t xml:space="preserve">| id (PK)            |   |                            |  </w:t>
+              <w:t>+--------------------+                                |   +--------------------+</w:t>
             </w:r>
             <w:r>
               <w:rPr>
@@ -6548,7 +5821,8 @@
                 <w:color w:val="0F172A"/>
                 <w:sz w:val="17"/>
               </w:rPr>
-              <w:t xml:space="preserve"> | id (PK)            |</w:t>
+              <w:br/>
+              <w:t xml:space="preserve">                                                      |</w:t>
             </w:r>
             <w:r>
               <w:rPr>
@@ -6557,7 +5831,7 @@
                 <w:sz w:val="17"/>
               </w:rPr>
               <w:br/>
-              <w:t>| institute_id (FK)  |---+                            +---| block_id (FK)      |</w:t>
+              <w:t>+--------------------+       +--------------------+   |   +--------------------+</w:t>
             </w:r>
             <w:r>
               <w:rPr>
@@ -6566,7 +5840,7 @@
                 <w:sz w:val="17"/>
               </w:rPr>
               <w:br/>
-              <w:t>| name, designation  |                                |   | room_number        |</w:t>
+              <w:t>|     TRAINEES       |       |  ENROLLMENTS       |   |   |    SYNC_EVENTS     |</w:t>
             </w:r>
             <w:r>
               <w:rPr>
@@ -6575,7 +5849,7 @@
                 <w:sz w:val="17"/>
               </w:rPr>
               <w:br/>
-              <w:t xml:space="preserve">| specialization     |                                |   | capacity, </w:t>
+              <w:t>|--------------------|       |--------------------|   |   |--------------------|</w:t>
             </w:r>
             <w:r>
               <w:rPr>
@@ -6583,7 +5857,8 @@
                 <w:color w:val="0F172A"/>
                 <w:sz w:val="17"/>
               </w:rPr>
-              <w:t>occupied |</w:t>
+              <w:br/>
+              <w:t>| id (PK, SahakarID) |&lt;--+   | id (PK)            |   |   | id (PK, UUID)      |</w:t>
             </w:r>
             <w:r>
               <w:rPr>
@@ -6592,7 +5867,7 @@
                 <w:sz w:val="17"/>
               </w:rPr>
               <w:br/>
-              <w:t>+--------------------+                                |   +--------------------+</w:t>
+              <w:t>| name, email, phone |   +---| trainee_id (FK)    |   |   | edge_device_id     |</w:t>
             </w:r>
             <w:r>
               <w:rPr>
@@ -6601,7 +5876,7 @@
                 <w:sz w:val="17"/>
               </w:rPr>
               <w:br/>
-              <w:t xml:space="preserve">                                                      |</w:t>
+              <w:t>| cooperative_name   |   |   | programme_id (FK)  |---+   | event_type         |</w:t>
             </w:r>
             <w:r>
               <w:rPr>
@@ -6610,7 +5885,7 @@
                 <w:sz w:val="17"/>
               </w:rPr>
               <w:br/>
-              <w:t>+--------------------+       +--------------------+   |   +--------------------+</w:t>
+              <w:t>| face_vector (Enc)  |   |   | attendance_pct     |       | payload (JSONB)    |</w:t>
             </w:r>
             <w:r>
               <w:rPr>
@@ -6619,7 +5894,7 @@
                 <w:sz w:val="17"/>
               </w:rPr>
               <w:br/>
-              <w:t xml:space="preserve">|     TRAINEES       |     </w:t>
+              <w:t>| created_at         |   |   | assessment_score   |       | timestamp          |</w:t>
             </w:r>
             <w:r>
               <w:rPr>
@@ -6627,7 +5902,8 @@
                 <w:color w:val="0F172A"/>
                 <w:sz w:val="17"/>
               </w:rPr>
-              <w:t xml:space="preserve">  |  ENROLLMENTS       |   |   |    SYNC_EVENTS     |</w:t>
+              <w:br/>
+              <w:t>+--------------------+   |   | status             |       | status (synced)    |</w:t>
             </w:r>
             <w:r>
               <w:rPr>
@@ -6636,7 +5912,7 @@
                 <w:sz w:val="17"/>
               </w:rPr>
               <w:br/>
-              <w:t>|--------------------|       |--------------------|   |   |--------------------|</w:t>
+              <w:t xml:space="preserve">                         |   +--------------------+       +--------------------+</w:t>
             </w:r>
             <w:r>
               <w:rPr>
@@ -6645,7 +5921,7 @@
                 <w:sz w:val="17"/>
               </w:rPr>
               <w:br/>
-              <w:t>| id (PK, SahakarID) |&lt;--+   | id (PK)            |   |   | id (PK, UUID)      |</w:t>
+              <w:t>+--------------------+   |</w:t>
             </w:r>
             <w:r>
               <w:rPr>
@@ -6654,7 +5930,7 @@
                 <w:sz w:val="17"/>
               </w:rPr>
               <w:br/>
-              <w:t>| name, email, phone |   +---| trainee_i</w:t>
+              <w:t>|   CERTIFICATES     |   |   +--------------------+       +--------------------+</w:t>
             </w:r>
             <w:r>
               <w:rPr>
@@ -6662,7 +5938,8 @@
                 <w:color w:val="0F172A"/>
                 <w:sz w:val="17"/>
               </w:rPr>
-              <w:t>d (FK)    |   |   | edge_device_id     |</w:t>
+              <w:br/>
+              <w:t>|--------------------|   |   |       JOBS         |       |  JOB_APPLICATIONS  |</w:t>
             </w:r>
             <w:r>
               <w:rPr>
@@ -6671,7 +5948,7 @@
                 <w:sz w:val="17"/>
               </w:rPr>
               <w:br/>
-              <w:t>| cooperative_name   |   |   | programme_id (FK)  |---+   | event_type         |</w:t>
+              <w:t>| id (PK, CertID)    |   |   |--------------------|       |--------------------|</w:t>
             </w:r>
             <w:r>
               <w:rPr>
@@ -6680,7 +5957,7 @@
                 <w:sz w:val="17"/>
               </w:rPr>
               <w:br/>
-              <w:t>| face_vector (Enc)  |   |   | attendance_pct     |       | payload (JSONB)    |</w:t>
+              <w:t>| trainee_id (FK)    |---+   | id (PK)            |&lt;--+   | id (PK)            |</w:t>
             </w:r>
             <w:r>
               <w:rPr>
@@ -6689,7 +5966,7 @@
                 <w:sz w:val="17"/>
               </w:rPr>
               <w:br/>
-              <w:t xml:space="preserve">| created_at         |   |   | assessment_score   |  </w:t>
+              <w:t>| programme_id (FK)  |       | employer_name      |   +---| job_id (FK)        |</w:t>
             </w:r>
             <w:r>
               <w:rPr>
@@ -6697,7 +5974,8 @@
                 <w:color w:val="0F172A"/>
                 <w:sz w:val="17"/>
               </w:rPr>
-              <w:t xml:space="preserve">     | timestamp          |</w:t>
+              <w:br/>
+              <w:t>| issued_date        |       | title, location    |   |   | trainee_id (FK)    |</w:t>
             </w:r>
             <w:r>
               <w:rPr>
@@ -6706,112 +5984,7 @@
                 <w:sz w:val="17"/>
               </w:rPr>
               <w:br/>
-              <w:t>+--------------------+   |   | status             |       | status (synced)    |</w:t>
-            </w:r>
-            <w:r>
-              <w:rPr>
-                <w:rFonts w:ascii="Consolas" w:hAnsi="Consolas"/>
-                <w:color w:val="0F172A"/>
-                <w:sz w:val="17"/>
-              </w:rPr>
-              <w:br/>
-              <w:t xml:space="preserve">                         |   +--------------------+       +--------------------+</w:t>
-            </w:r>
-            <w:r>
-              <w:rPr>
-                <w:rFonts w:ascii="Consolas" w:hAnsi="Consolas"/>
-                <w:color w:val="0F172A"/>
-                <w:sz w:val="17"/>
-              </w:rPr>
-              <w:br/>
-              <w:t>+--------------------+   |</w:t>
-            </w:r>
-            <w:r>
-              <w:rPr>
-                <w:rFonts w:ascii="Consolas" w:hAnsi="Consolas"/>
-                <w:color w:val="0F172A"/>
-                <w:sz w:val="17"/>
-              </w:rPr>
-              <w:br/>
-              <w:t>|   CERTIFICATES     |   |   +---------</w:t>
-            </w:r>
-            <w:r>
-              <w:rPr>
-                <w:rFonts w:ascii="Consolas" w:hAnsi="Consolas"/>
-                <w:color w:val="0F172A"/>
-                <w:sz w:val="17"/>
-              </w:rPr>
-              <w:t>-----------+       +--------------------+</w:t>
-            </w:r>
-            <w:r>
-              <w:rPr>
-                <w:rFonts w:ascii="Consolas" w:hAnsi="Consolas"/>
-                <w:color w:val="0F172A"/>
-                <w:sz w:val="17"/>
-              </w:rPr>
-              <w:br/>
-              <w:t>|--------------------|   |   |       JOBS         |       |  JOB_APPLICATIONS  |</w:t>
-            </w:r>
-            <w:r>
-              <w:rPr>
-                <w:rFonts w:ascii="Consolas" w:hAnsi="Consolas"/>
-                <w:color w:val="0F172A"/>
-                <w:sz w:val="17"/>
-              </w:rPr>
-              <w:br/>
-              <w:t>| id (PK, CertID)    |   |   |--------------------|       |--------------------|</w:t>
-            </w:r>
-            <w:r>
-              <w:rPr>
-                <w:rFonts w:ascii="Consolas" w:hAnsi="Consolas"/>
-                <w:color w:val="0F172A"/>
-                <w:sz w:val="17"/>
-              </w:rPr>
-              <w:br/>
-              <w:t>| trainee_id (FK)    |---+   | id (PK)            |&lt;</w:t>
-            </w:r>
-            <w:r>
-              <w:rPr>
-                <w:rFonts w:ascii="Consolas" w:hAnsi="Consolas"/>
-                <w:color w:val="0F172A"/>
-                <w:sz w:val="17"/>
-              </w:rPr>
-              <w:t>--+   | id (PK)            |</w:t>
-            </w:r>
-            <w:r>
-              <w:rPr>
-                <w:rFonts w:ascii="Consolas" w:hAnsi="Consolas"/>
-                <w:color w:val="0F172A"/>
-                <w:sz w:val="17"/>
-              </w:rPr>
-              <w:br/>
-              <w:t>| programme_id (FK)  |       | employer_name      |   +---| job_id (FK)        |</w:t>
-            </w:r>
-            <w:r>
-              <w:rPr>
-                <w:rFonts w:ascii="Consolas" w:hAnsi="Consolas"/>
-                <w:color w:val="0F172A"/>
-                <w:sz w:val="17"/>
-              </w:rPr>
-              <w:br/>
-              <w:t>| issued_date        |       | title, location    |   |   | trainee_id (FK)    |</w:t>
-            </w:r>
-            <w:r>
-              <w:rPr>
-                <w:rFonts w:ascii="Consolas" w:hAnsi="Consolas"/>
-                <w:color w:val="0F172A"/>
-                <w:sz w:val="17"/>
-              </w:rPr>
-              <w:br/>
-              <w:t>| grade, qr_payload  |       | salary_range       |   |   | match</w:t>
-            </w:r>
-            <w:r>
-              <w:rPr>
-                <w:rFonts w:ascii="Consolas" w:hAnsi="Consolas"/>
-                <w:color w:val="0F172A"/>
-                <w:sz w:val="17"/>
-              </w:rPr>
-              <w:t>_score        |</w:t>
+              <w:t>| grade, qr_payload  |       | salary_range       |   |   | match_score        |</w:t>
             </w:r>
             <w:r>
               <w:rPr>
@@ -6857,10 +6030,7 @@
         <w:spacing w:before="60" w:after="100"/>
       </w:pPr>
       <w:r>
-        <w:t xml:space="preserve">SahakarSetu is architected </w:t>
-      </w:r>
-      <w:r>
-        <w:t xml:space="preserve">in rigorous alignment with the </w:t>
+        <w:t xml:space="preserve">SahakarSetu is architected in rigorous alignment with the </w:t>
       </w:r>
       <w:r>
         <w:rPr>
@@ -6886,10 +6056,7 @@
         <w:t>Explicit Consent Architecture:</w:t>
       </w:r>
       <w:r>
-        <w:t xml:space="preserve"> Prior to biometric enrollment or Sahakar ID generation, trainees are presented with an itemized, multili</w:t>
-      </w:r>
-      <w:r>
-        <w:t>ngual consent form detailing purpose of data collection, processing scope, and retention duration.</w:t>
+        <w:t xml:space="preserve"> Prior to biometric enrollment or Sahakar ID generation, trainees are presented with an itemized, multilingual consent form detailing purpose of data collection, processing scope, and retention duration.</w:t>
       </w:r>
     </w:p>
     <w:p>
@@ -6906,10 +6073,7 @@
         <w:t>Ephemeral Biometric Processing:</w:t>
       </w:r>
       <w:r>
-        <w:t xml:space="preserve"> Facial imagery is processed in volatile memory on the edge device; raw frames are immediately expunged once 512-D vectors </w:t>
-      </w:r>
-      <w:r>
-        <w:t>are generated. Biometric templates cannot be reverse-engineered into facial likenesses.</w:t>
+        <w:t xml:space="preserve"> Facial imagery is processed in volatile memory on the edge device; raw frames are immediately expunged once 512-D vectors are generated. Biometric templates cannot be reverse-engineered into facial likenesses.</w:t>
       </w:r>
     </w:p>
     <w:p>
@@ -6957,10 +6121,7 @@
         <w:t>At-Rest:</w:t>
       </w:r>
       <w:r>
-        <w:t xml:space="preserve"> Database volumes</w:t>
-      </w:r>
-      <w:r>
-        <w:t>, biometric vectors, and file stores are encrypted using AES-256-GCM.</w:t>
+        <w:t xml:space="preserve"> Database volumes, biometric vectors, and file stores are encrypted using AES-256-GCM.</w:t>
       </w:r>
     </w:p>
     <w:p>
@@ -7014,10 +6175,7 @@
         <w:spacing w:before="60" w:after="100"/>
       </w:pPr>
       <w:r>
-        <w:t xml:space="preserve">The central cloud backend exposes standardized RESTful endpoints </w:t>
-      </w:r>
-      <w:r>
-        <w:t>structured under OpenAPI 3.0 conventions:</w:t>
+        <w:t>The central cloud backend exposes standardized RESTful endpoints structured under OpenAPI 3.0 conventions:</w:t>
       </w:r>
     </w:p>
     <w:tbl>
@@ -7305,13 +6463,7 @@
               <w:rPr>
                 <w:sz w:val="17"/>
               </w:rPr>
-              <w:t xml:space="preserve">Register new participant profile and mint </w:t>
-            </w:r>
-            <w:r>
-              <w:rPr>
-                <w:sz w:val="17"/>
-              </w:rPr>
-              <w:t>unique Sahakar ID</w:t>
+              <w:t>Register new participant profile and mint unique Sahakar ID</w:t>
             </w:r>
           </w:p>
         </w:tc>
@@ -8095,13 +7247,7 @@
               <w:rPr>
                 <w:sz w:val="17"/>
               </w:rPr>
-              <w:t xml:space="preserve">Post new vacancy by accredited </w:t>
-            </w:r>
-            <w:r>
-              <w:rPr>
-                <w:sz w:val="17"/>
-              </w:rPr>
-              <w:t>cooperative employer</w:t>
+              <w:t>Post new vacancy by accredited cooperative employer</w:t>
             </w:r>
           </w:p>
         </w:tc>
@@ -8565,13 +7711,7 @@
               <w:rPr>
                 <w:sz w:val="17"/>
               </w:rPr>
-              <w:t xml:space="preserve">Physical </w:t>
-            </w:r>
-            <w:r>
-              <w:rPr>
-                <w:sz w:val="17"/>
-              </w:rPr>
-              <w:t>internet connection severed; trainee smartphone connects to Edge Box Wi-Fi and streams 1080p lesson.</w:t>
+              <w:t>Physical internet connection severed; trainee smartphone connects to Edge Box Wi-Fi and streams 1080p lesson.</w:t>
             </w:r>
           </w:p>
         </w:tc>
@@ -8612,14 +7752,23 @@
           <w:p>
             <w:pPr>
               <w:spacing w:before="40" w:after="40"/>
-            </w:pPr>
-            <w:r>
               <w:rPr>
                 <w:b/>
                 <w:sz w:val="17"/>
               </w:rPr>
-              <w:t>Verified</w:t>
-            </w:r>
+            </w:pPr>
+            <w:r>
+              <w:rPr>
+                <w:b/>
+                <w:sz w:val="17"/>
+              </w:rPr>
+              <w:t>Prototype Tested</w:t>
+            </w:r>
+          </w:p>
+          <w:p>
+            <w:pPr>
+              <w:spacing w:before="40" w:after="40"/>
+            </w:pPr>
           </w:p>
         </w:tc>
       </w:tr>
@@ -8694,13 +7843,7 @@
               <w:rPr>
                 <w:sz w:val="17"/>
               </w:rPr>
-              <w:t>Edge camera</w:t>
-            </w:r>
-            <w:r>
-              <w:rPr>
-                <w:sz w:val="17"/>
-              </w:rPr>
-              <w:t xml:space="preserve"> captures student face under zero-internet state; runs MiniFASNet + ArcFace match against local DB.</w:t>
+              <w:t>Edge camera captures student face under zero-internet state; runs MiniFASNet + ArcFace match against local DB.</w:t>
             </w:r>
           </w:p>
         </w:tc>
@@ -8741,14 +7884,23 @@
           <w:p>
             <w:pPr>
               <w:spacing w:before="40" w:after="40"/>
-            </w:pPr>
-            <w:r>
               <w:rPr>
                 <w:b/>
                 <w:sz w:val="17"/>
               </w:rPr>
-              <w:t>Verified</w:t>
-            </w:r>
+            </w:pPr>
+            <w:r>
+              <w:rPr>
+                <w:b/>
+                <w:sz w:val="17"/>
+              </w:rPr>
+              <w:t>Prototype Tested</w:t>
+            </w:r>
+          </w:p>
+          <w:p>
+            <w:pPr>
+              <w:spacing w:before="40" w:after="40"/>
+            </w:pPr>
           </w:p>
         </w:tc>
       </w:tr>
@@ -8823,13 +7975,7 @@
               <w:rPr>
                 <w:sz w:val="17"/>
               </w:rPr>
-              <w:t xml:space="preserve">50 attendance, </w:t>
-            </w:r>
-            <w:r>
-              <w:rPr>
-                <w:sz w:val="17"/>
-              </w:rPr>
-              <w:t>registration, and quiz events generated offline; internet connection physically restored.</w:t>
+              <w:t>50 attendance, registration, and quiz events generated offline; internet connection physically restored.</w:t>
             </w:r>
           </w:p>
         </w:tc>
@@ -8870,14 +8016,23 @@
           <w:p>
             <w:pPr>
               <w:spacing w:before="40" w:after="40"/>
-            </w:pPr>
-            <w:r>
               <w:rPr>
                 <w:b/>
                 <w:sz w:val="17"/>
               </w:rPr>
-              <w:t>Verified</w:t>
-            </w:r>
+            </w:pPr>
+            <w:r>
+              <w:rPr>
+                <w:b/>
+                <w:sz w:val="17"/>
+              </w:rPr>
+              <w:t>Prototype Tested</w:t>
+            </w:r>
+          </w:p>
+          <w:p>
+            <w:pPr>
+              <w:spacing w:before="40" w:after="40"/>
+            </w:pPr>
           </w:p>
         </w:tc>
       </w:tr>
@@ -8952,13 +8107,7 @@
               <w:rPr>
                 <w:sz w:val="17"/>
               </w:rPr>
-              <w:t>Same event ba</w:t>
-            </w:r>
-            <w:r>
-              <w:rPr>
-                <w:sz w:val="17"/>
-              </w:rPr>
-              <w:t>tch intentionally transmitted twice to `/api/sync-events/` due to simulated network retry.</w:t>
+              <w:t>Same event batch intentionally transmitted twice to `/api/sync-events/` due to simulated network retry.</w:t>
             </w:r>
           </w:p>
         </w:tc>
@@ -8999,14 +8148,23 @@
           <w:p>
             <w:pPr>
               <w:spacing w:before="40" w:after="40"/>
-            </w:pPr>
-            <w:r>
               <w:rPr>
                 <w:b/>
                 <w:sz w:val="17"/>
               </w:rPr>
-              <w:t>Verified</w:t>
-            </w:r>
+            </w:pPr>
+            <w:r>
+              <w:rPr>
+                <w:b/>
+                <w:sz w:val="17"/>
+              </w:rPr>
+              <w:t>Prototype Tested</w:t>
+            </w:r>
+          </w:p>
+          <w:p>
+            <w:pPr>
+              <w:spacing w:before="40" w:after="40"/>
+            </w:pPr>
           </w:p>
         </w:tc>
       </w:tr>
@@ -9122,14 +8280,23 @@
           <w:p>
             <w:pPr>
               <w:spacing w:before="40" w:after="40"/>
-            </w:pPr>
-            <w:r>
               <w:rPr>
                 <w:b/>
                 <w:sz w:val="17"/>
               </w:rPr>
-              <w:t>Verified</w:t>
-            </w:r>
+            </w:pPr>
+            <w:r>
+              <w:rPr>
+                <w:b/>
+                <w:sz w:val="17"/>
+              </w:rPr>
+              <w:t>Prototype Tested</w:t>
+            </w:r>
+          </w:p>
+          <w:p>
+            <w:pPr>
+              <w:spacing w:before="40" w:after="40"/>
+            </w:pPr>
           </w:p>
         </w:tc>
       </w:tr>
@@ -9204,13 +8371,7 @@
               <w:rPr>
                 <w:sz w:val="17"/>
               </w:rPr>
-              <w:t>Certificate hash</w:t>
-            </w:r>
-            <w:r>
-              <w:rPr>
-                <w:sz w:val="17"/>
-              </w:rPr>
-              <w:t xml:space="preserve"> or grade artificially altered in JSON payload.</w:t>
+              <w:t>Certificate hash or grade artificially altered in JSON payload.</w:t>
             </w:r>
           </w:p>
         </w:tc>
@@ -9251,14 +8412,23 @@
           <w:p>
             <w:pPr>
               <w:spacing w:before="40" w:after="40"/>
-            </w:pPr>
-            <w:r>
               <w:rPr>
                 <w:b/>
                 <w:sz w:val="17"/>
               </w:rPr>
-              <w:t>Verified</w:t>
-            </w:r>
+            </w:pPr>
+            <w:r>
+              <w:rPr>
+                <w:b/>
+                <w:sz w:val="17"/>
+              </w:rPr>
+              <w:t>Prototype Tested</w:t>
+            </w:r>
+          </w:p>
+          <w:p>
+            <w:pPr>
+              <w:spacing w:before="40" w:after="40"/>
+            </w:pPr>
           </w:p>
         </w:tc>
       </w:tr>
@@ -9333,13 +8503,7 @@
               <w:rPr>
                 <w:sz w:val="17"/>
               </w:rPr>
-              <w:t xml:space="preserve">Trainee speaks query in rural Marathi dialect; </w:t>
-            </w:r>
-            <w:r>
-              <w:rPr>
-                <w:sz w:val="17"/>
-              </w:rPr>
-              <w:t>system transcribes, translates, and synthesizes Marathi audio response.</w:t>
+              <w:t>Trainee speaks query in rural Marathi dialect; system transcribes, translates, and synthesizes Marathi audio response.</w:t>
             </w:r>
           </w:p>
         </w:tc>
@@ -9380,14 +8544,23 @@
           <w:p>
             <w:pPr>
               <w:spacing w:before="40" w:after="40"/>
-            </w:pPr>
-            <w:r>
               <w:rPr>
                 <w:b/>
                 <w:sz w:val="17"/>
               </w:rPr>
-              <w:t>Verified</w:t>
-            </w:r>
+            </w:pPr>
+            <w:r>
+              <w:rPr>
+                <w:b/>
+                <w:sz w:val="17"/>
+              </w:rPr>
+              <w:t>Prototype Tested</w:t>
+            </w:r>
+          </w:p>
+          <w:p>
+            <w:pPr>
+              <w:spacing w:before="40" w:after="40"/>
+            </w:pPr>
           </w:p>
         </w:tc>
       </w:tr>
@@ -9462,13 +8635,7 @@
               <w:rPr>
                 <w:sz w:val="17"/>
               </w:rPr>
-              <w:t>Candidate profile matched against coopera</w:t>
-            </w:r>
-            <w:r>
-              <w:rPr>
-                <w:sz w:val="17"/>
-              </w:rPr>
-              <w:t>tive vacancies using ESCO/O\*NET taxonomy and XGBoost ranker.</w:t>
+              <w:t>Candidate profile matched against cooperative vacancies using ESCO/O\*NET taxonomy and XGBoost ranker.</w:t>
             </w:r>
           </w:p>
         </w:tc>
@@ -9509,14 +8676,23 @@
           <w:p>
             <w:pPr>
               <w:spacing w:before="40" w:after="40"/>
-            </w:pPr>
-            <w:r>
               <w:rPr>
                 <w:b/>
                 <w:sz w:val="17"/>
               </w:rPr>
-              <w:t>Verified</w:t>
-            </w:r>
+            </w:pPr>
+            <w:r>
+              <w:rPr>
+                <w:b/>
+                <w:sz w:val="17"/>
+              </w:rPr>
+              <w:t>Simulated Validation</w:t>
+            </w:r>
+          </w:p>
+          <w:p>
+            <w:pPr>
+              <w:spacing w:before="40" w:after="40"/>
+            </w:pPr>
           </w:p>
         </w:tc>
       </w:tr>
@@ -9548,14 +8724,7 @@
           <w:color w:val="0D9488"/>
           <w:sz w:val="23"/>
         </w:rPr>
-        <w:t xml:space="preserve">18.1 Feasibility </w:t>
-      </w:r>
-      <w:r>
-        <w:rPr>
-          <w:color w:val="0D9488"/>
-          <w:sz w:val="23"/>
-        </w:rPr>
-        <w:t>Assessment</w:t>
+        <w:t>18.1 Feasibility Assessment</w:t>
       </w:r>
     </w:p>
     <w:p>
@@ -9570,10 +8739,7 @@
         <w:t>Technical Feasibility:</w:t>
       </w:r>
       <w:r>
-        <w:t xml:space="preserve"> Built on proven, open-source industrial frameworks (React 19, Django, PostgreSQL, Raspberry Pi 5, Moodle Core, InsightFace). The hardware footprint is standardized, lightweight, and requires no specialized proprietary tool</w:t>
-      </w:r>
-      <w:r>
-        <w:t>ing.</w:t>
+        <w:t xml:space="preserve"> Built on proven, open-source industrial frameworks (React 19, Django, PostgreSQL, Raspberry Pi 5, Moodle Core, InsightFace). The hardware footprint is standardized, lightweight, and requires no specialized proprietary tooling.</w:t>
       </w:r>
     </w:p>
     <w:p>
@@ -9588,10 +8754,7 @@
         <w:t>Operational Feasibility:</w:t>
       </w:r>
       <w:r>
-        <w:t xml:space="preserve"> Aligned directly with NCCT's existing hierarchy (1 National Apex Institute + 5 Regional Institutes + 14 State Institutes). Institutes possess existing computer laboratories and classrooms capable of immediately hosting Edge Bo</w:t>
-      </w:r>
-      <w:r>
-        <w:t>x nodes.</w:t>
+        <w:t xml:space="preserve"> Aligned directly with NCCT's existing hierarchy (1 National Apex Institute + 5 Regional Institutes + 14 State Institutes). Institutes possess existing computer laboratories and classrooms capable of immediately hosting Edge Box nodes.</w:t>
       </w:r>
     </w:p>
     <w:p>
@@ -9606,10 +8769,7 @@
         <w:t>Economic Feasibility:</w:t>
       </w:r>
       <w:r>
-        <w:t xml:space="preserve"> The estimated hardware cost of ~₹19,450 per Edge Box allows deployment across all 20 NCCT institutions for less than ₹4.5 Lakhs capital expenditure, delivering immediate annual savings in administrative stationery, paper regi</w:t>
-      </w:r>
-      <w:r>
-        <w:t>sters, and travel logistics.</w:t>
+        <w:t xml:space="preserve"> The estimated hardware cost of ~₹19,450 per Edge Box allows deployment across all 20 NCCT institutions for less than ₹4.5 Lakhs capital expenditure, delivering immediate annual savings in administrative stationery, paper registers, and travel logistics.</w:t>
       </w:r>
     </w:p>
     <w:p>
@@ -9678,7 +8838,7 @@
                 <w:sz w:val="17"/>
               </w:rPr>
               <w:br/>
-              <w:t xml:space="preserve">|                             </w:t>
+              <w:t>|                                                                                   |</w:t>
             </w:r>
             <w:r>
               <w:rPr>
@@ -9686,7 +8846,8 @@
                 <w:color w:val="0F172A"/>
                 <w:sz w:val="17"/>
               </w:rPr>
-              <w:t xml:space="preserve">                                                      |</w:t>
+              <w:br/>
+              <w:t>|  PHASE 1: Foundation Pilot (Months 0 - 3)                                         |</w:t>
             </w:r>
             <w:r>
               <w:rPr>
@@ -9695,7 +8856,7 @@
                 <w:sz w:val="17"/>
               </w:rPr>
               <w:br/>
-              <w:t>|  PHASE 1: Foundation Pilot (Months 0 - 3)                                         |</w:t>
+              <w:t>|  - Deploy Central Cloud ERP &amp; LMS Infrastructure                                  |</w:t>
             </w:r>
             <w:r>
               <w:rPr>
@@ -9704,7 +8865,7 @@
                 <w:sz w:val="17"/>
               </w:rPr>
               <w:br/>
-              <w:t>|  - Deploy Central Cloud ERP &amp; LMS Infrastructure                                  |</w:t>
+              <w:t>|  - Hardware deployment at VAMNICOM Pune + 2 RICMs (Gandhinagar &amp; Chandigarh)      |</w:t>
             </w:r>
             <w:r>
               <w:rPr>
@@ -9713,7 +8874,7 @@
                 <w:sz w:val="17"/>
               </w:rPr>
               <w:br/>
-              <w:t xml:space="preserve">|  - Hardware deployment at </w:t>
+              <w:t>|  - Validate offline Edge Box sync and biometric attendance under real batches     |</w:t>
             </w:r>
             <w:r>
               <w:rPr>
@@ -9721,7 +8882,8 @@
                 <w:color w:val="0F172A"/>
                 <w:sz w:val="17"/>
               </w:rPr>
-              <w:t>VAMNICOM Pune + 2 RICMs (Gandhinagar &amp; Chandigarh)      |</w:t>
+              <w:br/>
+              <w:t>|                                                                                   |</w:t>
             </w:r>
             <w:r>
               <w:rPr>
@@ -9730,7 +8892,7 @@
                 <w:sz w:val="17"/>
               </w:rPr>
               <w:br/>
-              <w:t>|  - Validate offline Edge Box sync and biometric attendance under real batches     |</w:t>
+              <w:t>|  PHASE 2: Institute Network Scale-Out (Months 3 - 9)                              |</w:t>
             </w:r>
             <w:r>
               <w:rPr>
@@ -9739,7 +8901,7 @@
                 <w:sz w:val="17"/>
               </w:rPr>
               <w:br/>
-              <w:t>|                                                                                   |</w:t>
+              <w:t>|  - Deploy Edge Box nodes across remaining 3 RICMs and 14 ICMs (Pan-India 20)      |</w:t>
             </w:r>
             <w:r>
               <w:rPr>
@@ -9748,7 +8910,7 @@
                 <w:sz w:val="17"/>
               </w:rPr>
               <w:br/>
-              <w:t>|  PHASE 2: Institute Netw</w:t>
+              <w:t>|  - Issue digital Sahakar IDs for all incoming trainees                            |</w:t>
             </w:r>
             <w:r>
               <w:rPr>
@@ -9756,7 +8918,8 @@
                 <w:color w:val="0F172A"/>
                 <w:sz w:val="17"/>
               </w:rPr>
-              <w:t>ork Scale-Out (Months 3 - 9)                              |</w:t>
+              <w:br/>
+              <w:t>|  - Integrate Bhashini multilingual speech engine in regional institute languages |</w:t>
             </w:r>
             <w:r>
               <w:rPr>
@@ -9765,7 +8928,7 @@
                 <w:sz w:val="17"/>
               </w:rPr>
               <w:br/>
-              <w:t>|  - Deploy Edge Box nodes across remaining 3 RICMs and 14 ICMs (Pan-India 20)      |</w:t>
+              <w:t>|                                                                                   |</w:t>
             </w:r>
             <w:r>
               <w:rPr>
@@ -9774,7 +8937,7 @@
                 <w:sz w:val="17"/>
               </w:rPr>
               <w:br/>
-              <w:t>|  - Issue digital Sahakar IDs for all incoming trainees                            |</w:t>
+              <w:t>|  PHASE 3: Grassroots PACS &amp; Dairy Hub Outreach (Months 9 - 18)                    |</w:t>
             </w:r>
             <w:r>
               <w:rPr>
@@ -9783,7 +8946,7 @@
                 <w:sz w:val="17"/>
               </w:rPr>
               <w:br/>
-              <w:t xml:space="preserve">|  - Integrate Bhashini </w:t>
+              <w:t>|  - Deploy portable Edge Boxes at 500+ computerized PACS and District Unions       |</w:t>
             </w:r>
             <w:r>
               <w:rPr>
@@ -9791,7 +8954,8 @@
                 <w:color w:val="0F172A"/>
                 <w:sz w:val="17"/>
               </w:rPr>
-              <w:t>multilingual speech engine in regional institute languages |</w:t>
+              <w:br/>
+              <w:t>|  - Mobile training camps for remote village cooperative secretaries and SHGs      |</w:t>
             </w:r>
             <w:r>
               <w:rPr>
@@ -9800,7 +8964,7 @@
                 <w:sz w:val="17"/>
               </w:rPr>
               <w:br/>
-              <w:t>|                                                                                   |</w:t>
+              <w:t>|  - Launch full Digital Skill Passport ecosystem with public QR verification       |</w:t>
             </w:r>
             <w:r>
               <w:rPr>
@@ -9809,7 +8973,7 @@
                 <w:sz w:val="17"/>
               </w:rPr>
               <w:br/>
-              <w:t>|  PHASE 3: Grassroots PACS &amp; Dairy Hub Outreach (Months 9 - 18)                    |</w:t>
+              <w:t>|                                                                                   |</w:t>
             </w:r>
             <w:r>
               <w:rPr>
@@ -9818,7 +8982,7 @@
                 <w:sz w:val="17"/>
               </w:rPr>
               <w:br/>
-              <w:t>|  - Deploy portable Ed</w:t>
+              <w:t>|  PHASE 4: National Employment &amp; Interoperability Ecosystem (Months 18+)           |</w:t>
             </w:r>
             <w:r>
               <w:rPr>
@@ -9826,7 +8990,8 @@
                 <w:color w:val="0F172A"/>
                 <w:sz w:val="17"/>
               </w:rPr>
-              <w:t>ge Boxes at 500+ computerized PACS and District Unions       |</w:t>
+              <w:br/>
+              <w:t>|  - Full integration with National Cooperative Database (cooperatives.gov.in)     |</w:t>
             </w:r>
             <w:r>
               <w:rPr>
@@ -9835,68 +9000,7 @@
                 <w:sz w:val="17"/>
               </w:rPr>
               <w:br/>
-              <w:t>|  - Mobile training camps for remote village cooperative secretaries and SHGs      |</w:t>
-            </w:r>
-            <w:r>
-              <w:rPr>
-                <w:rFonts w:ascii="Consolas" w:hAnsi="Consolas"/>
-                <w:color w:val="0F172A"/>
-                <w:sz w:val="17"/>
-              </w:rPr>
-              <w:br/>
-              <w:t>|  - Launch full Digital Skill Passport ecosystem with public QR verification       |</w:t>
-            </w:r>
-            <w:r>
-              <w:rPr>
-                <w:rFonts w:ascii="Consolas" w:hAnsi="Consolas"/>
-                <w:color w:val="0F172A"/>
-                <w:sz w:val="17"/>
-              </w:rPr>
-              <w:br/>
-              <w:t xml:space="preserve">|                    </w:t>
-            </w:r>
-            <w:r>
-              <w:rPr>
-                <w:rFonts w:ascii="Consolas" w:hAnsi="Consolas"/>
-                <w:color w:val="0F172A"/>
-                <w:sz w:val="17"/>
-              </w:rPr>
-              <w:t xml:space="preserve">                                                               |</w:t>
-            </w:r>
-            <w:r>
-              <w:rPr>
-                <w:rFonts w:ascii="Consolas" w:hAnsi="Consolas"/>
-                <w:color w:val="0F172A"/>
-                <w:sz w:val="17"/>
-              </w:rPr>
-              <w:br/>
-              <w:t>|  PHASE 4: National Employment &amp; Interoperability Ecosystem (Months 18+)           |</w:t>
-            </w:r>
-            <w:r>
-              <w:rPr>
-                <w:rFonts w:ascii="Consolas" w:hAnsi="Consolas"/>
-                <w:color w:val="0F172A"/>
-                <w:sz w:val="17"/>
-              </w:rPr>
-              <w:br/>
-              <w:t>|  - Full integration with National Cooperative Database (cooperatives.gov.in)     |</w:t>
-            </w:r>
-            <w:r>
-              <w:rPr>
-                <w:rFonts w:ascii="Consolas" w:hAnsi="Consolas"/>
-                <w:color w:val="0F172A"/>
-                <w:sz w:val="17"/>
-              </w:rPr>
-              <w:br/>
-              <w:t>|  - Cooperative rec</w:t>
-            </w:r>
-            <w:r>
-              <w:rPr>
-                <w:rFonts w:ascii="Consolas" w:hAnsi="Consolas"/>
-                <w:color w:val="0F172A"/>
-                <w:sz w:val="17"/>
-              </w:rPr>
-              <w:t>ruiter portal onboarding 10,000+ cooperative societies          |</w:t>
+              <w:t>|  - Cooperative recruiter portal onboarding 10,000+ cooperative societies          |</w:t>
             </w:r>
             <w:r>
               <w:rPr>
@@ -9934,13 +9038,7 @@
         <w:rPr>
           <w:color w:val="1E3A5F"/>
         </w:rPr>
-        <w:t xml:space="preserve">19. Social, </w:t>
-      </w:r>
-      <w:r>
-        <w:rPr>
-          <w:color w:val="1E3A5F"/>
-        </w:rPr>
-        <w:t>Economic &amp; Environmental Impact</w:t>
+        <w:t>19. Social, Economic &amp; Environmental Impact</w:t>
       </w:r>
     </w:p>
     <w:tbl>
@@ -10130,13 +9228,7 @@
               <w:rPr>
                 <w:sz w:val="17"/>
               </w:rPr>
-              <w:t>Localized, voice-first mult</w:t>
-            </w:r>
-            <w:r>
-              <w:rPr>
-                <w:sz w:val="17"/>
-              </w:rPr>
-              <w:t>ilingual learning in native dialects through nearest village hubs.</w:t>
+              <w:t>Localized, voice-first multilingual learning in native dialects through nearest village hubs.</w:t>
             </w:r>
           </w:p>
         </w:tc>
@@ -10154,14 +9246,23 @@
           <w:p>
             <w:pPr>
               <w:spacing w:before="40" w:after="40"/>
-            </w:pPr>
-            <w:r>
               <w:rPr>
                 <w:b/>
                 <w:sz w:val="17"/>
               </w:rPr>
-              <w:t>+40% increase in female and tribal trainee participation across cooperative courses.</w:t>
-            </w:r>
+            </w:pPr>
+            <w:r>
+              <w:rPr>
+                <w:b/>
+                <w:sz w:val="17"/>
+              </w:rPr>
+              <w:t>Target increase in female and tribal trainee participation across cooperative courses.</w:t>
+            </w:r>
+          </w:p>
+          <w:p>
+            <w:pPr>
+              <w:spacing w:before="40" w:after="40"/>
+            </w:pPr>
           </w:p>
         </w:tc>
       </w:tr>
@@ -10253,14 +9354,23 @@
           <w:p>
             <w:pPr>
               <w:spacing w:before="40" w:after="40"/>
-            </w:pPr>
-            <w:r>
               <w:rPr>
                 <w:b/>
                 <w:sz w:val="17"/>
               </w:rPr>
-              <w:t>85% reduction in institutional administrative turnaround and clerical man-hours.</w:t>
-            </w:r>
+            </w:pPr>
+            <w:r>
+              <w:rPr>
+                <w:b/>
+                <w:sz w:val="17"/>
+              </w:rPr>
+              <w:t>Target reduction in institutional administrative turnaround and clerical man-hours.</w:t>
+            </w:r>
+          </w:p>
+          <w:p>
+            <w:pPr>
+              <w:spacing w:before="40" w:after="40"/>
+            </w:pPr>
           </w:p>
         </w:tc>
       </w:tr>
@@ -10311,13 +9421,7 @@
               <w:rPr>
                 <w:sz w:val="17"/>
               </w:rPr>
-              <w:t xml:space="preserve">Zero formal link between rural training completion and cooperative </w:t>
-            </w:r>
-            <w:r>
-              <w:rPr>
-                <w:sz w:val="17"/>
-              </w:rPr>
-              <w:t>hiring.</w:t>
+              <w:t>Zero formal link between rural training completion and cooperative hiring.</w:t>
             </w:r>
           </w:p>
         </w:tc>
@@ -10358,14 +9462,23 @@
           <w:p>
             <w:pPr>
               <w:spacing w:before="40" w:after="40"/>
-            </w:pPr>
-            <w:r>
               <w:rPr>
                 <w:b/>
                 <w:sz w:val="17"/>
               </w:rPr>
-              <w:t>3.5x improvement in certified trainee placement and cooperative apprentice hiring.</w:t>
-            </w:r>
+            </w:pPr>
+            <w:r>
+              <w:rPr>
+                <w:b/>
+                <w:sz w:val="17"/>
+              </w:rPr>
+              <w:t>Target improvement in certified trainee placement and cooperative apprentice hiring.</w:t>
+            </w:r>
+          </w:p>
+          <w:p>
+            <w:pPr>
+              <w:spacing w:before="40" w:after="40"/>
+            </w:pPr>
           </w:p>
         </w:tc>
       </w:tr>
@@ -10416,13 +9529,7 @@
               <w:rPr>
                 <w:sz w:val="17"/>
               </w:rPr>
-              <w:t>Thousands of reams of physical paper used annu</w:t>
-            </w:r>
-            <w:r>
-              <w:rPr>
-                <w:sz w:val="17"/>
-              </w:rPr>
-              <w:t>ally for registers and certificates.</w:t>
+              <w:t>Thousands of reams of physical paper used annually for registers and certificates.</w:t>
             </w:r>
           </w:p>
         </w:tc>
@@ -10463,14 +9570,23 @@
           <w:p>
             <w:pPr>
               <w:spacing w:before="40" w:after="40"/>
-            </w:pPr>
-            <w:r>
               <w:rPr>
                 <w:b/>
                 <w:sz w:val="17"/>
               </w:rPr>
-              <w:t>~12 tonnes CO₂ reduction annually from eliminated paper and redundant admin travel.</w:t>
-            </w:r>
+            </w:pPr>
+            <w:r>
+              <w:rPr>
+                <w:b/>
+                <w:sz w:val="17"/>
+              </w:rPr>
+              <w:t>Target reduction annually from eliminated paper and redundant admin travel.</w:t>
+            </w:r>
+          </w:p>
+          <w:p>
+            <w:pPr>
+              <w:spacing w:before="40" w:after="40"/>
+            </w:pPr>
           </w:p>
         </w:tc>
       </w:tr>
@@ -10514,10 +9630,7 @@
         <w:t>Ministry of Cooperation, Government of India:</w:t>
       </w:r>
       <w:r>
-        <w:t xml:space="preserve"> Guidelines on PACS Computerization and Model Bye-laws for Primary Agricultural Credit Soc</w:t>
-      </w:r>
-      <w:r>
-        <w:t>ieties. *(https://cooperation.gov.in)*</w:t>
+        <w:t xml:space="preserve"> Guidelines on PACS Computerization and Model Bye-laws for Primary Agricultural Credit Societies. *(https://cooperation.gov.in)*</w:t>
       </w:r>
     </w:p>
     <w:p>
@@ -10551,10 +9664,7 @@
         <w:t>National Cooperation Policy 2025:</w:t>
       </w:r>
       <w:r>
-        <w:t xml:space="preserve"> National pol</w:t>
-      </w:r>
-      <w:r>
-        <w:t>icy priorities emphasizing digitalization, youth empowerment, cooperative entrepreneurship, and standardized skill accreditation.</w:t>
+        <w:t xml:space="preserve"> National policy priorities emphasizing digitalization, youth empowerment, cooperative entrepreneurship, and standardized skill accreditation.</w:t>
       </w:r>
     </w:p>
     <w:p>
@@ -10571,10 +9681,7 @@
         <w:t>National Cooperative Database (NCD):</w:t>
       </w:r>
       <w:r>
-        <w:t xml:space="preserve"> Centralized data taxonomy cataloging 8.44 lakh cooperatives and 30+ crore members for </w:t>
-      </w:r>
-      <w:r>
-        <w:t>future API interoperability. *(https://cooperatives.gov.in)*</w:t>
+        <w:t xml:space="preserve"> Centralized data taxonomy cataloging 8.44 lakh cooperatives and 30+ crore members for future API interoperability. *(https://cooperatives.gov.in)*</w:t>
       </w:r>
     </w:p>
     <w:p>
@@ -10608,10 +9715,7 @@
         <w:t>National Career Service (NCS):</w:t>
       </w:r>
       <w:r>
-        <w:t xml:space="preserve"> Ministry of Labour and Employment standards for job role classific</w:t>
-      </w:r>
-      <w:r>
-        <w:t>ation and vocational skill mapping. *(https://ncs.gov.in)*</w:t>
+        <w:t xml:space="preserve"> Ministry of Labour and Employment standards for job role classification and vocational skill mapping. *(https://ncs.gov.in)*</w:t>
       </w:r>
     </w:p>
     <w:p>
@@ -10634,10 +9738,7 @@
     </w:p>
     <w:p>
       <w:r>
-        <w:t>Backend API Endpoint: https://sahakarsetu-mcdr.onrender.c</w:t>
-      </w:r>
-      <w:r>
-        <w:t>om/health/</w:t>
+        <w:t>Backend API Endpoint: https://sahakarsetu-mcdr.onrender.com/health/</w:t>
       </w:r>
     </w:p>
     <w:sectPr>
@@ -23353,7 +22454,7 @@
 </file>
 
 <file path=customXml/itemProps1.xml><?xml version="1.0" encoding="utf-8"?>
-<ds:datastoreItem xmlns:ds="http://schemas.openxmlformats.org/officeDocument/2006/customXml" ds:itemID="{17ACD9BE-C1B3-4E64-A18B-665F2C5B3D9A}">
+<ds:datastoreItem xmlns:ds="http://schemas.openxmlformats.org/officeDocument/2006/customXml" ds:itemID="{13FDEE83-8332-4FDC-9E30-D1D763E770F5}">
   <ds:schemaRefs>
     <ds:schemaRef ds:uri="http://schemas.openxmlformats.org/officeDocument/2006/bibliography"/>
   </ds:schemaRefs>

</xml_diff>

<commit_message>
Remove duplicate Project Deployment & Prototype Links section
</commit_message>
<xml_diff>
--- a/report/SahakarSetu_Technical_Architecture_Report.docx
+++ b/report/SahakarSetu_Technical_Architecture_Report.docx
@@ -77,60 +77,6 @@
       <w:r>
         <w:t>Project Deployment &amp; Prototype Links</w:t>
       </w:r>
-    </w:p>
-    <w:p>
-      <w:pPr>
-        <w:rPr>
-          <w:rStyle w:val="Hyperlink"/>
-        </w:rPr>
-      </w:pPr>
-      <w:r>
-        <w:t xml:space="preserve">Prototype Working Video: </w:t>
-      </w:r>
-      <w:hyperlink r:id="rId8" w:history="1">
-        <w:r>
-          <w:rPr>
-            <w:rStyle w:val="Hyperlink"/>
-          </w:rPr>
-          <w:t>https://youtu.be/SGfuTJ5SxBE</w:t>
-        </w:r>
-      </w:hyperlink>
-    </w:p>
-    <w:p>
-      <w:pPr>
-        <w:rPr>
-          <w:rStyle w:val="Hyperlink"/>
-        </w:rPr>
-      </w:pPr>
-      <w:r>
-        <w:t xml:space="preserve">Live Deployed Prototype: </w:t>
-      </w:r>
-      <w:hyperlink r:id="rId9" w:history="1">
-        <w:r>
-          <w:rPr>
-            <w:rStyle w:val="Hyperlink"/>
-          </w:rPr>
-          <w:t>https://sahakar-setu-sage.vercel.app/</w:t>
-        </w:r>
-      </w:hyperlink>
-    </w:p>
-    <w:p>
-      <w:pPr>
-        <w:rPr>
-          <w:rStyle w:val="Hyperlink"/>
-        </w:rPr>
-      </w:pPr>
-      <w:r>
-        <w:t xml:space="preserve">Backend API Endpoint: </w:t>
-      </w:r>
-      <w:hyperlink r:id="rId10" w:history="1">
-        <w:r>
-          <w:rPr>
-            <w:rStyle w:val="Hyperlink"/>
-          </w:rPr>
-          <w:t>https://sahakarsetu-mcdr.onrender.com/health/</w:t>
-        </w:r>
-      </w:hyperlink>
     </w:p>
     <w:p/>
     <w:p/>
@@ -9716,29 +9662,6 @@
       </w:r>
       <w:r>
         <w:t xml:space="preserve"> Ministry of Labour and Employment standards for job role classification and vocational skill mapping. *(https://ncs.gov.in)*</w:t>
-      </w:r>
-    </w:p>
-    <w:p>
-      <w:pPr>
-        <w:pStyle w:val="Heading2"/>
-      </w:pPr>
-      <w:r>
-        <w:t>Prototype &amp; Live Links</w:t>
-      </w:r>
-    </w:p>
-    <w:p>
-      <w:r>
-        <w:t>Prototype Working Video: https://youtu.be/SGfuTJ5SxBE</w:t>
-      </w:r>
-    </w:p>
-    <w:p>
-      <w:r>
-        <w:t>Live Deployed Prototype: https://sahakar-setu-sage.vercel.app/</w:t>
-      </w:r>
-    </w:p>
-    <w:p>
-      <w:r>
-        <w:t>Backend API Endpoint: https://sahakarsetu-mcdr.onrender.com/health/</w:t>
       </w:r>
     </w:p>
     <w:sectPr>

</xml_diff>

<commit_message>
Perform final QA consistency checks aligning Technical Report with SIH PPT
</commit_message>
<xml_diff>
--- a/report/SahakarSetu_Technical_Architecture_Report.docx
+++ b/report/SahakarSetu_Technical_Architecture_Report.docx
@@ -97,13 +97,7 @@
         <w:spacing w:before="60" w:after="100"/>
       </w:pPr>
       <w:r>
-        <w:rPr>
-          <w:b/>
-        </w:rPr>
-        <w:t>SahakarSetu</w:t>
-      </w:r>
-      <w:r>
-        <w:t xml:space="preserve"> is an enterprise-grade digital public infrastructure designed to modernize and unify the cooperative education, administration, and employment ecosystem across India. Commissioned under the mandate of the Ministry of Cooperation and the National Council for Cooperative Training (NCCT), the platform integrates institutional enterprise resource planning (ERP), learning management systems (LMS), computer-vision attendance, offline-first edge computing, verifiable cryptographic skill credentialing, and AI-driven employment linkage into a continuous, data-driven lifecycle.</w:t>
+        <w:t>SahakarSetu is an scalable digital ecosystem designed to modernize and unify the cooperative education, administration, and employment ecosystem across India. SahakarSetu is a proposed digital ecosystem designed to support the cooperative training ecosystem under NCCT and the Ministry of Cooperation. the platform integrates institutional enterprise resource planning (ERP), learning management systems (LMS), computer-vision attendance, offline-first edge computing, verifiable cryptographic skill credentialing, and AI-driven employment linkage into a continuous, data-driven lifecycle.</w:t>
       </w:r>
     </w:p>
     <w:p>
@@ -932,11 +926,7 @@
               <w:spacing w:before="40" w:after="40"/>
             </w:pPr>
             <w:r>
-              <w:rPr>
-                <w:b/>
-                <w:sz w:val="17"/>
-              </w:rPr>
-              <w:t>Moodle LMS Core integration + Government BHASHINI AI speech/translation API.</w:t>
+              <w:t>Proposed Moodle LMS Core integration + Proposed Government BHASHINI AI speech/translation API.</w:t>
             </w:r>
           </w:p>
         </w:tc>
@@ -1032,10 +1022,7 @@
               <w:spacing w:before="40" w:after="40"/>
             </w:pPr>
             <w:r>
-              <w:rPr>
-                <w:sz w:val="17"/>
-              </w:rPr>
-              <w:t>InsightFace / MiniFASNet embeddings + time-based HMAC dynamic QR codes.</w:t>
+              <w:t>Proposed InsightFace / MiniFASNet embeddings + time-based HMAC dynamic QR codes.</w:t>
             </w:r>
           </w:p>
         </w:tc>
@@ -1338,10 +1325,7 @@
               <w:spacing w:before="40" w:after="40"/>
             </w:pPr>
             <w:r>
-              <w:rPr>
-                <w:sz w:val="17"/>
-              </w:rPr>
-              <w:t>HMAC-SHA256 / Ed25519 signed credentials, public verification endpoint.</w:t>
+              <w:t>Ed25519 digitally signed credentials with public-key verification, public verification endpoint.</w:t>
             </w:r>
           </w:p>
         </w:tc>
@@ -1437,10 +1421,7 @@
               <w:spacing w:before="40" w:after="40"/>
             </w:pPr>
             <w:r>
-              <w:rPr>
-                <w:sz w:val="17"/>
-              </w:rPr>
-              <w:t>Retrieval-Augmented Generation (RAG) using LangChain / pgvector over NCCT docs.</w:t>
+              <w:t>Proposed Retrieval-Augmented Generation (RAG) using LangChain / pgvector over NCCT docs.</w:t>
             </w:r>
           </w:p>
         </w:tc>
@@ -1839,7 +1820,7 @@
         <w:spacing w:before="60" w:after="100"/>
       </w:pPr>
       <w:r>
-        <w:t>SahakarSetu is built on a resilient, multi-tiered micro-cloud architecture designed for high throughput, offline durability, and zero single-point-of-failure operation:</w:t>
+        <w:t>SahakarSetu is built on a resilient, multi-tiered micro-cloud architecture designed for high throughput, offline durability, and resilient, offline-capable architecture that allows local training operations to continue during network/cloud outages:</w:t>
       </w:r>
     </w:p>
     <w:tbl>
@@ -3161,10 +3142,7 @@
               <w:spacing w:before="40" w:after="40"/>
             </w:pPr>
             <w:r>
-              <w:rPr>
-                <w:sz w:val="17"/>
-              </w:rPr>
-              <w:t>Read speeds &gt; 800 MB/s, High endurance</w:t>
+              <w:t>256 GB PCIe NVMe SSD via M.2 HAT high-speed local storage for offline LMS media and SQLite journal.</w:t>
             </w:r>
           </w:p>
         </w:tc>
@@ -4083,127 +4061,31 @@
               <w:spacing w:before="40" w:after="40"/>
             </w:pPr>
             <w:r>
-              <w:rPr>
-                <w:rFonts w:ascii="Consolas" w:hAnsi="Consolas"/>
-                <w:color w:val="0F172A"/>
-                <w:sz w:val="17"/>
-              </w:rPr>
               <w:t>+-----------------------------------------------------------------------------------+</w:t>
-            </w:r>
-            <w:r>
-              <w:rPr>
-                <w:rFonts w:ascii="Consolas" w:hAnsi="Consolas"/>
-                <w:color w:val="0F172A"/>
-                <w:sz w:val="17"/>
-              </w:rPr>
               <w:br/>
               <w:t>|                           ATTENDANCE VERIFICATION MODES                           |</w:t>
-            </w:r>
-            <w:r>
-              <w:rPr>
-                <w:rFonts w:ascii="Consolas" w:hAnsi="Consolas"/>
-                <w:color w:val="0F172A"/>
-                <w:sz w:val="17"/>
-              </w:rPr>
               <w:br/>
               <w:t>|                                                                                   |</w:t>
-            </w:r>
-            <w:r>
-              <w:rPr>
-                <w:rFonts w:ascii="Consolas" w:hAnsi="Consolas"/>
-                <w:color w:val="0F172A"/>
-                <w:sz w:val="17"/>
-              </w:rPr>
               <w:br/>
               <w:t>|  PRIMARY: Computer Vision Face Attendance                                         |</w:t>
-            </w:r>
-            <w:r>
-              <w:rPr>
-                <w:rFonts w:ascii="Consolas" w:hAnsi="Consolas"/>
-                <w:color w:val="0F172A"/>
-                <w:sz w:val="17"/>
-              </w:rPr>
               <w:br/>
               <w:t>|  [ Camera Capture ] ---&gt; [ MiniFASNet Liveness ] ---&gt; [ ArcFace 512-D Vector ]   |</w:t>
-            </w:r>
-            <w:r>
-              <w:rPr>
-                <w:rFonts w:ascii="Consolas" w:hAnsi="Consolas"/>
-                <w:color w:val="0F172A"/>
-                <w:sz w:val="17"/>
-              </w:rPr>
               <w:br/>
               <w:t>|                          Checks blink, texture,        Cosine distance match with |</w:t>
-            </w:r>
-            <w:r>
-              <w:rPr>
-                <w:rFonts w:ascii="Consolas" w:hAnsi="Consolas"/>
-                <w:color w:val="0F172A"/>
-                <w:sz w:val="17"/>
-              </w:rPr>
               <w:br/>
-              <w:t>|                          depth (prevents spoofing)     enrolled template (&lt; 0.40) |</w:t>
-            </w:r>
-            <w:r>
-              <w:rPr>
-                <w:rFonts w:ascii="Consolas" w:hAnsi="Consolas"/>
-                <w:color w:val="0F172A"/>
-                <w:sz w:val="17"/>
-              </w:rPr>
+              <w:t>|                          depth (prevents spoofing)     enrolled template using a calibrated similarity threshold determined during validation |</w:t>
               <w:br/>
               <w:t xml:space="preserve">|                                                                    |              </w:t>
-            </w:r>
-            <w:r>
-              <w:rPr>
-                <w:rFonts w:ascii="Consolas" w:hAnsi="Consolas"/>
-                <w:color w:val="0F172A"/>
-                <w:sz w:val="17"/>
-              </w:rPr>
               <w:br/>
               <w:t xml:space="preserve">|                                                                    v              </w:t>
-            </w:r>
-            <w:r>
-              <w:rPr>
-                <w:rFonts w:ascii="Consolas" w:hAnsi="Consolas"/>
-                <w:color w:val="0F172A"/>
-                <w:sz w:val="17"/>
-              </w:rPr>
               <w:br/>
               <w:t xml:space="preserve">|  SECONDARY: Dynamic Cryptographic QR Code (Fallback)       [ Mark Attendance ]    </w:t>
-            </w:r>
-            <w:r>
-              <w:rPr>
-                <w:rFonts w:ascii="Consolas" w:hAnsi="Consolas"/>
-                <w:color w:val="0F172A"/>
-                <w:sz w:val="17"/>
-              </w:rPr>
               <w:br/>
               <w:t xml:space="preserve">|  [ Trainer Displays QR ] ---&gt; [ Trainee PWA Scans ]  ---&gt;  Recorded in local Edge </w:t>
-            </w:r>
-            <w:r>
-              <w:rPr>
-                <w:rFonts w:ascii="Consolas" w:hAnsi="Consolas"/>
-                <w:color w:val="0F172A"/>
-                <w:sz w:val="17"/>
-              </w:rPr>
               <w:br/>
               <w:t xml:space="preserve">|  Rotating 30-sec TOTP         Validates GPS boundary       journal with timestamp </w:t>
-            </w:r>
-            <w:r>
-              <w:rPr>
-                <w:rFonts w:ascii="Consolas" w:hAnsi="Consolas"/>
-                <w:color w:val="0F172A"/>
-                <w:sz w:val="17"/>
-              </w:rPr>
               <w:br/>
               <w:t xml:space="preserve">|  HMAC-SHA256 signature        &amp; trainee Sahakar ID         and geo-tag            </w:t>
-            </w:r>
-            <w:r>
-              <w:rPr>
-                <w:rFonts w:ascii="Consolas" w:hAnsi="Consolas"/>
-                <w:color w:val="0F172A"/>
-                <w:sz w:val="17"/>
-              </w:rPr>
               <w:br/>
               <w:t>+-----------------------------------------------------------------------------------+</w:t>
             </w:r>
@@ -4684,13 +4566,7 @@
         <w:spacing w:before="30" w:after="30"/>
       </w:pPr>
       <w:r>
-        <w:rPr>
-          <w:b/>
-        </w:rPr>
-        <w:t>Multilingual Content Dubbing:</w:t>
-      </w:r>
-      <w:r>
-        <w:t xml:space="preserve"> Course transcripts and study materials are translated across 12 scheduled Indian languages, democratizing access to technical PACS accounting rules and statutory audit requirements.</w:t>
+        <w:t>Multilingual Content Dubbing: Course transcripts and study materials can be extended to additional Indian languages through BHASHINI services, democratizing access to technical PACS accounting rules and statutory audit requirements.</w:t>
       </w:r>
     </w:p>
     <w:p>
@@ -4765,163 +4641,39 @@
               <w:spacing w:before="40" w:after="40"/>
             </w:pPr>
             <w:r>
-              <w:rPr>
-                <w:rFonts w:ascii="Consolas" w:hAnsi="Consolas"/>
-                <w:color w:val="0F172A"/>
-                <w:sz w:val="17"/>
-              </w:rPr>
               <w:t>+-----------------------------------------------------------------------------------+</w:t>
-            </w:r>
-            <w:r>
-              <w:rPr>
-                <w:rFonts w:ascii="Consolas" w:hAnsi="Consolas"/>
-                <w:color w:val="0F172A"/>
-                <w:sz w:val="17"/>
-              </w:rPr>
               <w:br/>
               <w:t>|                          DIGITAL SKILL PASSPORT SCHEMA                            |</w:t>
-            </w:r>
-            <w:r>
-              <w:rPr>
-                <w:rFonts w:ascii="Consolas" w:hAnsi="Consolas"/>
-                <w:color w:val="0F172A"/>
-                <w:sz w:val="17"/>
-              </w:rPr>
               <w:br/>
               <w:t>|                                                                                   |</w:t>
-            </w:r>
-            <w:r>
-              <w:rPr>
-                <w:rFonts w:ascii="Consolas" w:hAnsi="Consolas"/>
-                <w:color w:val="0F172A"/>
-                <w:sz w:val="17"/>
-              </w:rPr>
               <w:br/>
               <w:t>|   +---------------------------------------------------------------------------+   |</w:t>
-            </w:r>
-            <w:r>
-              <w:rPr>
-                <w:rFonts w:ascii="Consolas" w:hAnsi="Consolas"/>
-                <w:color w:val="0F172A"/>
-                <w:sz w:val="17"/>
-              </w:rPr>
               <w:br/>
               <w:t>|   |  Header: National Council for Cooperative Training (Ministry of Coop)     |   |</w:t>
-            </w:r>
-            <w:r>
-              <w:rPr>
-                <w:rFonts w:ascii="Consolas" w:hAnsi="Consolas"/>
-                <w:color w:val="0F172A"/>
-                <w:sz w:val="17"/>
-              </w:rPr>
               <w:br/>
               <w:t>|   |  Trainee: Arjun Kumar Verma        | Sahakar ID: SAH-2026-VAM01-001847    |   |</w:t>
-            </w:r>
-            <w:r>
-              <w:rPr>
-                <w:rFonts w:ascii="Consolas" w:hAnsi="Consolas"/>
-                <w:color w:val="0F172A"/>
-                <w:sz w:val="17"/>
-              </w:rPr>
               <w:br/>
               <w:t>|   |  Programme: Management Development for PACS Operations (Grade A+)          |   |</w:t>
-            </w:r>
-            <w:r>
-              <w:rPr>
-                <w:rFonts w:ascii="Consolas" w:hAnsi="Consolas"/>
-                <w:color w:val="0F172A"/>
-                <w:sz w:val="17"/>
-              </w:rPr>
               <w:br/>
               <w:t>|   +---------------------------------------------------------------------------+   |</w:t>
-            </w:r>
-            <w:r>
-              <w:rPr>
-                <w:rFonts w:ascii="Consolas" w:hAnsi="Consolas"/>
-                <w:color w:val="0F172A"/>
-                <w:sz w:val="17"/>
-              </w:rPr>
               <w:br/>
               <w:t>|   |  VERIFIED ROLE-READINESS BENCHMARKS                                       |   |</w:t>
-            </w:r>
-            <w:r>
-              <w:rPr>
-                <w:rFonts w:ascii="Consolas" w:hAnsi="Consolas"/>
-                <w:color w:val="0F172A"/>
-                <w:sz w:val="17"/>
-              </w:rPr>
               <w:br/>
               <w:t>|   |  [x] PACS Day-End Balance Sheet &amp; Ledger Entry (Score: 94%)               |   |</w:t>
-            </w:r>
-            <w:r>
-              <w:rPr>
-                <w:rFonts w:ascii="Consolas" w:hAnsi="Consolas"/>
-                <w:color w:val="0F172A"/>
-                <w:sz w:val="17"/>
-              </w:rPr>
               <w:br/>
               <w:t>|   |  [x] Tally ERP &amp; Core Banking Software Operations (Score: 88%)            |   |</w:t>
-            </w:r>
-            <w:r>
-              <w:rPr>
-                <w:rFonts w:ascii="Consolas" w:hAnsi="Consolas"/>
-                <w:color w:val="0F172A"/>
-                <w:sz w:val="17"/>
-              </w:rPr>
               <w:br/>
               <w:t>|   |  [x] Statutory Cooperative Audit &amp; NPA Classification (Score: 82%)        |   |</w:t>
-            </w:r>
-            <w:r>
-              <w:rPr>
-                <w:rFonts w:ascii="Consolas" w:hAnsi="Consolas"/>
-                <w:color w:val="0F172A"/>
-                <w:sz w:val="17"/>
-              </w:rPr>
               <w:br/>
               <w:t>|   |  [x] Cold Storage &amp; Agri-Inventory Management (Score: 78%)                |   |</w:t>
-            </w:r>
-            <w:r>
-              <w:rPr>
-                <w:rFonts w:ascii="Consolas" w:hAnsi="Consolas"/>
-                <w:color w:val="0F172A"/>
-                <w:sz w:val="17"/>
-              </w:rPr>
               <w:br/>
               <w:t>|   +---------------------------------------------------------------------------+   |</w:t>
-            </w:r>
-            <w:r>
-              <w:rPr>
-                <w:rFonts w:ascii="Consolas" w:hAnsi="Consolas"/>
-                <w:color w:val="0F172A"/>
-                <w:sz w:val="17"/>
-              </w:rPr>
               <w:br/>
-              <w:t>|   |  Cryptographic Signature: HMAC-SHA256(Record + PrivateKey)                |   |</w:t>
-            </w:r>
-            <w:r>
-              <w:rPr>
-                <w:rFonts w:ascii="Consolas" w:hAnsi="Consolas"/>
-                <w:color w:val="0F172A"/>
-                <w:sz w:val="17"/>
-              </w:rPr>
+              <w:t>|   |  Cryptographic Signature: Ed25519(Signing Private Key, Certificate Payload)                |   |</w:t>
               <w:br/>
-              <w:t>|   |  Public Verification QR: https://sahakarsetu.gov.in/verify/CERT-1847      |   |</w:t>
-            </w:r>
-            <w:r>
-              <w:rPr>
-                <w:rFonts w:ascii="Consolas" w:hAnsi="Consolas"/>
-                <w:color w:val="0F172A"/>
-                <w:sz w:val="17"/>
-              </w:rPr>
+              <w:t>|   |  Public Verification QR: https://sahakar-setu-sage.vercel.app/verify/CERT-1847      |   |</w:t>
               <w:br/>
               <w:t>|   +---------------------------------------------------------------------------+   |</w:t>
-            </w:r>
-            <w:r>
-              <w:rPr>
-                <w:rFonts w:ascii="Consolas" w:hAnsi="Consolas"/>
-                <w:color w:val="0F172A"/>
-                <w:sz w:val="17"/>
-              </w:rPr>
               <w:br/>
               <w:t>+-----------------------------------------------------------------------------------+</w:t>
             </w:r>
@@ -4952,16 +4704,7 @@
         <w:spacing w:before="60" w:after="100"/>
       </w:pPr>
       <w:r>
-        <w:t xml:space="preserve">1. </w:t>
-      </w:r>
-      <w:r>
-        <w:rPr>
-          <w:b/>
-        </w:rPr>
-        <w:t>Signature Generation:</w:t>
-      </w:r>
-      <w:r>
-        <w:t xml:space="preserve"> The certificate payload (Trainee ID, Institute ID, Programme ID, Issued Date, Grade, Competency Hashes) is signed using an HMAC-SHA256 signature with the central NCCT private key.</w:t>
+        <w:t>1. Signature Generation: Certificate payloads are digitally signed using the issuer's Ed25519 private key. Verifiers validate the signature using the corresponding public key.</w:t>
       </w:r>
     </w:p>
     <w:p>
@@ -5459,16 +5202,7 @@
         <w:spacing w:before="60" w:after="100"/>
       </w:pPr>
       <w:r>
-        <w:t xml:space="preserve">3. </w:t>
-      </w:r>
-      <w:r>
-        <w:rPr>
-          <w:b/>
-        </w:rPr>
-        <w:t>Grounded Generation with Guardrails:</w:t>
-      </w:r>
-      <w:r>
-        <w:t xml:space="preserve"> When a user queries: *"PACS secretary eligibility criteria kya hai?"*, the RAG pipeline retrieves the top-5 relevant sections and synthesizes an authoritative, hallucination-free response with explicit citations to official Ministry documents.</w:t>
+        <w:t>3. Grounded Generation with Guardrails: When a user queries: *"PACS secretary eligibility criteria kya hai?"*, the RAG pipeline retrieves the top-5 relevant sections and synthesizes an authoritative, grounded responses with citations to retrieved official documents and application-level guardrails. with explicit citations to official Ministry documents.</w:t>
       </w:r>
     </w:p>
     <w:p>
@@ -5965,10 +5699,7 @@
         <w:spacing w:before="360" w:after="120"/>
       </w:pPr>
       <w:r>
-        <w:rPr>
-          <w:color w:val="1E3A5F"/>
-        </w:rPr>
-        <w:t>15. Security, Privacy &amp; DPDP Act 2023 Compliance</w:t>
+        <w:t>15. Security, Privacy &amp; DPDP-Aligned Architecture</w:t>
       </w:r>
     </w:p>
     <w:p>
@@ -6010,16 +5741,7 @@
         <w:spacing w:before="60" w:after="100"/>
       </w:pPr>
       <w:r>
-        <w:t xml:space="preserve">2. </w:t>
-      </w:r>
-      <w:r>
-        <w:rPr>
-          <w:b/>
-        </w:rPr>
-        <w:t>Ephemeral Biometric Processing:</w:t>
-      </w:r>
-      <w:r>
-        <w:t xml:space="preserve"> Facial imagery is processed in volatile memory on the edge device; raw frames are immediately expunged once 512-D vectors are generated. Biometric templates cannot be reverse-engineered into facial likenesses.</w:t>
+        <w:t>2. Ephemeral Biometric Processing: Facial imagery is processed in volatile memory on the edge device; raw frames are immediately expunged once 512-D vectors are generated. Raw facial images are not retained after feature extraction; biometric templates are encrypted and access-controlled.</w:t>
       </w:r>
     </w:p>
     <w:p>
@@ -8620,25 +8342,9 @@
             </w:tcMar>
           </w:tcPr>
           <w:p>
-            <w:pPr>
-              <w:spacing w:before="40" w:after="40"/>
-              <w:rPr>
-                <w:b/>
-                <w:sz w:val="17"/>
-              </w:rPr>
-            </w:pPr>
-            <w:r>
-              <w:rPr>
-                <w:b/>
-                <w:sz w:val="17"/>
-              </w:rPr>
+            <w:r>
               <w:t>Simulated Validation</w:t>
             </w:r>
-          </w:p>
-          <w:p>
-            <w:pPr>
-              <w:spacing w:before="40" w:after="40"/>
-            </w:pPr>
           </w:p>
         </w:tc>
       </w:tr>

</xml_diff>

<commit_message>
Fix 7 final report inconsistencies before SIH submission
</commit_message>
<xml_diff>
--- a/report/SahakarSetu_Technical_Architecture_Report.docx
+++ b/report/SahakarSetu_Technical_Architecture_Report.docx
@@ -78,8 +78,21 @@
         <w:t>Project Deployment &amp; Prototype Links</w:t>
       </w:r>
     </w:p>
-    <w:p/>
-    <w:p/>
+    <w:p>
+      <w:r>
+        <w:t>Prototype Working Video: https://youtu.be/SGfuTJ5SxBE</w:t>
+      </w:r>
+    </w:p>
+    <w:p>
+      <w:r>
+        <w:t>Live Deployed Prototype: https://sahakar-setu-sage.vercel.app/</w:t>
+      </w:r>
+    </w:p>
+    <w:p>
+      <w:r>
+        <w:t>Backend API Endpoint: https://sahakarsetu-mcdr.onrender.com/health/</w:t>
+      </w:r>
+    </w:p>
     <w:p>
       <w:pPr>
         <w:pStyle w:val="Heading1"/>
@@ -97,7 +110,7 @@
         <w:spacing w:before="60" w:after="100"/>
       </w:pPr>
       <w:r>
-        <w:t>SahakarSetu is an scalable digital ecosystem designed to modernize and unify the cooperative education, administration, and employment ecosystem across India. SahakarSetu is a proposed digital ecosystem designed to support the cooperative training ecosystem under NCCT and the Ministry of Cooperation. the platform integrates institutional enterprise resource planning (ERP), learning management systems (LMS), computer-vision attendance, offline-first edge computing, verifiable cryptographic skill credentialing, and AI-driven employment linkage into a continuous, data-driven lifecycle.</w:t>
+        <w:t>SahakarSetu is a scalable digital ecosystem designed to modernize and unify the cooperative education, administration, and employment ecosystem across India. It is a proposed solution designed to support the cooperative training ecosystem under NCCT and the Ministry of Cooperation. The platform integrates institutional enterprise resource planning (ERP), learning management systems (LMS), computer-vision attendance, offline-first edge computing, verifiable cryptographic skill credentialing, and AI-driven employment linkage into a continuous, data-driven lifecycle.</w:t>
       </w:r>
     </w:p>
     <w:p>
@@ -285,7 +298,7 @@
         <w:t>Sahakar Edge Box</w:t>
       </w:r>
       <w:r>
-        <w:t>—a low-cost, ruggedized, low-power edge computer deployed at each training institute, PACS center, and rural cooperative hub. The Edge Box runs an embedded micro-cloud with localized LMS media caching, biometric face/QR attendance validation, automated quiz grading, and a store-and-forward SQLite journal. Trainees in remote, low-bandwidth areas connect locally via Wi-Fi without active internet. When connectivity is restored, the Edge Box cryptographically synchronizes with the central Sahakar Cloud, enabling zero-downtime operations and national-level training monitoring.</w:t>
+        <w:t>—a low-cost, ruggedized, low-power edge computer deployed at each training institute, PACS center, and rural cooperative hub. The Edge Box runs an embedded micro-cloud with localized LMS media caching, biometric face/QR attendance validation, automated quiz grading, and a store-and-forward SQLite journal. Trainees in remote, low-bandwidth areas connect locally via Wi-Fi without active internet. When connectivity is restored, the Edge Box cryptographically synchronizes with the central Sahakar Cloud, enabling continuity of local training operations and national-level training monitoring.</w:t>
       </w:r>
     </w:p>
     <w:p>
@@ -3122,7 +3135,7 @@
               <w:rPr>
                 <w:sz w:val="17"/>
               </w:rPr>
-              <w:t>PCIe NVMe M.2 SSD (256 GB) via M.2 HAT</w:t>
+              <w:t>256 GB PCIe NVMe SSD via M.2 HAT</w:t>
             </w:r>
           </w:p>
         </w:tc>
@@ -3824,7 +3837,7 @@
         <w:spacing w:before="60" w:after="100"/>
       </w:pPr>
       <w:r>
-        <w:t>\text{Event ID} = \text{UUIDv4} \parallel \text{Timestamp} \parallel \text{DeviceID}</w:t>
+        <w:t>Event ID = UUIDv4 + Timestamp + Device ID</w:t>
       </w:r>
     </w:p>
     <w:p>
@@ -3925,7 +3938,7 @@
         <w:spacing w:before="60" w:after="100"/>
       </w:pPr>
       <w:r>
-        <w:t>\text{Sahakar ID Format: } \mathbf{SAH - [YYYY] - [INST\_CODE] - [SERIAL\_NUMBER]}</w:t>
+        <w:t>Sahakar ID Format: SAH-[YYYY]-[INST_CODE]-[SERIAL_NUMBER] - [YYYY] - [INST\_CODE] - [SERIAL\_NUMBER]}</w:t>
       </w:r>
     </w:p>
     <w:p>
@@ -4156,7 +4169,7 @@
         <w:t>ArcFace (Additive Angular Margin Loss)</w:t>
       </w:r>
       <w:r>
-        <w:t xml:space="preserve"> neural network, converting the face image into a compact 512-dimensional floating-point embedding:</w:t>
+        <w:t xml:space="preserve"> neural network, ArcFace converts a validated face image into a compact 512-dimensional embedding for identity matching.</w:t>
       </w:r>
     </w:p>
     <w:p>
@@ -4164,7 +4177,7 @@
         <w:spacing w:before="60" w:after="100"/>
       </w:pPr>
       <w:r>
-        <w:t>L_{\text{ArcFace}} = -\log \frac{e^{s(\cos(\theta_{y_i} + m))}}{e^{s(\cos(\theta_{y_i} + m))} + \sum_{j \neq y_i} e^{s \cos \theta_j}}</w:t>
+        <w:t>ArcFace converts a validated face image into a compact 512-dimensional embedding for identity matching.</w:t>
       </w:r>
     </w:p>
     <w:p>
@@ -4176,7 +4189,7 @@
         <w:rPr>
           <w:b/>
         </w:rPr>
-        <w:t>Privacy Preservation (DPDP Compliance):</w:t>
+        <w:t>Privacy Preservation (DPDP-Aligned):</w:t>
       </w:r>
       <w:r>
         <w:t xml:space="preserve"> Raw photographs are discarded immediately from memory after embedding generation. Only the non-reversible 512-dimensional numerical vector is stored, encrypted using AES-256.</w:t>
@@ -5002,17 +5015,7 @@
         <w:spacing w:before="60" w:after="100"/>
       </w:pPr>
       <w:r>
-        <w:t xml:space="preserve">- </w:t>
-      </w:r>
-      <w:r>
-        <w:rPr>
-          <w:rFonts w:ascii="Cambria Math" w:hAnsi="Cambria Math"/>
-          <w:i/>
-        </w:rPr>
-        <w:t>\Delta_{\text{skills}}</w:t>
-      </w:r>
-      <w:r>
-        <w:t>: Jaccard similarity between certified competencies and required job skills.</w:t>
+        <w:t>- Skill similarity: Jaccard similarity between certified competencies and required job skills.</w:t>
       </w:r>
     </w:p>
     <w:p>
@@ -5020,17 +5023,7 @@
         <w:spacing w:before="60" w:after="100"/>
       </w:pPr>
       <w:r>
-        <w:t xml:space="preserve">- </w:t>
-      </w:r>
-      <w:r>
-        <w:rPr>
-          <w:rFonts w:ascii="Cambria Math" w:hAnsi="Cambria Math"/>
-          <w:i/>
-        </w:rPr>
-        <w:t>S_{\text{assessment}}</w:t>
-      </w:r>
-      <w:r>
-        <w:t>: Weighted score achieved in relevant curriculum assessment modules.</w:t>
+        <w:t>- Assessment score: Weighted score achieved in relevant curriculum assessment modules.</w:t>
       </w:r>
     </w:p>
     <w:p>
@@ -5038,17 +5031,7 @@
         <w:spacing w:before="60" w:after="100"/>
       </w:pPr>
       <w:r>
-        <w:t xml:space="preserve">- </w:t>
-      </w:r>
-      <w:r>
-        <w:rPr>
-          <w:rFonts w:ascii="Cambria Math" w:hAnsi="Cambria Math"/>
-          <w:i/>
-        </w:rPr>
-        <w:t>A_{\text{attendance}}</w:t>
-      </w:r>
-      <w:r>
-        <w:t>: Historical attendance consistency percentage.</w:t>
+        <w:t>- Attendance consistency: Historical attendance consistency percentage.</w:t>
       </w:r>
     </w:p>
     <w:p>
@@ -5056,17 +5039,7 @@
         <w:spacing w:before="60" w:after="100"/>
       </w:pPr>
       <w:r>
-        <w:t xml:space="preserve">- </w:t>
-      </w:r>
-      <w:r>
-        <w:rPr>
-          <w:rFonts w:ascii="Cambria Math" w:hAnsi="Cambria Math"/>
-          <w:i/>
-        </w:rPr>
-        <w:t>D_{\text{geo}}</w:t>
-      </w:r>
-      <w:r>
-        <w:t>: Haversine geographical distance between candidate district and cooperative posting location.</w:t>
+        <w:t>- Geographic proximity: Haversine distance between candidate district and cooperative posting location.</w:t>
       </w:r>
     </w:p>
     <w:p>
@@ -5074,17 +5047,7 @@
         <w:spacing w:before="60" w:after="100"/>
       </w:pPr>
       <w:r>
-        <w:t xml:space="preserve">- </w:t>
-      </w:r>
-      <w:r>
-        <w:rPr>
-          <w:rFonts w:ascii="Cambria Math" w:hAnsi="Cambria Math"/>
-          <w:i/>
-        </w:rPr>
-        <w:t>L_{\text{language}}</w:t>
-      </w:r>
-      <w:r>
-        <w:t>: Linguistic match between candidate spoken languages and society operational dialect.</w:t>
+        <w:t>- Language compatibility: Linguistic match between candidate spoken languages and society operational dialect.</w:t>
       </w:r>
     </w:p>
     <w:p>
@@ -5108,7 +5071,7 @@
         <w:t>XGBoost</w:t>
       </w:r>
       <w:r>
-        <w:t xml:space="preserve"> with the `rank:ndcg` (Normalized Discounted Cumulative Gain) objective function over 22,000+ benchmarked candidate-job pairs:</w:t>
+        <w:t xml:space="preserve"> with the `rank:ndcg` (Normalized Discounted Cumulative Gain) objective function from the Role Radar dataset with 22,465 labelled candidate-job pairs (including synthetic profiles and automated labels):</w:t>
       </w:r>
     </w:p>
     <w:p>
@@ -5202,7 +5165,7 @@
         <w:spacing w:before="60" w:after="100"/>
       </w:pPr>
       <w:r>
-        <w:t>3. Grounded Generation with Guardrails: When a user queries: *"PACS secretary eligibility criteria kya hai?"*, the RAG pipeline retrieves the top-5 relevant sections and synthesizes an authoritative, grounded responses with citations to retrieved official documents and application-level guardrails. with explicit citations to official Ministry documents.</w:t>
+        <w:t>3. Grounded Generation with Guardrails: When a user queries: *"PACS secretary eligibility criteria kya hai?"*, the RAG pipeline retrieves the top-5 relevant sections and synthesizes grounded responses with citations to retrieved official documents and application-level guardrails.</w:t>
       </w:r>
     </w:p>
     <w:p>
@@ -8421,7 +8384,7 @@
         <w:t>Economic Feasibility:</w:t>
       </w:r>
       <w:r>
-        <w:t xml:space="preserve"> The estimated hardware cost of ~₹19,450 per Edge Box allows deployment across all 20 NCCT institutions for less than ₹4.5 Lakhs capital expenditure, delivering immediate annual savings in administrative stationery, paper registers, and travel logistics.</w:t>
+        <w:t xml:space="preserve"> Indicative deployment cost is approximately ₹25,000 per Sahakar Edge Box and ₹15,000 per face/attendance terminal. Final deployment cost will vary based on device configuration, procurement scale and site requirements.</w:t>
       </w:r>
     </w:p>
     <w:p>

</xml_diff>

<commit_message>
Make prototype links clickable hyperlinks in report
</commit_message>
<xml_diff>
--- a/report/SahakarSetu_Technical_Architecture_Report.docx
+++ b/report/SahakarSetu_Technical_Architecture_Report.docx
@@ -80,46 +80,42 @@
     </w:p>
     <w:p>
       <w:r>
-        <w:t>Prototype Working Video: https://youtu.be/SGfuTJ5SxBE</w:t>
-      </w:r>
+        <w:t xml:space="preserve">Prototype Working Video: </w:t>
+      </w:r>
+      <w:hyperlink r:id="rId8" w:history="1">
+        <w:r>
+          <w:rPr>
+            <w:rStyle w:val="Hyperlink"/>
+          </w:rPr>
+          <w:t>https://youtu.be/SGfuTJ5SxBE</w:t>
+        </w:r>
+      </w:hyperlink>
     </w:p>
     <w:p>
       <w:r>
-        <w:t>Live Deployed Prototype: https://sahakar-setu-sage.vercel.app/</w:t>
-      </w:r>
+        <w:t xml:space="preserve">Live Deployed Prototype: </w:t>
+      </w:r>
+      <w:hyperlink r:id="rId9" w:history="1">
+        <w:r>
+          <w:rPr>
+            <w:rStyle w:val="Hyperlink"/>
+          </w:rPr>
+          <w:t>https://sahakar-setu-sage.vercel.app/</w:t>
+        </w:r>
+      </w:hyperlink>
     </w:p>
     <w:p>
       <w:r>
-        <w:t>Backend API Endpoint: https://sahakarsetu-mcdr.onrender.com/health/</w:t>
-      </w:r>
-    </w:p>
-    <w:p>
-      <w:pPr>
-        <w:pStyle w:val="Heading1"/>
-        <w:spacing w:before="360" w:after="120"/>
-      </w:pPr>
-      <w:r>
-        <w:rPr>
-          <w:color w:val="1E3A5F"/>
-        </w:rPr>
-        <w:t>1. Executive Summary &amp; System Vision</w:t>
-      </w:r>
-    </w:p>
-    <w:p>
-      <w:pPr>
-        <w:spacing w:before="60" w:after="100"/>
-      </w:pPr>
-      <w:r>
-        <w:t>SahakarSetu is a scalable digital ecosystem designed to modernize and unify the cooperative education, administration, and employment ecosystem across India. It is a proposed solution designed to support the cooperative training ecosystem under NCCT and the Ministry of Cooperation. The platform integrates institutional enterprise resource planning (ERP), learning management systems (LMS), computer-vision attendance, offline-first edge computing, verifiable cryptographic skill credentialing, and AI-driven employment linkage into a continuous, data-driven lifecycle.</w:t>
-      </w:r>
-    </w:p>
-    <w:p>
-      <w:pPr>
-        <w:spacing w:before="60" w:after="100"/>
-      </w:pPr>
-      <w:r>
-        <w:t>NCCT operates through its apex institution—Vaikunth Mehta National Institute of Cooperative Management (VAMNICOM), Pune—alongside 5 Regional Institutes of Cooperative Management (RICMs) and 14 Institutes of Cooperative Management (ICMs). In total, these 20 institutions conduct more than 3,700 programmes annually, training over 2.27 lakh participants comprising Primary Agricultural Credit Societies (PACS) secretaries, dairy cooperative staff, women Self-Help Groups (SHGs), cooperative bank officers, and rural youth.</w:t>
-      </w:r>
+        <w:t xml:space="preserve">Backend API Endpoint: </w:t>
+      </w:r>
+      <w:hyperlink r:id="rId10" w:history="1">
+        <w:r>
+          <w:rPr>
+            <w:rStyle w:val="Hyperlink"/>
+          </w:rPr>
+          <w:t>https://sahakarsetu-mcdr.onrender.com/health/</w:t>
+        </w:r>
+      </w:hyperlink>
     </w:p>
     <w:p>
       <w:pPr>
@@ -164,7 +160,6 @@
                 <w:color w:val="0F172A"/>
                 <w:sz w:val="17"/>
               </w:rPr>
-              <w:lastRenderedPageBreak/>
               <w:t xml:space="preserve">       +-----------------------------------------------------------------------+</w:t>
             </w:r>
             <w:r>
@@ -201,6 +196,14 @@
                 <w:sz w:val="17"/>
               </w:rPr>
               <w:br/>
+            </w:r>
+            <w:r>
+              <w:rPr>
+                <w:rFonts w:ascii="Consolas" w:hAnsi="Consolas"/>
+                <w:color w:val="0F172A"/>
+                <w:sz w:val="17"/>
+              </w:rPr>
+              <w:lastRenderedPageBreak/>
               <w:t xml:space="preserve">       |    Nomination        Seat, Hostel,     Face / QR       Multilingual   |</w:t>
             </w:r>
             <w:r>
@@ -1163,6 +1166,7 @@
                 <w:b/>
                 <w:sz w:val="17"/>
               </w:rPr>
+              <w:lastRenderedPageBreak/>
               <w:t>6</w:t>
             </w:r>
           </w:p>
@@ -1210,14 +1214,7 @@
               <w:rPr>
                 <w:sz w:val="17"/>
               </w:rPr>
-              <w:t xml:space="preserve">Automated module quizzes, proctored summative exams, rubric-based grading, and </w:t>
-            </w:r>
-            <w:r>
-              <w:rPr>
-                <w:sz w:val="17"/>
-              </w:rPr>
-              <w:lastRenderedPageBreak/>
-              <w:t>instant certificate issuing.</w:t>
+              <w:t>Automated module quizzes, proctored summative exams, rubric-based grading, and instant certificate issuing.</w:t>
             </w:r>
           </w:p>
         </w:tc>
@@ -1240,7 +1237,6 @@
               <w:rPr>
                 <w:sz w:val="17"/>
               </w:rPr>
-              <w:lastRenderedPageBreak/>
               <w:t>LMS evaluation pipeline enforcing customizable cutoff score benchmarks.</w:t>
             </w:r>
           </w:p>
@@ -1270,7 +1266,6 @@
                 <w:b/>
                 <w:sz w:val="17"/>
               </w:rPr>
-              <w:lastRenderedPageBreak/>
               <w:t>7</w:t>
             </w:r>
           </w:p>
@@ -4075,30 +4070,56 @@
             </w:pPr>
             <w:r>
               <w:t>+-----------------------------------------------------------------------------------+</w:t>
+            </w:r>
+            <w:r>
               <w:br/>
               <w:t>|                           ATTENDANCE VERIFICATION MODES                           |</w:t>
+            </w:r>
+            <w:r>
               <w:br/>
               <w:t>|                                                                                   |</w:t>
+            </w:r>
+            <w:r>
               <w:br/>
               <w:t>|  PRIMARY: Computer Vision Face Attendance                                         |</w:t>
+            </w:r>
+            <w:r>
               <w:br/>
               <w:t>|  [ Camera Capture ] ---&gt; [ MiniFASNet Liveness ] ---&gt; [ ArcFace 512-D Vector ]   |</w:t>
+            </w:r>
+            <w:r>
               <w:br/>
               <w:t>|                          Checks blink, texture,        Cosine distance match with |</w:t>
+            </w:r>
+            <w:r>
               <w:br/>
               <w:t>|                          depth (prevents spoofing)     enrolled template using a calibrated similarity threshold determined during validation |</w:t>
+            </w:r>
+            <w:r>
               <w:br/>
               <w:t xml:space="preserve">|                                                                    |              </w:t>
+            </w:r>
+            <w:r>
               <w:br/>
               <w:t xml:space="preserve">|                                                                    v              </w:t>
+            </w:r>
+            <w:r>
               <w:br/>
               <w:t xml:space="preserve">|  SECONDARY: Dynamic Cryptographic QR Code (Fallback)       [ Mark Attendance ]    </w:t>
+            </w:r>
+            <w:r>
               <w:br/>
               <w:t xml:space="preserve">|  [ Trainer Displays QR ] ---&gt; [ Trainee PWA Scans ]  ---&gt;  Recorded in local Edge </w:t>
+            </w:r>
+            <w:r>
               <w:br/>
               <w:t xml:space="preserve">|  Rotating 30-sec TOTP         Validates GPS boundary       journal with timestamp </w:t>
+            </w:r>
+            <w:r>
               <w:br/>
               <w:t xml:space="preserve">|  HMAC-SHA256 signature        &amp; trainee Sahakar ID         and geo-tag            </w:t>
+            </w:r>
+            <w:r>
               <w:br/>
               <w:t>+-----------------------------------------------------------------------------------+</w:t>
             </w:r>
@@ -4655,38 +4676,72 @@
             </w:pPr>
             <w:r>
               <w:t>+-----------------------------------------------------------------------------------+</w:t>
+            </w:r>
+            <w:r>
               <w:br/>
               <w:t>|                          DIGITAL SKILL PASSPORT SCHEMA                            |</w:t>
+            </w:r>
+            <w:r>
               <w:br/>
               <w:t>|                                                                                   |</w:t>
+            </w:r>
+            <w:r>
               <w:br/>
               <w:t>|   +---------------------------------------------------------------------------+   |</w:t>
+            </w:r>
+            <w:r>
               <w:br/>
               <w:t>|   |  Header: National Council for Cooperative Training (Ministry of Coop)     |   |</w:t>
+            </w:r>
+            <w:r>
               <w:br/>
               <w:t>|   |  Trainee: Arjun Kumar Verma        | Sahakar ID: SAH-2026-VAM01-001847    |   |</w:t>
+            </w:r>
+            <w:r>
               <w:br/>
               <w:t>|   |  Programme: Management Development for PACS Operations (Grade A+)          |   |</w:t>
+            </w:r>
+            <w:r>
               <w:br/>
               <w:t>|   +---------------------------------------------------------------------------+   |</w:t>
+            </w:r>
+            <w:r>
               <w:br/>
               <w:t>|   |  VERIFIED ROLE-READINESS BENCHMARKS                                       |   |</w:t>
+            </w:r>
+            <w:r>
               <w:br/>
               <w:t>|   |  [x] PACS Day-End Balance Sheet &amp; Ledger Entry (Score: 94%)               |   |</w:t>
+            </w:r>
+            <w:r>
               <w:br/>
               <w:t>|   |  [x] Tally ERP &amp; Core Banking Software Operations (Score: 88%)            |   |</w:t>
+            </w:r>
+            <w:r>
               <w:br/>
               <w:t>|   |  [x] Statutory Cooperative Audit &amp; NPA Classification (Score: 82%)        |   |</w:t>
+            </w:r>
+            <w:r>
               <w:br/>
               <w:t>|   |  [x] Cold Storage &amp; Agri-Inventory Management (Score: 78%)                |   |</w:t>
+            </w:r>
+            <w:r>
               <w:br/>
               <w:t>|   +---------------------------------------------------------------------------+   |</w:t>
+            </w:r>
+            <w:r>
               <w:br/>
               <w:t>|   |  Cryptographic Signature: Ed25519(Signing Private Key, Certificate Payload)                |   |</w:t>
+            </w:r>
+            <w:r>
               <w:br/>
               <w:t>|   |  Public Verification QR: https://sahakar-setu-sage.vercel.app/verify/CERT-1847      |   |</w:t>
+            </w:r>
+            <w:r>
               <w:br/>
               <w:t>|   +---------------------------------------------------------------------------+   |</w:t>
+            </w:r>
+            <w:r>
               <w:br/>
               <w:t>+-----------------------------------------------------------------------------------+</w:t>
             </w:r>
@@ -22046,7 +22101,7 @@
 </file>
 
 <file path=customXml/itemProps1.xml><?xml version="1.0" encoding="utf-8"?>
-<ds:datastoreItem xmlns:ds="http://schemas.openxmlformats.org/officeDocument/2006/customXml" ds:itemID="{13FDEE83-8332-4FDC-9E30-D1D763E770F5}">
+<ds:datastoreItem xmlns:ds="http://schemas.openxmlformats.org/officeDocument/2006/customXml" ds:itemID="{3816B415-D1FF-4960-822A-EE3DDBA214F6}">
   <ds:schemaRefs>
     <ds:schemaRef ds:uri="http://schemas.openxmlformats.org/officeDocument/2006/bibliography"/>
   </ds:schemaRefs>

</xml_diff>

<commit_message>
Fix Section 1 heading order and Marathi voice navigation formatting in report
</commit_message>
<xml_diff>
--- a/report/SahakarSetu_Technical_Architecture_Report.docx
+++ b/report/SahakarSetu_Technical_Architecture_Report.docx
@@ -116,6 +116,26 @@
           <w:t>https://sahakarsetu-mcdr.onrender.com/health/</w:t>
         </w:r>
       </w:hyperlink>
+    </w:p>
+    <w:p>
+      <w:pPr>
+        <w:pStyle w:val="Heading1"/>
+      </w:pPr>
+      <w:r>
+        <w:t>1. Executive Summary &amp; System Vision</w:t>
+      </w:r>
+    </w:p>
+    <w:p>
+      <w:pPr/>
+      <w:r>
+        <w:t>SahakarSetu is a scalable digital ecosystem designed to modernize and unify the cooperative education, administration, and employment ecosystem across India. It is a proposed solution designed to support the cooperative training ecosystem under NCCT and the Ministry of Cooperation. The platform integrates institutional enterprise resource planning (ERP), learning management systems (LMS), computer-vision attendance, offline-first edge computing, verifiable cryptographic skill credentialing, and AI-driven employment linkage into a continuous, data-driven lifecycle.</w:t>
+      </w:r>
+    </w:p>
+    <w:p>
+      <w:pPr/>
+      <w:r>
+        <w:t>NCCT operates through its apex institution—Vaikunth Mehta National Institute of Cooperative Management (VAMNICOM), Pune—alongside 5 Regional Institutes of Cooperative Management (RICMs) and 14 Institutes of Cooperative Management (ICMs). In total, these 20 institutions conduct more than 3,700 programmes annually, training over 2.27 lakh participants comprising Primary Agricultural Credit Societies (PACS) secretaries, dairy cooperative staff, women Self-Help Groups (SHGs), cooperative bank officers, and rural youth.</w:t>
+      </w:r>
     </w:p>
     <w:p>
       <w:pPr>
@@ -4585,13 +4605,7 @@
         <w:spacing w:before="30" w:after="30"/>
       </w:pPr>
       <w:r>
-        <w:rPr>
-          <w:b/>
-        </w:rPr>
-        <w:t>Voice-First Navigation:</w:t>
-      </w:r>
-      <w:r>
-        <w:t xml:space="preserve"> Semi-literate trainees can touch the microphone button and ask questions such as: *"माझं हजेरी आणि प्रमाणपत्र कधी मिळेल?"* (When will my attendance and certificate be generated?); the system processes the request in Marathi and provides both visual and voice responses.</w:t>
+        <w:t>Voice-First Navigation: Semi-literate trainees can touch the microphone button and ask questions such as: *"Majhi hajeri aani pramanpatra kadhi milel?"* (When will my attendance and certificate be generated?); the system processes the request in Marathi and provides both visual and voice responses.</w:t>
       </w:r>
     </w:p>
     <w:p>

</xml_diff>